<commit_message>
fix: 'Despesas Aplicáveis a Este Escopo' em title case (sem smallCaps)
O paragrafo "DESPESAS APLICAVEIS A ESTE ESCOPO" no template Markers
estava com texto em caixa alta + atributo <w:smallCaps/>, fazendo Word
renderizar em ALL CAPS. Usuario pediu title case "Despesas Aplicaveis
a Este Escopo".

Mudancas no PMRA_Template_Markers.docx (somente nesse paragrafo):
- texto: "DESPESAS APLICAVEIS A ESTE ESCOPO" -> "Despesas Aplicaveis a Este Escopo"
- removido <w:smallCaps/> de pPr e rPr (mantido bold)

Outros headers em caixa alta no template (TERMOS E CONDICOES, OBJETO,
HONORARIOS E FORMA DE PAGAMENTO, etc.) foram preservados — sao titulos
intencionais que voce nao pediu pra mudar.

PMRA_Template_Jinja.docx regerado via build_from_markers.py.
</commit_message>
<xml_diff>
--- a/resources/templates/PMRA_Template_Jinja.docx
+++ b/resources/templates/PMRA_Template_Jinja.docx
@@ -4621,7 +4621,6 @@
         <w:rPr>
           <w:b/>
           <w:bCs/>
-          <w:smallCaps/>
           <w:sz w:val="20"/>
           <w:szCs w:val="20"/>
         </w:rPr>
@@ -4630,11 +4629,10 @@
         <w:rPr>
           <w:b/>
           <w:bCs/>
-          <w:smallCaps/>
-          <w:sz w:val="20"/>
-          <w:szCs w:val="20"/>
-        </w:rPr>
-        <w:t>DESPESAS APLICÁVEIS A ESTE ESCOPO</w:t>
+          <w:sz w:val="20"/>
+          <w:szCs w:val="20"/>
+        </w:rPr>
+        <w:t>Despesas Aplicáveis a Este Escopo</w:t>
       </w:r>
     </w:p>
     <w:p>

</xml_diff>

<commit_message>
template: atualiza Markers.docx com ajustes em texto livre
Mudancas do cliente em PMRA_Template_Markers.docx, fora dos campos
variaveis:
- 0 markers desconhecidos / typos
- 0 tags Jinja fragmentadas
- 0 mudancas no conjunto de markers (mesmo conjunto, mesmo numero de
  ocorrencias por tag)
- Pareamento abre/fecha de [SE_*]/[FIM_SE], [PARA_CADA_*]/[FIM_PARA_CADA]
  validado: OK
- document.xml: -600 bytes (text-only edits, sem mudanca estrutural)

PMRA_Template_Jinja.docx regerado via scripts/build_from_markers.py
(89 markers -> tags Jinja).

Smoke test + demo regenerados, OK.
</commit_message>
<xml_diff>
--- a/resources/templates/PMRA_Template_Jinja.docx
+++ b/resources/templates/PMRA_Template_Jinja.docx
@@ -132,14 +132,7 @@
           <w:sz w:val="20"/>
           <w:szCs w:val="20"/>
         </w:rPr>
-        <w:t xml:space="preserve">A/C: </w:t>
-      </w:r>
-      <w:r>
-        <w:rPr>
-          <w:sz w:val="20"/>
-          <w:szCs w:val="20"/>
-        </w:rPr>
-        <w:t>{{contratante.contato_nome}}</w:t>
+        <w:t>A/C: {{contratante.contato_nome}}</w:t>
       </w:r>
     </w:p>
     <w:p>
@@ -453,33 +446,124 @@
           <w:sz w:val="20"/>
           <w:szCs w:val="20"/>
         </w:rPr>
-        <w:t>Prazos de Entrega</w:t>
-      </w:r>
-      <w:r>
+        <w:t xml:space="preserve">Prazos de Entrega/SLA: </w:t>
+      </w:r>
+    </w:p>
+    <w:p>
+      <w:pPr>
+        <w:keepNext/>
+        <w:snapToGrid w:val="0"/>
+        <w:rPr>
+          <w:sz w:val="20"/>
+          <w:szCs w:val="20"/>
+        </w:rPr>
+      </w:pPr>
+      <w:r>
+        <w:rPr>
+          <w:sz w:val="20"/>
+          <w:szCs w:val="20"/>
+        </w:rPr>
+        <w:t>{{escopo.sla_descricao}}</w:t>
+      </w:r>
+    </w:p>
+    <w:p>
+      <w:pPr>
+        <w:rPr>
+          <w:sz w:val="2"/>
+          <w:szCs w:val="2"/>
+        </w:rPr>
+      </w:pPr>
+      <w:r>
+        <w:rPr>
+          <w:sz w:val="2"/>
+          <w:szCs w:val="2"/>
+        </w:rPr>
+        <w:t>{%p endif %}</w:t>
+      </w:r>
+    </w:p>
+    <w:p>
+      <w:pPr>
+        <w:snapToGrid w:val="0"/>
+        <w:rPr>
+          <w:sz w:val="20"/>
+          <w:szCs w:val="20"/>
+        </w:rPr>
+      </w:pPr>
+    </w:p>
+    <w:p>
+      <w:pPr>
+        <w:rPr>
+          <w:sz w:val="2"/>
+          <w:szCs w:val="2"/>
+        </w:rPr>
+      </w:pPr>
+      <w:r>
+        <w:rPr>
+          <w:sz w:val="2"/>
+          <w:szCs w:val="2"/>
+        </w:rPr>
+        <w:t>{%p if escopo.show_contenciosa %}</w:t>
+      </w:r>
+    </w:p>
+    <w:p>
+      <w:pPr>
         <w:rPr>
           <w:b/>
           <w:bCs/>
           <w:sz w:val="20"/>
           <w:szCs w:val="20"/>
         </w:rPr>
-        <w:t xml:space="preserve">/SLA: </w:t>
-      </w:r>
-    </w:p>
-    <w:p>
-      <w:pPr>
-        <w:keepNext/>
-        <w:snapToGrid w:val="0"/>
-        <w:rPr>
-          <w:sz w:val="20"/>
-          <w:szCs w:val="20"/>
-        </w:rPr>
-      </w:pPr>
-      <w:r>
-        <w:rPr>
-          <w:sz w:val="20"/>
-          <w:szCs w:val="20"/>
-        </w:rPr>
-        <w:t>{{escopo.sla_descricao}}</w:t>
+      </w:pPr>
+      <w:r>
+        <w:rPr>
+          <w:b/>
+          <w:bCs/>
+          <w:sz w:val="20"/>
+          <w:szCs w:val="20"/>
+        </w:rPr>
+        <w:t>Escopo</w:t>
+      </w:r>
+      <w:r>
+        <w:rPr>
+          <w:b/>
+          <w:bCs/>
+          <w:sz w:val="20"/>
+          <w:szCs w:val="20"/>
+        </w:rPr>
+        <w:t xml:space="preserve"> </w:t>
+      </w:r>
+      <w:r>
+        <w:rPr>
+          <w:b/>
+          <w:bCs/>
+          <w:sz w:val="20"/>
+          <w:szCs w:val="20"/>
+        </w:rPr>
+        <w:t>Contencioso</w:t>
+      </w:r>
+      <w:r>
+        <w:rPr>
+          <w:b/>
+          <w:bCs/>
+          <w:sz w:val="20"/>
+          <w:szCs w:val="20"/>
+        </w:rPr>
+        <w:t>:</w:t>
+      </w:r>
+    </w:p>
+    <w:p>
+      <w:pPr>
+        <w:rPr>
+          <w:sz w:val="20"/>
+          <w:szCs w:val="20"/>
+        </w:rPr>
+      </w:pPr>
+      <w:r>
+        <w:rPr>
+          <w:sz w:val="20"/>
+          <w:szCs w:val="20"/>
+        </w:rPr>
+        <w:t>{{escopo.atuacao_contenciosa}}</w:t>
       </w:r>
     </w:p>
     <w:p>
@@ -518,16 +602,19 @@
           <w:sz w:val="2"/>
           <w:szCs w:val="2"/>
         </w:rPr>
-        <w:t>{%p if escopo.show_contenciosa %}</w:t>
-      </w:r>
-    </w:p>
-    <w:p>
-      <w:pPr>
+        <w:t>{%p if escopo.show_consultiva %}</w:t>
+      </w:r>
+    </w:p>
+    <w:p>
+      <w:pPr>
+        <w:keepNext/>
+        <w:snapToGrid w:val="0"/>
         <w:rPr>
           <w:b/>
           <w:bCs/>
           <w:sz w:val="20"/>
           <w:szCs w:val="20"/>
+          <w:u w:val="single"/>
         </w:rPr>
       </w:pPr>
       <w:r>
@@ -536,108 +623,7 @@
           <w:bCs/>
           <w:sz w:val="20"/>
           <w:szCs w:val="20"/>
-        </w:rPr>
-        <w:t>Escopo</w:t>
-      </w:r>
-      <w:r>
-        <w:rPr>
-          <w:b/>
-          <w:bCs/>
-          <w:sz w:val="20"/>
-          <w:szCs w:val="20"/>
-        </w:rPr>
-        <w:t xml:space="preserve"> </w:t>
-      </w:r>
-      <w:r>
-        <w:rPr>
-          <w:b/>
-          <w:bCs/>
-          <w:sz w:val="20"/>
-          <w:szCs w:val="20"/>
-        </w:rPr>
-        <w:t>Contencioso</w:t>
-      </w:r>
-      <w:r>
-        <w:rPr>
-          <w:b/>
-          <w:bCs/>
-          <w:sz w:val="20"/>
-          <w:szCs w:val="20"/>
-        </w:rPr>
-        <w:t>:</w:t>
-      </w:r>
-    </w:p>
-    <w:p>
-      <w:pPr>
-        <w:rPr>
-          <w:sz w:val="20"/>
-          <w:szCs w:val="20"/>
-        </w:rPr>
-      </w:pPr>
-      <w:r>
-        <w:rPr>
-          <w:sz w:val="20"/>
-          <w:szCs w:val="20"/>
-        </w:rPr>
-        <w:t>{{escopo.atuacao_contenciosa}}</w:t>
-      </w:r>
-    </w:p>
-    <w:p>
-      <w:pPr>
-        <w:rPr>
-          <w:sz w:val="2"/>
-          <w:szCs w:val="2"/>
-        </w:rPr>
-      </w:pPr>
-      <w:r>
-        <w:rPr>
-          <w:sz w:val="2"/>
-          <w:szCs w:val="2"/>
-        </w:rPr>
-        <w:t>{%p endif %}</w:t>
-      </w:r>
-    </w:p>
-    <w:p>
-      <w:pPr>
-        <w:snapToGrid w:val="0"/>
-        <w:rPr>
-          <w:sz w:val="20"/>
-          <w:szCs w:val="20"/>
-        </w:rPr>
-      </w:pPr>
-    </w:p>
-    <w:p>
-      <w:pPr>
-        <w:rPr>
-          <w:sz w:val="2"/>
-          <w:szCs w:val="2"/>
-        </w:rPr>
-      </w:pPr>
-      <w:r>
-        <w:rPr>
-          <w:sz w:val="2"/>
-          <w:szCs w:val="2"/>
-        </w:rPr>
-        <w:t>{%p if escopo.show_consultiva %}</w:t>
-      </w:r>
-    </w:p>
-    <w:p>
-      <w:pPr>
-        <w:keepNext/>
-        <w:snapToGrid w:val="0"/>
-        <w:rPr>
-          <w:b/>
-          <w:bCs/>
-          <w:sz w:val="20"/>
-          <w:szCs w:val="20"/>
-        </w:rPr>
-      </w:pPr>
-      <w:r>
-        <w:rPr>
-          <w:b/>
-          <w:bCs/>
-          <w:sz w:val="20"/>
-          <w:szCs w:val="20"/>
+          <w:u w:val="single"/>
         </w:rPr>
         <w:t>Honorários Propostos para o Escopo Consultivo</w:t>
       </w:r>
@@ -744,9 +730,6 @@
         <w:gridCol w:w="6434"/>
       </w:tblGrid>
       <w:tr>
-        <w:trPr>
-          <w:tblHeader/>
-        </w:trPr>
         <w:tc>
           <w:tcPr>
             <w:tcW w:w="3200" w:type="dxa"/>
@@ -1882,6 +1865,7 @@
           <w:bCs/>
           <w:sz w:val="20"/>
           <w:szCs w:val="20"/>
+          <w:u w:val="single"/>
         </w:rPr>
       </w:pPr>
       <w:r>
@@ -1890,17 +1874,9 @@
           <w:bCs/>
           <w:sz w:val="20"/>
           <w:szCs w:val="20"/>
-        </w:rPr>
-        <w:t>Honorá</w:t>
-      </w:r>
-      <w:r>
-        <w:rPr>
-          <w:b/>
-          <w:bCs/>
-          <w:sz w:val="20"/>
-          <w:szCs w:val="20"/>
-        </w:rPr>
-        <w:t>rios Propostos para o Escopo Contencioso</w:t>
+          <w:u w:val="single"/>
+        </w:rPr>
+        <w:t>Honorários Propostos para o Escopo Contencioso</w:t>
       </w:r>
     </w:p>
     <w:p>
@@ -2038,9 +2014,6 @@
         <w:gridCol w:w="3234"/>
       </w:tblGrid>
       <w:tr>
-        <w:trPr>
-          <w:tblHeader/>
-        </w:trPr>
         <w:tc>
           <w:tcPr>
             <w:tcW w:w="3200" w:type="dxa"/>
@@ -2532,9 +2505,6 @@
         <w:gridCol w:w="2634"/>
       </w:tblGrid>
       <w:tr>
-        <w:trPr>
-          <w:tblHeader/>
-        </w:trPr>
         <w:tc>
           <w:tcPr>
             <w:tcW w:w="3200" w:type="dxa"/>
@@ -3920,14 +3890,7 @@
           <w:sz w:val="20"/>
           <w:szCs w:val="20"/>
         </w:rPr>
-        <w:t xml:space="preserve"> </w:t>
-      </w:r>
-      <w:r>
-        <w:rPr>
-          <w:sz w:val="20"/>
-          <w:szCs w:val="20"/>
-        </w:rPr>
-        <w:t>não procedesse à leitura da publicação.</w:t>
+        <w:t xml:space="preserve"> não procedesse à leitura da publicação.</w:t>
       </w:r>
     </w:p>
     <w:p>
@@ -4088,9 +4051,6 @@
         <w:gridCol w:w="6434"/>
       </w:tblGrid>
       <w:tr>
-        <w:trPr>
-          <w:tblHeader/>
-        </w:trPr>
         <w:tc>
           <w:tcPr>
             <w:tcW w:w="3200" w:type="dxa"/>
@@ -4454,14 +4414,7 @@
           <w:sz w:val="20"/>
           <w:szCs w:val="20"/>
         </w:rPr>
-        <w:t>p valor abaixo</w:t>
-      </w:r>
-      <w:r>
-        <w:rPr>
-          <w:sz w:val="20"/>
-          <w:szCs w:val="20"/>
-        </w:rPr>
-        <w:t xml:space="preserve"> para serviços </w:t>
+        <w:t xml:space="preserve">p valor abaixo para serviços </w:t>
       </w:r>
       <w:r>
         <w:rPr>
@@ -6072,14 +6025,7 @@
           <w:sz w:val="20"/>
           <w:szCs w:val="20"/>
         </w:rPr>
-        <w:t>Em caso de atraso superior a 10 (dez) dias, será facultado ao Contratado suspender a prestação dos serviços</w:t>
-      </w:r>
-      <w:r>
-        <w:rPr>
-          <w:sz w:val="20"/>
-          <w:szCs w:val="20"/>
-        </w:rPr>
-        <w:t>,</w:t>
+        <w:t>Em caso de atraso superior a 10 (dez) dias, será facultado ao Contratado suspender a prestação dos serviços,</w:t>
       </w:r>
       <w:r>
         <w:rPr>
@@ -10138,14 +10084,12 @@
 </file>
 
 <file path=customXml/item1.xml><?xml version="1.0" encoding="utf-8"?>
-<p:properties xmlns:p="http://schemas.microsoft.com/office/2006/metadata/properties" xmlns:xsi="http://www.w3.org/2001/XMLSchema-instance" xmlns:pc="http://schemas.microsoft.com/office/infopath/2007/PartnerControls">
-  <documentManagement>
-    <lcf76f155ced4ddcb4097134ff3c332f xmlns="e5b1cd33-4eca-41a4-b7d8-fdf3e6200119">
-      <Terms xmlns="http://schemas.microsoft.com/office/infopath/2007/PartnerControls"/>
-    </lcf76f155ced4ddcb4097134ff3c332f>
-    <TaxCatchAll xmlns="c710a95f-4097-48d0-b72e-528dcf24b561" xsi:nil="true"/>
-  </documentManagement>
-</p:properties>
+<?mso-contentType ?>
+<FormTemplates xmlns="http://schemas.microsoft.com/sharepoint/v3/contenttype/forms">
+  <Display>DocumentLibraryForm</Display>
+  <Edit>DocumentLibraryForm</Edit>
+  <New>DocumentLibraryForm</New>
+</FormTemplates>
 </file>
 
 <file path=customXml/item2.xml><?xml version="1.0" encoding="utf-8"?>
@@ -10356,21 +10300,20 @@
 </file>
 
 <file path=customXml/item3.xml><?xml version="1.0" encoding="utf-8"?>
-<?mso-contentType ?>
-<FormTemplates xmlns="http://schemas.microsoft.com/sharepoint/v3/contenttype/forms">
-  <Display>DocumentLibraryForm</Display>
-  <Edit>DocumentLibraryForm</Edit>
-  <New>DocumentLibraryForm</New>
-</FormTemplates>
+<p:properties xmlns:p="http://schemas.microsoft.com/office/2006/metadata/properties" xmlns:xsi="http://www.w3.org/2001/XMLSchema-instance" xmlns:pc="http://schemas.microsoft.com/office/infopath/2007/PartnerControls">
+  <documentManagement>
+    <lcf76f155ced4ddcb4097134ff3c332f xmlns="e5b1cd33-4eca-41a4-b7d8-fdf3e6200119">
+      <Terms xmlns="http://schemas.microsoft.com/office/infopath/2007/PartnerControls"/>
+    </lcf76f155ced4ddcb4097134ff3c332f>
+    <TaxCatchAll xmlns="c710a95f-4097-48d0-b72e-528dcf24b561" xsi:nil="true"/>
+  </documentManagement>
+</p:properties>
 </file>
 
 <file path=customXml/itemProps1.xml><?xml version="1.0" encoding="utf-8"?>
-<ds:datastoreItem xmlns:ds="http://schemas.openxmlformats.org/officeDocument/2006/customXml" ds:itemID="{CB7613A1-A0CB-4E22-AF85-27793339D14D}">
+<ds:datastoreItem xmlns:ds="http://schemas.openxmlformats.org/officeDocument/2006/customXml" ds:itemID="{A5ED3DFB-4F39-4BF8-995C-27FE2C86527B}">
   <ds:schemaRefs>
-    <ds:schemaRef ds:uri="http://schemas.microsoft.com/office/2006/metadata/properties"/>
-    <ds:schemaRef ds:uri="http://schemas.microsoft.com/office/infopath/2007/PartnerControls"/>
-    <ds:schemaRef ds:uri="e5b1cd33-4eca-41a4-b7d8-fdf3e6200119"/>
-    <ds:schemaRef ds:uri="c710a95f-4097-48d0-b72e-528dcf24b561"/>
+    <ds:schemaRef ds:uri="http://schemas.microsoft.com/sharepoint/v3/contenttype/forms"/>
   </ds:schemaRefs>
 </ds:datastoreItem>
 </file>
@@ -10395,9 +10338,12 @@
 </file>
 
 <file path=customXml/itemProps3.xml><?xml version="1.0" encoding="utf-8"?>
-<ds:datastoreItem xmlns:ds="http://schemas.openxmlformats.org/officeDocument/2006/customXml" ds:itemID="{A5ED3DFB-4F39-4BF8-995C-27FE2C86527B}">
+<ds:datastoreItem xmlns:ds="http://schemas.openxmlformats.org/officeDocument/2006/customXml" ds:itemID="{CB7613A1-A0CB-4E22-AF85-27793339D14D}">
   <ds:schemaRefs>
-    <ds:schemaRef ds:uri="http://schemas.microsoft.com/sharepoint/v3/contenttype/forms"/>
+    <ds:schemaRef ds:uri="http://schemas.microsoft.com/office/2006/metadata/properties"/>
+    <ds:schemaRef ds:uri="http://schemas.microsoft.com/office/infopath/2007/PartnerControls"/>
+    <ds:schemaRef ds:uri="e5b1cd33-4eca-41a4-b7d8-fdf3e6200119"/>
+    <ds:schemaRef ds:uri="c710a95f-4097-48d0-b72e-528dcf24b561"/>
   </ds:schemaRefs>
 </ds:datastoreItem>
 </file>
</xml_diff>

<commit_message>
fix: persistencia de checkboxes + atualiza template
1. Checkboxes de modalidade voltam ao padrao value= + key= simples (sem
   callback). O padrao anterior (key= + on_change=callback) causava
   inconsistencia de estado ao navegar entre etapas — checkboxes
   apareciam desmarcados ao voltar.

   Padrao atual:
     cm[k] = c1.checkbox("Label", value=cm[k], key="cons_hs")

   Funciona porque cm e referencia ao form em session_state. O retorno
   do widget e o estado atual e fica salvo no form imediatamente.

   Removido o callback _on_modalidade_toggle e o sync _CB_MODALIDADE_MAP
   no _init_state — desnecessarios com o padrao direto.

2. Template Markers atualizado (correcao de ortografia em texto livre):
   - 0 markers desconhecidos
   - 0 tags Jinja fragmentadas
   - mesmo conjunto de markers
   - PMRA_Template_Jinja.docx regerado
</commit_message>
<xml_diff>
--- a/resources/templates/PMRA_Template_Jinja.docx
+++ b/resources/templates/PMRA_Template_Jinja.docx
@@ -3818,23 +3818,7 @@
           <w:sz w:val="20"/>
           <w:szCs w:val="20"/>
         </w:rPr>
-        <w:t xml:space="preserve"> reconhece que a realização de leitura de publicações em painéis, sistemas, </w:t>
-      </w:r>
-      <w:proofErr w:type="spellStart"/>
-      <w:r>
-        <w:rPr>
-          <w:sz w:val="20"/>
-          <w:szCs w:val="20"/>
-        </w:rPr>
-        <w:t>DJe</w:t>
-      </w:r>
-      <w:proofErr w:type="spellEnd"/>
-      <w:r>
-        <w:rPr>
-          <w:sz w:val="20"/>
-          <w:szCs w:val="20"/>
-        </w:rPr>
-        <w:t xml:space="preserve">, e/ou qualquer outro meio de publicação oficial dos órgãos do poder público, poderá acarretar no início da fluência de prazos processuais e/ou administrativos, peremptórios ou não, de modo que </w:t>
+        <w:t xml:space="preserve"> reconhece que a realização de leitura de publicações em painéis, sistemas, DJe, e/ou qualquer outro meio de publicação oficial dos órgãos do poder público, poderá acarretar no início da fluência de prazos processuais e/ou administrativos, peremptórios ou não, de modo que </w:t>
       </w:r>
       <w:r>
         <w:rPr>
@@ -4414,7 +4398,14 @@
           <w:sz w:val="20"/>
           <w:szCs w:val="20"/>
         </w:rPr>
-        <w:t xml:space="preserve">p valor abaixo para serviços </w:t>
+        <w:t>o</w:t>
+      </w:r>
+      <w:r>
+        <w:rPr>
+          <w:sz w:val="20"/>
+          <w:szCs w:val="20"/>
+        </w:rPr>
+        <w:t xml:space="preserve"> valor abaixo para serviços </w:t>
       </w:r>
       <w:r>
         <w:rPr>
@@ -7061,103 +7052,7 @@
           <w:sz w:val="20"/>
           <w:szCs w:val="20"/>
         </w:rPr>
-        <w:t xml:space="preserve">As Partes declaram conduzir suas atividades em estrita conformidade com a legislação anticorrupção aplicável, incluindo a Lei n. 12.846/2013, o Decreto n. 11.129/2022, a Lei n. 9.613/1998 e, quando cabíveis em razão da jurisdição das operações, a </w:t>
-      </w:r>
-      <w:proofErr w:type="spellStart"/>
-      <w:r>
-        <w:rPr>
-          <w:sz w:val="20"/>
-          <w:szCs w:val="20"/>
-        </w:rPr>
-        <w:t>Foreign</w:t>
-      </w:r>
-      <w:proofErr w:type="spellEnd"/>
-      <w:r>
-        <w:rPr>
-          <w:sz w:val="20"/>
-          <w:szCs w:val="20"/>
-        </w:rPr>
-        <w:t xml:space="preserve"> </w:t>
-      </w:r>
-      <w:proofErr w:type="spellStart"/>
-      <w:r>
-        <w:rPr>
-          <w:sz w:val="20"/>
-          <w:szCs w:val="20"/>
-        </w:rPr>
-        <w:t>Corrupt</w:t>
-      </w:r>
-      <w:proofErr w:type="spellEnd"/>
-      <w:r>
-        <w:rPr>
-          <w:sz w:val="20"/>
-          <w:szCs w:val="20"/>
-        </w:rPr>
-        <w:t xml:space="preserve"> </w:t>
-      </w:r>
-      <w:proofErr w:type="spellStart"/>
-      <w:r>
-        <w:rPr>
-          <w:sz w:val="20"/>
-          <w:szCs w:val="20"/>
-        </w:rPr>
-        <w:t>Practices</w:t>
-      </w:r>
-      <w:proofErr w:type="spellEnd"/>
-      <w:r>
-        <w:rPr>
-          <w:sz w:val="20"/>
-          <w:szCs w:val="20"/>
-        </w:rPr>
-        <w:t xml:space="preserve"> </w:t>
-      </w:r>
-      <w:proofErr w:type="spellStart"/>
-      <w:r>
-        <w:rPr>
-          <w:sz w:val="20"/>
-          <w:szCs w:val="20"/>
-        </w:rPr>
-        <w:t>Act</w:t>
-      </w:r>
-      <w:proofErr w:type="spellEnd"/>
-      <w:r>
-        <w:rPr>
-          <w:sz w:val="20"/>
-          <w:szCs w:val="20"/>
-        </w:rPr>
-        <w:t xml:space="preserve"> (FCPA) e o UK </w:t>
-      </w:r>
-      <w:proofErr w:type="spellStart"/>
-      <w:r>
-        <w:rPr>
-          <w:sz w:val="20"/>
-          <w:szCs w:val="20"/>
-        </w:rPr>
-        <w:t>Bribery</w:t>
-      </w:r>
-      <w:proofErr w:type="spellEnd"/>
-      <w:r>
-        <w:rPr>
-          <w:sz w:val="20"/>
-          <w:szCs w:val="20"/>
-        </w:rPr>
-        <w:t xml:space="preserve"> </w:t>
-      </w:r>
-      <w:proofErr w:type="spellStart"/>
-      <w:r>
-        <w:rPr>
-          <w:sz w:val="20"/>
-          <w:szCs w:val="20"/>
-        </w:rPr>
-        <w:t>Act</w:t>
-      </w:r>
-      <w:proofErr w:type="spellEnd"/>
-      <w:r>
-        <w:rPr>
-          <w:sz w:val="20"/>
-          <w:szCs w:val="20"/>
-        </w:rPr>
-        <w:t>, comprometendo-se a não oferecer, prometer, dar ou autorizar, direta ou indiretamente, qualquer vantagem indevida a agente público ou a terceiro com a finalidade de obter vantagem imprópria relacionada à execução dest</w:t>
+        <w:t>As Partes declaram conduzir suas atividades em estrita conformidade com a legislação anticorrupção aplicável, incluindo a Lei n. 12.846/2013, o Decreto n. 11.129/2022, a Lei n. 9.613/1998 e, quando cabíveis em razão da jurisdição das operações, a Foreign Corrupt Practices Act (FCPA) e o UK Bribery Act, comprometendo-se a não oferecer, prometer, dar ou autorizar, direta ou indiretamente, qualquer vantagem indevida a agente público ou a terceiro com a finalidade de obter vantagem imprópria relacionada à execução dest</w:t>
       </w:r>
       <w:r>
         <w:rPr>
@@ -7563,23 +7458,7 @@
           <w:sz w:val="20"/>
           <w:szCs w:val="20"/>
         </w:rPr>
-        <w:t xml:space="preserve"> fora das hipóteses legais ou contratuais, a submeter eventuais </w:t>
-      </w:r>
-      <w:proofErr w:type="spellStart"/>
-      <w:r>
-        <w:rPr>
-          <w:sz w:val="20"/>
-          <w:szCs w:val="20"/>
-        </w:rPr>
-        <w:t>suboperadores</w:t>
-      </w:r>
-      <w:proofErr w:type="spellEnd"/>
-      <w:r>
-        <w:rPr>
-          <w:sz w:val="20"/>
-          <w:szCs w:val="20"/>
-        </w:rPr>
-        <w:t xml:space="preserve"> a obrigações equivalentes e a notificar a outra Parte, em até 24 (vinte e quatro) horas da ciência, de qualquer incidente de segurança envolvendo dados pessoais desta contratação.</w:t>
+        <w:t xml:space="preserve"> fora das hipóteses legais ou contratuais, a submeter eventuais suboperadores a obrigações equivalentes e a notificar a outra Parte, em até 24 (vinte e quatro) horas da ciência, de qualquer incidente de segurança envolvendo dados pessoais desta contratação.</w:t>
       </w:r>
     </w:p>
     <w:p>
@@ -10084,15 +9963,6 @@
 </file>
 
 <file path=customXml/item1.xml><?xml version="1.0" encoding="utf-8"?>
-<?mso-contentType ?>
-<FormTemplates xmlns="http://schemas.microsoft.com/sharepoint/v3/contenttype/forms">
-  <Display>DocumentLibraryForm</Display>
-  <Edit>DocumentLibraryForm</Edit>
-  <New>DocumentLibraryForm</New>
-</FormTemplates>
-</file>
-
-<file path=customXml/item2.xml><?xml version="1.0" encoding="utf-8"?>
 <ct:contentTypeSchema xmlns:ct="http://schemas.microsoft.com/office/2006/metadata/contentType" xmlns:ma="http://schemas.microsoft.com/office/2006/metadata/properties/metaAttributes" ct:_="" ma:_="" ma:contentTypeName="Documento" ma:contentTypeID="0x010100C538FE3DE9F5C249B208F757A39C9CF1" ma:contentTypeVersion="13" ma:contentTypeDescription="Crie um novo documento." ma:contentTypeScope="" ma:versionID="f58841031a2b8acc55807e179e1eb129">
   <xsd:schema xmlns:xsd="http://www.w3.org/2001/XMLSchema" xmlns:xs="http://www.w3.org/2001/XMLSchema" xmlns:p="http://schemas.microsoft.com/office/2006/metadata/properties" xmlns:ns2="e5b1cd33-4eca-41a4-b7d8-fdf3e6200119" xmlns:ns3="c710a95f-4097-48d0-b72e-528dcf24b561" targetNamespace="http://schemas.microsoft.com/office/2006/metadata/properties" ma:root="true" ma:fieldsID="eabb80da9e4a7645788b9624de58e5c8" ns2:_="" ns3:_="">
     <xsd:import namespace="e5b1cd33-4eca-41a4-b7d8-fdf3e6200119"/>
@@ -10299,6 +10169,15 @@
 </ct:contentTypeSchema>
 </file>
 
+<file path=customXml/item2.xml><?xml version="1.0" encoding="utf-8"?>
+<?mso-contentType ?>
+<FormTemplates xmlns="http://schemas.microsoft.com/sharepoint/v3/contenttype/forms">
+  <Display>DocumentLibraryForm</Display>
+  <Edit>DocumentLibraryForm</Edit>
+  <New>DocumentLibraryForm</New>
+</FormTemplates>
+</file>
+
 <file path=customXml/item3.xml><?xml version="1.0" encoding="utf-8"?>
 <p:properties xmlns:p="http://schemas.microsoft.com/office/2006/metadata/properties" xmlns:xsi="http://www.w3.org/2001/XMLSchema-instance" xmlns:pc="http://schemas.microsoft.com/office/infopath/2007/PartnerControls">
   <documentManagement>
@@ -10311,14 +10190,6 @@
 </file>
 
 <file path=customXml/itemProps1.xml><?xml version="1.0" encoding="utf-8"?>
-<ds:datastoreItem xmlns:ds="http://schemas.openxmlformats.org/officeDocument/2006/customXml" ds:itemID="{A5ED3DFB-4F39-4BF8-995C-27FE2C86527B}">
-  <ds:schemaRefs>
-    <ds:schemaRef ds:uri="http://schemas.microsoft.com/sharepoint/v3/contenttype/forms"/>
-  </ds:schemaRefs>
-</ds:datastoreItem>
-</file>
-
-<file path=customXml/itemProps2.xml><?xml version="1.0" encoding="utf-8"?>
 <ds:datastoreItem xmlns:ds="http://schemas.openxmlformats.org/officeDocument/2006/customXml" ds:itemID="{527C8FAF-F895-460C-92FD-63B7C6027339}">
   <ds:schemaRefs>
     <ds:schemaRef ds:uri="http://schemas.microsoft.com/office/2006/metadata/contentType"/>
@@ -10337,6 +10208,14 @@
 </ds:datastoreItem>
 </file>
 
+<file path=customXml/itemProps2.xml><?xml version="1.0" encoding="utf-8"?>
+<ds:datastoreItem xmlns:ds="http://schemas.openxmlformats.org/officeDocument/2006/customXml" ds:itemID="{A5ED3DFB-4F39-4BF8-995C-27FE2C86527B}">
+  <ds:schemaRefs>
+    <ds:schemaRef ds:uri="http://schemas.microsoft.com/sharepoint/v3/contenttype/forms"/>
+  </ds:schemaRefs>
+</ds:datastoreItem>
+</file>
+
 <file path=customXml/itemProps3.xml><?xml version="1.0" encoding="utf-8"?>
 <ds:datastoreItem xmlns:ds="http://schemas.openxmlformats.org/officeDocument/2006/customXml" ds:itemID="{CB7613A1-A0CB-4E22-AF85-27793339D14D}">
   <ds:schemaRefs>

</xml_diff>

<commit_message>
fix: filtra linhas vazias das tabelas + atualiza template markers
1. Linhas vazias nao aparecem mais no documento final:
   - acoes / atos: linhas sem 'valor' sao filtradas (cumpre o que
     o help_text do form ja prometia: "Linhas sem valor sao ignoradas")
   - senioridade / despesas / horas_extra_senioridade: linhas com
     TODOS campos vazios sao filtradas

   pmra/data_mapper.py: duas novas funcoes _filter_rows_by(field) e
   _filter_non_empty_rows() aplicadas a cada tabela. Antes, uma tabela
   default com 1 linha vazia gerava 1 linha em branco no docx; agora
   nao gera nada.

2. tests/test_data_mapper.py: nova TestFilterEmptyRows com 4 casos
   cobrindo acoes/atos/senioridade/despesas. Total: 43 testes verdes
   (era 39).

3. PMRA_Template_Markers.docx atualizado pelo cliente — 0 deltas no
   conjunto de markers, -146 bytes em texto livre. PMRA_Template_Jinja.docx
   regerado via scripts/build_from_markers.py.
</commit_message>
<xml_diff>
--- a/resources/templates/PMRA_Template_Jinja.docx
+++ b/resources/templates/PMRA_Template_Jinja.docx
@@ -281,12 +281,12 @@
     <w:p>
       <w:pPr>
         <w:snapToGrid w:val="0"/>
-        <w:jc w:val="center"/>
         <w:rPr>
           <w:b/>
           <w:bCs/>
           <w:sz w:val="20"/>
           <w:szCs w:val="20"/>
+          <w:u w:val="single"/>
         </w:rPr>
       </w:pPr>
       <w:r>
@@ -295,6 +295,7 @@
           <w:bCs/>
           <w:sz w:val="20"/>
           <w:szCs w:val="20"/>
+          <w:u w:val="single"/>
         </w:rPr>
         <w:t>Escopo de Trabalho</w:t>
       </w:r>
@@ -304,6 +305,7 @@
           <w:bCs/>
           <w:sz w:val="20"/>
           <w:szCs w:val="20"/>
+          <w:u w:val="single"/>
         </w:rPr>
         <w:br/>
       </w:r>
@@ -6536,7 +6538,7 @@
           <w:sz w:val="20"/>
           <w:szCs w:val="20"/>
         </w:rPr>
-        <w:t>DAS OBRIGAÇÕES DO CONTRATADO</w:t>
+        <w:t>OBRIGAÇÕES DO CONTRATADO</w:t>
       </w:r>
     </w:p>
     <w:p>
@@ -6831,7 +6833,7 @@
           <w:sz w:val="20"/>
           <w:szCs w:val="20"/>
         </w:rPr>
-        <w:t>DAS OBRIGAÇÕES DA CONTRATANTE</w:t>
+        <w:t>OBRIGAÇÕES DA CONTRATANTE</w:t>
       </w:r>
     </w:p>
     <w:p>
@@ -7020,7 +7022,7 @@
           <w:sz w:val="20"/>
           <w:szCs w:val="20"/>
         </w:rPr>
-        <w:t>DA ANTICORRUPÇÃO E CONFORMIDADE</w:t>
+        <w:t>ANTICORRUPÇÃO E CONFORMIDADE</w:t>
       </w:r>
     </w:p>
     <w:p>
@@ -7145,7 +7147,7 @@
           <w:sz w:val="20"/>
           <w:szCs w:val="20"/>
         </w:rPr>
-        <w:t>DA CONFIDENCIALIDADE</w:t>
+        <w:t>CONFIDENCIALIDADE</w:t>
       </w:r>
     </w:p>
     <w:p>
@@ -7334,7 +7336,7 @@
           <w:sz w:val="20"/>
           <w:szCs w:val="20"/>
         </w:rPr>
-        <w:t>DA PROTEÇÃO DE DADOS PESSOAIS</w:t>
+        <w:t>PROTEÇÃO DE DADOS PESSOAIS</w:t>
       </w:r>
     </w:p>
     <w:p>
@@ -7523,7 +7525,7 @@
           <w:sz w:val="20"/>
           <w:szCs w:val="20"/>
         </w:rPr>
-        <w:t>DA RESPONSABILIDADE</w:t>
+        <w:t>RESPONSABILIDADE</w:t>
       </w:r>
     </w:p>
     <w:p>
@@ -7634,7 +7636,7 @@
           <w:sz w:val="20"/>
           <w:szCs w:val="20"/>
         </w:rPr>
-        <w:t>DA RESCISÃO</w:t>
+        <w:t>RESCISÃO</w:t>
       </w:r>
     </w:p>
     <w:p>
@@ -7808,7 +7810,7 @@
           <w:sz w:val="20"/>
           <w:szCs w:val="20"/>
         </w:rPr>
-        <w:t>DAS DISPOSIÇÕES GERAIS</w:t>
+        <w:t>DISPOSIÇÕES GERAIS</w:t>
       </w:r>
     </w:p>
     <w:p>
@@ -8018,7 +8020,15 @@
           <w:sz w:val="20"/>
           <w:szCs w:val="20"/>
         </w:rPr>
-        <w:t>DO FORO</w:t>
+        <w:t xml:space="preserve">LEGISLAÇÃO APLICÁVEL E </w:t>
+      </w:r>
+      <w:r>
+        <w:rPr>
+          <w:b/>
+          <w:sz w:val="20"/>
+          <w:szCs w:val="20"/>
+        </w:rPr>
+        <w:t>FORO</w:t>
       </w:r>
     </w:p>
     <w:p>
@@ -8050,21 +8060,14 @@
           <w:sz w:val="20"/>
           <w:szCs w:val="20"/>
         </w:rPr>
-        <w:t>Fica eleito o foro da Comarca de Belo Horizonte, Estado de Minas Gerais, com renúncia expressa a qualquer outro, por mais privilegiado que seja, para dirimir quaisquer dúvidas ou controvérsias oriundas dest</w:t>
-      </w:r>
-      <w:r>
-        <w:rPr>
-          <w:sz w:val="20"/>
-          <w:szCs w:val="20"/>
-        </w:rPr>
-        <w:t>a Proposta</w:t>
-      </w:r>
-      <w:r>
-        <w:rPr>
-          <w:sz w:val="20"/>
-          <w:szCs w:val="20"/>
-        </w:rPr>
-        <w:t xml:space="preserve"> que não possam ser solucionadas pela via amigável.</w:t>
+        <w:t xml:space="preserve">As Leis da República Federativa do Brasil são aplicáveis a esta Proposta. </w:t>
+      </w:r>
+      <w:r>
+        <w:rPr>
+          <w:sz w:val="20"/>
+          <w:szCs w:val="20"/>
+        </w:rPr>
+        <w:t>Fica eleito o foro da Comarca de Belo Horizonte, Estado de Minas Gerais, com renúncia expressa a qualquer outro, por mais privilegiado que seja, para dirimir quaisquer dúvidas ou controvérsias oriundas desta Proposta que não possam ser solucionadas pela via amigável.</w:t>
       </w:r>
     </w:p>
     <w:p>
@@ -8272,18 +8275,6 @@
         </w:tc>
       </w:tr>
     </w:tbl>
-    <w:p>
-      <w:pPr>
-        <w:keepNext/>
-        <w:snapToGrid w:val="0"/>
-        <w:rPr>
-          <w:b/>
-          <w:bCs/>
-          <w:sz w:val="20"/>
-          <w:szCs w:val="20"/>
-        </w:rPr>
-      </w:pPr>
-    </w:p>
     <w:p>
       <w:pPr>
         <w:keepNext/>
@@ -9963,6 +9954,26 @@
 </file>
 
 <file path=customXml/item1.xml><?xml version="1.0" encoding="utf-8"?>
+<p:properties xmlns:p="http://schemas.microsoft.com/office/2006/metadata/properties" xmlns:xsi="http://www.w3.org/2001/XMLSchema-instance" xmlns:pc="http://schemas.microsoft.com/office/infopath/2007/PartnerControls">
+  <documentManagement>
+    <lcf76f155ced4ddcb4097134ff3c332f xmlns="e5b1cd33-4eca-41a4-b7d8-fdf3e6200119">
+      <Terms xmlns="http://schemas.microsoft.com/office/infopath/2007/PartnerControls"/>
+    </lcf76f155ced4ddcb4097134ff3c332f>
+    <TaxCatchAll xmlns="c710a95f-4097-48d0-b72e-528dcf24b561" xsi:nil="true"/>
+  </documentManagement>
+</p:properties>
+</file>
+
+<file path=customXml/item2.xml><?xml version="1.0" encoding="utf-8"?>
+<?mso-contentType ?>
+<FormTemplates xmlns="http://schemas.microsoft.com/sharepoint/v3/contenttype/forms">
+  <Display>DocumentLibraryForm</Display>
+  <Edit>DocumentLibraryForm</Edit>
+  <New>DocumentLibraryForm</New>
+</FormTemplates>
+</file>
+
+<file path=customXml/item3.xml><?xml version="1.0" encoding="utf-8"?>
 <ct:contentTypeSchema xmlns:ct="http://schemas.microsoft.com/office/2006/metadata/contentType" xmlns:ma="http://schemas.microsoft.com/office/2006/metadata/properties/metaAttributes" ct:_="" ma:_="" ma:contentTypeName="Documento" ma:contentTypeID="0x010100C538FE3DE9F5C249B208F757A39C9CF1" ma:contentTypeVersion="13" ma:contentTypeDescription="Crie um novo documento." ma:contentTypeScope="" ma:versionID="f58841031a2b8acc55807e179e1eb129">
   <xsd:schema xmlns:xsd="http://www.w3.org/2001/XMLSchema" xmlns:xs="http://www.w3.org/2001/XMLSchema" xmlns:p="http://schemas.microsoft.com/office/2006/metadata/properties" xmlns:ns2="e5b1cd33-4eca-41a4-b7d8-fdf3e6200119" xmlns:ns3="c710a95f-4097-48d0-b72e-528dcf24b561" targetNamespace="http://schemas.microsoft.com/office/2006/metadata/properties" ma:root="true" ma:fieldsID="eabb80da9e4a7645788b9624de58e5c8" ns2:_="" ns3:_="">
     <xsd:import namespace="e5b1cd33-4eca-41a4-b7d8-fdf3e6200119"/>
@@ -10169,27 +10180,26 @@
 </ct:contentTypeSchema>
 </file>
 
-<file path=customXml/item2.xml><?xml version="1.0" encoding="utf-8"?>
-<?mso-contentType ?>
-<FormTemplates xmlns="http://schemas.microsoft.com/sharepoint/v3/contenttype/forms">
-  <Display>DocumentLibraryForm</Display>
-  <Edit>DocumentLibraryForm</Edit>
-  <New>DocumentLibraryForm</New>
-</FormTemplates>
+<file path=customXml/itemProps1.xml><?xml version="1.0" encoding="utf-8"?>
+<ds:datastoreItem xmlns:ds="http://schemas.openxmlformats.org/officeDocument/2006/customXml" ds:itemID="{CB7613A1-A0CB-4E22-AF85-27793339D14D}">
+  <ds:schemaRefs>
+    <ds:schemaRef ds:uri="http://schemas.microsoft.com/office/2006/metadata/properties"/>
+    <ds:schemaRef ds:uri="http://schemas.microsoft.com/office/infopath/2007/PartnerControls"/>
+    <ds:schemaRef ds:uri="e5b1cd33-4eca-41a4-b7d8-fdf3e6200119"/>
+    <ds:schemaRef ds:uri="c710a95f-4097-48d0-b72e-528dcf24b561"/>
+  </ds:schemaRefs>
+</ds:datastoreItem>
 </file>
 
-<file path=customXml/item3.xml><?xml version="1.0" encoding="utf-8"?>
-<p:properties xmlns:p="http://schemas.microsoft.com/office/2006/metadata/properties" xmlns:xsi="http://www.w3.org/2001/XMLSchema-instance" xmlns:pc="http://schemas.microsoft.com/office/infopath/2007/PartnerControls">
-  <documentManagement>
-    <lcf76f155ced4ddcb4097134ff3c332f xmlns="e5b1cd33-4eca-41a4-b7d8-fdf3e6200119">
-      <Terms xmlns="http://schemas.microsoft.com/office/infopath/2007/PartnerControls"/>
-    </lcf76f155ced4ddcb4097134ff3c332f>
-    <TaxCatchAll xmlns="c710a95f-4097-48d0-b72e-528dcf24b561" xsi:nil="true"/>
-  </documentManagement>
-</p:properties>
+<file path=customXml/itemProps2.xml><?xml version="1.0" encoding="utf-8"?>
+<ds:datastoreItem xmlns:ds="http://schemas.openxmlformats.org/officeDocument/2006/customXml" ds:itemID="{A5ED3DFB-4F39-4BF8-995C-27FE2C86527B}">
+  <ds:schemaRefs>
+    <ds:schemaRef ds:uri="http://schemas.microsoft.com/sharepoint/v3/contenttype/forms"/>
+  </ds:schemaRefs>
+</ds:datastoreItem>
 </file>
 
-<file path=customXml/itemProps1.xml><?xml version="1.0" encoding="utf-8"?>
+<file path=customXml/itemProps3.xml><?xml version="1.0" encoding="utf-8"?>
 <ds:datastoreItem xmlns:ds="http://schemas.openxmlformats.org/officeDocument/2006/customXml" ds:itemID="{527C8FAF-F895-460C-92FD-63B7C6027339}">
   <ds:schemaRefs>
     <ds:schemaRef ds:uri="http://schemas.microsoft.com/office/2006/metadata/contentType"/>
@@ -10206,23 +10216,4 @@
     <ds:schemaRef ds:uri="http://schemas.microsoft.com/internal/obd"/>
   </ds:schemaRefs>
 </ds:datastoreItem>
-</file>
-
-<file path=customXml/itemProps2.xml><?xml version="1.0" encoding="utf-8"?>
-<ds:datastoreItem xmlns:ds="http://schemas.openxmlformats.org/officeDocument/2006/customXml" ds:itemID="{A5ED3DFB-4F39-4BF8-995C-27FE2C86527B}">
-  <ds:schemaRefs>
-    <ds:schemaRef ds:uri="http://schemas.microsoft.com/sharepoint/v3/contenttype/forms"/>
-  </ds:schemaRefs>
-</ds:datastoreItem>
-</file>
-
-<file path=customXml/itemProps3.xml><?xml version="1.0" encoding="utf-8"?>
-<ds:datastoreItem xmlns:ds="http://schemas.openxmlformats.org/officeDocument/2006/customXml" ds:itemID="{CB7613A1-A0CB-4E22-AF85-27793339D14D}">
-  <ds:schemaRefs>
-    <ds:schemaRef ds:uri="http://schemas.microsoft.com/office/2006/metadata/properties"/>
-    <ds:schemaRef ds:uri="http://schemas.microsoft.com/office/infopath/2007/PartnerControls"/>
-    <ds:schemaRef ds:uri="e5b1cd33-4eca-41a4-b7d8-fdf3e6200119"/>
-    <ds:schemaRef ds:uri="c710a95f-4097-48d0-b72e-528dcf24b561"/>
-  </ds:schemaRefs>
-</ds:datastoreItem>
 </file>
</xml_diff>

<commit_message>
Adiciona toggle com/sem cap no Preço Global consultivo
O usuário pode ativar um cap de horas que aparece condicionalmente
na tabela do documento. Inclui marcadores [SE_LINHA_CONS_PRECO_GLOBAL_CAP]
e [CONS_PRECO_GLOBAL_CAP] no template, novos campos no schema e UI com toggle.

https://claude.ai/code/session_01QYVgUedAdGPCf2tFmVT5S5
</commit_message>
<xml_diff>
--- a/resources/templates/PMRA_Template_Jinja.docx
+++ b/resources/templates/PMRA_Template_Jinja.docx
@@ -137,6 +137,38 @@
           <w:szCs w:val="20"/>
         </w:rPr>
       </w:pPr>
+      <w:r>
+        <w:rPr>
+          <w:rFonts w:ascii="Arvo" w:hAnsi="Arvo"/>
+          <w:sz w:val="20"/>
+          <w:szCs w:val="20"/>
+        </w:rPr>
+        <w:t>{% if contratante.pf %}CPF{% endif %}{% if contratante.pj %}</w:t>
+      </w:r>
+      <w:r>
+        <w:rPr>
+          <w:rFonts w:ascii="Arvo" w:hAnsi="Arvo"/>
+          <w:sz w:val="20"/>
+          <w:szCs w:val="20"/>
+        </w:rPr>
+        <w:t>CNPJ</w:t>
+      </w:r>
+      <w:r>
+        <w:rPr>
+          <w:rFonts w:ascii="Arvo" w:hAnsi="Arvo"/>
+          <w:sz w:val="20"/>
+          <w:szCs w:val="20"/>
+        </w:rPr>
+        <w:t>{% endif %}</w:t>
+      </w:r>
+      <w:r>
+        <w:rPr>
+          <w:rFonts w:ascii="Arvo" w:hAnsi="Arvo"/>
+          <w:sz w:val="20"/>
+          <w:szCs w:val="20"/>
+        </w:rPr>
+        <w:t xml:space="preserve">: </w:t>
+      </w:r>
       <w:r>
         <w:rPr>
           <w:rFonts w:ascii="Arvo" w:hAnsi="Arvo"/>
@@ -915,6 +947,7 @@
                 <w:sz w:val="20"/>
                 <w:szCs w:val="20"/>
               </w:rPr>
+              <w:lastRenderedPageBreak/>
               <w:t>Categoria</w:t>
             </w:r>
           </w:p>
@@ -993,7 +1026,6 @@
                 <w:sz w:val="20"/>
                 <w:szCs w:val="20"/>
               </w:rPr>
-              <w:lastRenderedPageBreak/>
               <w:t>{%tr for s in consultiva.tabela_senioridade %}</w:t>
             </w:r>
           </w:p>
@@ -1798,7 +1830,23 @@
           <w:sz w:val="20"/>
           <w:szCs w:val="20"/>
         </w:rPr>
-        <w:t>, distribuído conforme o cronograma de pagamento abaixo.</w:t>
+        <w:t xml:space="preserve">, </w:t>
+      </w:r>
+      <w:r>
+        <w:rPr>
+          <w:rFonts w:ascii="Arvo" w:hAnsi="Arvo"/>
+          <w:sz w:val="20"/>
+          <w:szCs w:val="20"/>
+        </w:rPr>
+        <w:t>conforme abaixo</w:t>
+      </w:r>
+      <w:r>
+        <w:rPr>
+          <w:rFonts w:ascii="Arvo" w:hAnsi="Arvo"/>
+          <w:sz w:val="20"/>
+          <w:szCs w:val="20"/>
+        </w:rPr>
+        <w:t>.</w:t>
       </w:r>
     </w:p>
     <w:p>
@@ -1942,6 +1990,328 @@
             <w:r>
               <w:rPr>
                 <w:rFonts w:ascii="Arvo" w:hAnsi="Arvo"/>
+                <w:sz w:val="20"/>
+                <w:szCs w:val="20"/>
+              </w:rPr>
+              <w:t>{%tr if consultiva.show_valor_projeto_cap %}</w:t>
+            </w:r>
+          </w:p>
+        </w:tc>
+        <w:tc>
+          <w:tcPr>
+            <w:tcW w:w="6378" w:type="dxa"/>
+            <w:tcBorders>
+              <w:top w:val="single" w:sz="4" w:space="0" w:color="1A3557"/>
+              <w:left w:val="single" w:sz="4" w:space="0" w:color="1A3557"/>
+              <w:bottom w:val="single" w:sz="4" w:space="0" w:color="1A3557"/>
+              <w:right w:val="single" w:sz="4" w:space="0" w:color="1A3557"/>
+            </w:tcBorders>
+            <w:tcMar>
+              <w:top w:w="100" w:type="dxa"/>
+              <w:left w:w="120" w:type="dxa"/>
+              <w:bottom w:w="100" w:type="dxa"/>
+              <w:right w:w="120" w:type="dxa"/>
+            </w:tcMar>
+          </w:tcPr>
+          <w:p>
+            <w:pPr>
+              <w:snapToGrid w:val="0"/>
+              <w:spacing w:line="276" w:lineRule="auto"/>
+              <w:rPr>
+                <w:rFonts w:ascii="Arvo" w:hAnsi="Arvo"/>
+                <w:sz w:val="20"/>
+                <w:szCs w:val="20"/>
+              </w:rPr>
+            </w:pPr>
+          </w:p>
+        </w:tc>
+      </w:tr>
+      <w:tr>
+        <w:tc>
+          <w:tcPr>
+            <w:tcW w:w="3256" w:type="dxa"/>
+            <w:tcBorders>
+              <w:top w:val="single" w:sz="4" w:space="0" w:color="1A3557"/>
+              <w:left w:val="single" w:sz="4" w:space="0" w:color="1A3557"/>
+              <w:bottom w:val="single" w:sz="4" w:space="0" w:color="1A3557"/>
+              <w:right w:val="single" w:sz="4" w:space="0" w:color="1A3557"/>
+            </w:tcBorders>
+            <w:shd w:val="clear" w:color="auto" w:fill="FFF9F4"/>
+            <w:tcMar>
+              <w:top w:w="100" w:type="dxa"/>
+              <w:left w:w="120" w:type="dxa"/>
+              <w:bottom w:w="100" w:type="dxa"/>
+              <w:right w:w="120" w:type="dxa"/>
+            </w:tcMar>
+          </w:tcPr>
+          <w:p>
+            <w:pPr>
+              <w:snapToGrid w:val="0"/>
+              <w:spacing w:line="276" w:lineRule="auto"/>
+              <w:rPr>
+                <w:rFonts w:ascii="Arvo" w:hAnsi="Arvo"/>
+                <w:sz w:val="20"/>
+                <w:szCs w:val="20"/>
+              </w:rPr>
+            </w:pPr>
+            <w:r>
+              <w:rPr>
+                <w:rFonts w:ascii="Arvo" w:hAnsi="Arvo"/>
+                <w:b/>
+                <w:bCs/>
+                <w:sz w:val="20"/>
+                <w:szCs w:val="20"/>
+              </w:rPr>
+              <w:t>Cap de Horas</w:t>
+            </w:r>
+          </w:p>
+        </w:tc>
+        <w:tc>
+          <w:tcPr>
+            <w:tcW w:w="6378" w:type="dxa"/>
+            <w:tcBorders>
+              <w:top w:val="single" w:sz="4" w:space="0" w:color="1A3557"/>
+              <w:left w:val="single" w:sz="4" w:space="0" w:color="1A3557"/>
+              <w:bottom w:val="single" w:sz="4" w:space="0" w:color="1A3557"/>
+              <w:right w:val="single" w:sz="4" w:space="0" w:color="1A3557"/>
+            </w:tcBorders>
+            <w:tcMar>
+              <w:top w:w="100" w:type="dxa"/>
+              <w:left w:w="120" w:type="dxa"/>
+              <w:bottom w:w="100" w:type="dxa"/>
+              <w:right w:w="120" w:type="dxa"/>
+            </w:tcMar>
+          </w:tcPr>
+          <w:p>
+            <w:pPr>
+              <w:snapToGrid w:val="0"/>
+              <w:spacing w:line="276" w:lineRule="auto"/>
+              <w:rPr>
+                <w:rFonts w:ascii="Arvo" w:hAnsi="Arvo"/>
+                <w:sz w:val="20"/>
+                <w:szCs w:val="20"/>
+              </w:rPr>
+            </w:pPr>
+            <w:r>
+              <w:rPr>
+                <w:rFonts w:ascii="Arvo" w:hAnsi="Arvo"/>
+                <w:sz w:val="20"/>
+                <w:szCs w:val="20"/>
+              </w:rPr>
+              <w:t xml:space="preserve">{{consultiva.valor_projeto_cap}} horas</w:t>
+            </w:r>
+          </w:p>
+        </w:tc>
+      </w:tr>
+      <w:tr>
+        <w:tc>
+          <w:tcPr>
+            <w:tcW w:w="3256" w:type="dxa"/>
+            <w:tcBorders>
+              <w:top w:val="single" w:sz="4" w:space="0" w:color="1A3557"/>
+              <w:left w:val="single" w:sz="4" w:space="0" w:color="1A3557"/>
+              <w:bottom w:val="single" w:sz="4" w:space="0" w:color="1A3557"/>
+              <w:right w:val="single" w:sz="4" w:space="0" w:color="1A3557"/>
+            </w:tcBorders>
+            <w:shd w:val="clear" w:color="auto" w:fill="FFF9F4"/>
+            <w:tcMar>
+              <w:top w:w="100" w:type="dxa"/>
+              <w:left w:w="120" w:type="dxa"/>
+              <w:bottom w:w="100" w:type="dxa"/>
+              <w:right w:w="120" w:type="dxa"/>
+            </w:tcMar>
+          </w:tcPr>
+          <w:p>
+            <w:pPr>
+              <w:snapToGrid w:val="0"/>
+              <w:spacing w:line="276" w:lineRule="auto"/>
+              <w:rPr>
+                <w:rFonts w:ascii="Arvo" w:hAnsi="Arvo"/>
+                <w:sz w:val="20"/>
+                <w:szCs w:val="20"/>
+              </w:rPr>
+            </w:pPr>
+            <w:r>
+              <w:rPr>
+                <w:rFonts w:ascii="Arvo" w:hAnsi="Arvo"/>
+                <w:sz w:val="20"/>
+                <w:szCs w:val="20"/>
+              </w:rPr>
+              <w:t>{%tr endif %}</w:t>
+            </w:r>
+          </w:p>
+        </w:tc>
+        <w:tc>
+          <w:tcPr>
+            <w:tcW w:w="6378" w:type="dxa"/>
+            <w:tcBorders>
+              <w:top w:val="single" w:sz="4" w:space="0" w:color="1A3557"/>
+              <w:left w:val="single" w:sz="4" w:space="0" w:color="1A3557"/>
+              <w:bottom w:val="single" w:sz="4" w:space="0" w:color="1A3557"/>
+              <w:right w:val="single" w:sz="4" w:space="0" w:color="1A3557"/>
+            </w:tcBorders>
+            <w:tcMar>
+              <w:top w:w="100" w:type="dxa"/>
+              <w:left w:w="120" w:type="dxa"/>
+              <w:bottom w:w="100" w:type="dxa"/>
+              <w:right w:w="120" w:type="dxa"/>
+            </w:tcMar>
+          </w:tcPr>
+          <w:p>
+            <w:pPr>
+              <w:snapToGrid w:val="0"/>
+              <w:spacing w:line="276" w:lineRule="auto"/>
+              <w:rPr>
+                <w:rFonts w:ascii="Arvo" w:hAnsi="Arvo"/>
+                <w:sz w:val="20"/>
+                <w:szCs w:val="20"/>
+              </w:rPr>
+            </w:pPr>
+          </w:p>
+        </w:tc>
+      </w:tr>
+      <w:tr>
+        <w:tc>
+          <w:tcPr>
+            <w:tcW w:w="3256" w:type="dxa"/>
+            <w:tcBorders>
+              <w:top w:val="single" w:sz="4" w:space="0" w:color="1A3557"/>
+              <w:left w:val="single" w:sz="4" w:space="0" w:color="1A3557"/>
+              <w:bottom w:val="single" w:sz="4" w:space="0" w:color="1A3557"/>
+              <w:right w:val="single" w:sz="4" w:space="0" w:color="1A3557"/>
+            </w:tcBorders>
+            <w:shd w:val="clear" w:color="auto" w:fill="FFF9F4"/>
+            <w:tcMar>
+              <w:top w:w="100" w:type="dxa"/>
+              <w:left w:w="120" w:type="dxa"/>
+              <w:bottom w:w="100" w:type="dxa"/>
+              <w:right w:w="120" w:type="dxa"/>
+            </w:tcMar>
+          </w:tcPr>
+          <w:p>
+            <w:pPr>
+              <w:snapToGrid w:val="0"/>
+              <w:spacing w:line="276" w:lineRule="auto"/>
+              <w:rPr>
+                <w:rFonts w:ascii="Arvo" w:hAnsi="Arvo"/>
+                <w:b/>
+                <w:bCs/>
+                <w:sz w:val="20"/>
+                <w:szCs w:val="20"/>
+              </w:rPr>
+            </w:pPr>
+            <w:r>
+              <w:rPr>
+                <w:rFonts w:ascii="Arvo" w:hAnsi="Arvo"/>
+                <w:b/>
+                <w:bCs/>
+                <w:sz w:val="20"/>
+                <w:szCs w:val="20"/>
+              </w:rPr>
+              <w:t>Cap de Horas</w:t>
+            </w:r>
+          </w:p>
+        </w:tc>
+        <w:tc>
+          <w:tcPr>
+            <w:tcW w:w="6378" w:type="dxa"/>
+            <w:tcBorders>
+              <w:top w:val="single" w:sz="4" w:space="0" w:color="1A3557"/>
+              <w:left w:val="single" w:sz="4" w:space="0" w:color="1A3557"/>
+              <w:bottom w:val="single" w:sz="4" w:space="0" w:color="1A3557"/>
+              <w:right w:val="single" w:sz="4" w:space="0" w:color="1A3557"/>
+            </w:tcBorders>
+            <w:tcMar>
+              <w:top w:w="100" w:type="dxa"/>
+              <w:left w:w="120" w:type="dxa"/>
+              <w:bottom w:w="100" w:type="dxa"/>
+              <w:right w:w="120" w:type="dxa"/>
+            </w:tcMar>
+          </w:tcPr>
+          <w:p>
+            <w:pPr>
+              <w:snapToGrid w:val="0"/>
+              <w:spacing w:line="276" w:lineRule="auto"/>
+              <w:rPr>
+                <w:rFonts w:ascii="Arvo" w:hAnsi="Arvo"/>
+                <w:sz w:val="20"/>
+                <w:szCs w:val="20"/>
+              </w:rPr>
+            </w:pPr>
+            <w:r>
+              <w:rPr>
+                <w:rFonts w:ascii="Arvo" w:hAnsi="Arvo"/>
+                <w:sz w:val="20"/>
+                <w:szCs w:val="20"/>
+              </w:rPr>
+              <w:t>[CONS_</w:t>
+            </w:r>
+            <w:r>
+              <w:rPr>
+                <w:rFonts w:ascii="Arvo" w:hAnsi="Arvo"/>
+                <w:sz w:val="20"/>
+                <w:szCs w:val="20"/>
+              </w:rPr>
+              <w:t>PRECO</w:t>
+            </w:r>
+            <w:r>
+              <w:rPr>
+                <w:rFonts w:ascii="Arvo" w:hAnsi="Arvo"/>
+                <w:sz w:val="20"/>
+                <w:szCs w:val="20"/>
+              </w:rPr>
+              <w:t>_</w:t>
+            </w:r>
+            <w:r>
+              <w:rPr>
+                <w:rFonts w:ascii="Arvo" w:hAnsi="Arvo"/>
+                <w:sz w:val="20"/>
+                <w:szCs w:val="20"/>
+              </w:rPr>
+              <w:t>GLOBAL</w:t>
+            </w:r>
+            <w:r>
+              <w:rPr>
+                <w:rFonts w:ascii="Arvo" w:hAnsi="Arvo"/>
+                <w:sz w:val="20"/>
+                <w:szCs w:val="20"/>
+              </w:rPr>
+              <w:t>_CAP] horas</w:t>
+            </w:r>
+          </w:p>
+        </w:tc>
+      </w:tr>
+      <w:tr>
+        <w:tc>
+          <w:tcPr>
+            <w:tcW w:w="3256" w:type="dxa"/>
+            <w:tcBorders>
+              <w:top w:val="single" w:sz="4" w:space="0" w:color="1A3557"/>
+              <w:left w:val="single" w:sz="4" w:space="0" w:color="1A3557"/>
+              <w:bottom w:val="single" w:sz="4" w:space="0" w:color="1A3557"/>
+              <w:right w:val="single" w:sz="4" w:space="0" w:color="1A3557"/>
+            </w:tcBorders>
+            <w:shd w:val="clear" w:color="auto" w:fill="FFF9F4"/>
+            <w:tcMar>
+              <w:top w:w="100" w:type="dxa"/>
+              <w:left w:w="120" w:type="dxa"/>
+              <w:bottom w:w="100" w:type="dxa"/>
+              <w:right w:w="120" w:type="dxa"/>
+            </w:tcMar>
+          </w:tcPr>
+          <w:p>
+            <w:pPr>
+              <w:snapToGrid w:val="0"/>
+              <w:spacing w:line="276" w:lineRule="auto"/>
+              <w:rPr>
+                <w:rFonts w:ascii="Arvo" w:hAnsi="Arvo"/>
+                <w:sz w:val="20"/>
+                <w:szCs w:val="20"/>
+              </w:rPr>
+            </w:pPr>
+            <w:r>
+              <w:rPr>
+                <w:rFonts w:ascii="Arvo" w:hAnsi="Arvo"/>
                 <w:b/>
                 <w:bCs/>
                 <w:sz w:val="20"/>
@@ -2060,7 +2430,41 @@
           <w:sz w:val="20"/>
           <w:szCs w:val="20"/>
         </w:rPr>
-        <w:t>Qualquer ampliação, redução ou alteração qualitativa do escopo originalmente pactuado deverá ser previamente comunicada pelo Contratante ao Contratado por escrito. Verificado o impacto sobre o volume de trabalho ou a natureza das entregas, as Partes negociarão, de boa-fé, o reajuste proporcional dos honorários, a ser formalizado por aditamento a esta Proposta. Serviços prestados fora do escopo definido, sem a devida formalização, serão remunerados conforme a tabela horária vigente aplicável à modalidade correspondente.</w:t>
+        <w:t>Qualquer ampliação, redução ou alteração qualitativa do escopo originalmente pactuado deverá ser previamente comunicada pelo Contratante ao Contratado por escrito. Verificado o impacto sobre o volume de trabalho ou a natureza das entregas,</w:t>
+      </w:r>
+      <w:r>
+        <w:rPr>
+          <w:rFonts w:ascii="Arvo" w:hAnsi="Arvo"/>
+          <w:sz w:val="20"/>
+          <w:szCs w:val="20"/>
+        </w:rPr>
+        <w:t xml:space="preserve"> ou em caso de atingido o </w:t>
+      </w:r>
+      <w:r>
+        <w:rPr>
+          <w:rFonts w:ascii="Arvo" w:hAnsi="Arvo"/>
+          <w:i/>
+          <w:iCs/>
+          <w:sz w:val="20"/>
+          <w:szCs w:val="20"/>
+        </w:rPr>
+        <w:t>cap</w:t>
+      </w:r>
+      <w:r>
+        <w:rPr>
+          <w:rFonts w:ascii="Arvo" w:hAnsi="Arvo"/>
+          <w:sz w:val="20"/>
+          <w:szCs w:val="20"/>
+        </w:rPr>
+        <w:t>, se definido acima,</w:t>
+      </w:r>
+      <w:r>
+        <w:rPr>
+          <w:rFonts w:ascii="Arvo" w:hAnsi="Arvo"/>
+          <w:sz w:val="20"/>
+          <w:szCs w:val="20"/>
+        </w:rPr>
+        <w:t xml:space="preserve"> as Partes negociarão, de boa-fé, o reajuste proporcional dos honorários, a ser formalizado por aditamento a esta Proposta. Serviços prestados fora do escopo definido, sem a devida formalização, serão remunerados conforme a tabela horária vigente aplicável à modalidade correspondente.</w:t>
       </w:r>
     </w:p>
     <w:p>
@@ -2124,6 +2528,7 @@
           <w:sz w:val="2"/>
           <w:szCs w:val="2"/>
         </w:rPr>
+        <w:lastRenderedPageBreak/>
         <w:t>{%p if escopo.show_contenciosa %}</w:t>
       </w:r>
     </w:p>
@@ -2202,7 +2607,6 @@
           <w:sz w:val="20"/>
           <w:szCs w:val="20"/>
         </w:rPr>
-        <w:lastRenderedPageBreak/>
         <w:t xml:space="preserve">Valor </w:t>
       </w:r>
       <w:r>
@@ -2383,7 +2787,7 @@
                 <w:sz w:val="20"/>
                 <w:szCs w:val="20"/>
               </w:rPr>
-              <w:t>Fase Processual Coberta</w:t>
+              <w:t>Instâncias de Atuação</w:t>
             </w:r>
           </w:p>
         </w:tc>
@@ -3833,6 +4237,7 @@
                 <w:sz w:val="20"/>
                 <w:szCs w:val="20"/>
               </w:rPr>
+              <w:lastRenderedPageBreak/>
               <w:t>Valor Total</w:t>
             </w:r>
           </w:p>
@@ -3910,7 +4315,6 @@
                 <w:sz w:val="20"/>
                 <w:szCs w:val="20"/>
               </w:rPr>
-              <w:lastRenderedPageBreak/>
               <w:t>Ações e Fases Cobertas</w:t>
             </w:r>
           </w:p>
@@ -4279,7 +4683,57 @@
           <w:sz w:val="20"/>
           <w:szCs w:val="20"/>
         </w:rPr>
-        <w:t xml:space="preserve"> O Contratante reconhece que a realização de leitura de publicações em painéis, sistemas, DJe, e/ou qualquer outro meio de publicação oficial dos órgãos do poder público, poderá acarretar no início da fluência de prazos processuais e/ou administrativos, peremptórios ou não, de modo que o Contratante isenta o Contratado de todo e qualquer prejuízo advindo da leitura de publicações realizadas pelo Contratante, notadamente em razão do escoamento do prazo em data antecipada ao que ocorreria caso o Contratante não procedesse à leitura da publicação.</w:t>
+        <w:t xml:space="preserve"> O Contratante reconhece que a realização de leitura de publicações em painéis, sistemas, </w:t>
+      </w:r>
+      <w:proofErr w:type="spellStart"/>
+      <w:r>
+        <w:rPr>
+          <w:rFonts w:ascii="Arvo" w:hAnsi="Arvo"/>
+          <w:sz w:val="20"/>
+          <w:szCs w:val="20"/>
+        </w:rPr>
+        <w:t>DJe</w:t>
+      </w:r>
+      <w:proofErr w:type="spellEnd"/>
+      <w:r>
+        <w:rPr>
+          <w:rFonts w:ascii="Arvo" w:hAnsi="Arvo"/>
+          <w:sz w:val="20"/>
+          <w:szCs w:val="20"/>
+        </w:rPr>
+        <w:t xml:space="preserve">, </w:t>
+      </w:r>
+      <w:r>
+        <w:rPr>
+          <w:rFonts w:ascii="Arvo" w:hAnsi="Arvo"/>
+          <w:sz w:val="20"/>
+          <w:szCs w:val="20"/>
+        </w:rPr>
+        <w:t xml:space="preserve">aviso de recebimento de correspondências </w:t>
+      </w:r>
+      <w:r>
+        <w:rPr>
+          <w:rFonts w:ascii="Arvo" w:hAnsi="Arvo"/>
+          <w:sz w:val="20"/>
+          <w:szCs w:val="20"/>
+        </w:rPr>
+        <w:t>e/ou qualquer outro meio de publicação oficial dos órgãos do poder público, poderá acarretar no início da fluência de prazos processuais e/ou administrativos, peremptórios ou não, de modo que o Contratante isenta o Contratado de todo e qualquer prejuízo advindo da leitura</w:t>
+      </w:r>
+      <w:r>
+        <w:rPr>
+          <w:rFonts w:ascii="Arvo" w:hAnsi="Arvo"/>
+          <w:sz w:val="20"/>
+          <w:szCs w:val="20"/>
+        </w:rPr>
+        <w:t xml:space="preserve"> ou recebimento</w:t>
+      </w:r>
+      <w:r>
+        <w:rPr>
+          <w:rFonts w:ascii="Arvo" w:hAnsi="Arvo"/>
+          <w:sz w:val="20"/>
+          <w:szCs w:val="20"/>
+        </w:rPr>
+        <w:t xml:space="preserve"> de publicações realizadas pelo Contratante, notadamente em razão do escoamento do prazo em data antecipada ao que ocorreria caso o Contratante não procedesse à leitura da publicação.</w:t>
       </w:r>
     </w:p>
     <w:p>
@@ -6133,7 +6587,16 @@
           <w:sz w:val="20"/>
           <w:szCs w:val="20"/>
         </w:rPr>
-        <w:t xml:space="preserve"> Termos e Condições. Eventuais alterações</w:t>
+        <w:t xml:space="preserve"> Termos e Condições. </w:t>
+      </w:r>
+      <w:r>
+        <w:rPr>
+          <w:rFonts w:ascii="Arvo" w:hAnsi="Arvo"/>
+          <w:sz w:val="20"/>
+          <w:szCs w:val="20"/>
+        </w:rPr>
+        <w:lastRenderedPageBreak/>
+        <w:t>Eventuais alterações</w:t>
       </w:r>
       <w:r>
         <w:rPr>
@@ -6844,6 +7307,7 @@
           <w:sz w:val="20"/>
           <w:szCs w:val="20"/>
         </w:rPr>
+        <w:lastRenderedPageBreak/>
         <w:t xml:space="preserve">As despesas incorridas pelo Contratado </w:t>
       </w:r>
       <w:r>
@@ -7490,6 +7954,7 @@
           <w:sz w:val="20"/>
           <w:szCs w:val="20"/>
         </w:rPr>
+        <w:lastRenderedPageBreak/>
         <w:t xml:space="preserve">Abster-se de atuar em demandas em que se verifique incompatibilidade </w:t>
       </w:r>
       <w:r>
@@ -7543,7 +8008,6 @@
           <w:sz w:val="20"/>
           <w:szCs w:val="20"/>
         </w:rPr>
-        <w:lastRenderedPageBreak/>
         <w:t>Emitir os documentos fiscais correspondentes aos honorários e despesas cobrados, na forma da legislação tributária aplicável.</w:t>
       </w:r>
     </w:p>
@@ -7944,6 +8408,7 @@
           <w:sz w:val="20"/>
           <w:szCs w:val="20"/>
         </w:rPr>
+        <w:lastRenderedPageBreak/>
         <w:t>CONFIDENCIALIDADE</w:t>
       </w:r>
     </w:p>
@@ -7981,16 +8446,7 @@
           <w:sz w:val="20"/>
           <w:szCs w:val="20"/>
         </w:rPr>
-        <w:t xml:space="preserve">Consideram-se Informações Confidenciais todas as informações, dados, documentos, opiniões, pareceres, minutas, estratégias, know-how e demais conteúdos, em qualquer forma ou meio, compartilhados entre as Partes ou por elas elaborados em razão da presente </w:t>
-      </w:r>
-      <w:r>
-        <w:rPr>
-          <w:rFonts w:ascii="Arvo" w:hAnsi="Arvo"/>
-          <w:sz w:val="20"/>
-          <w:szCs w:val="20"/>
-        </w:rPr>
-        <w:lastRenderedPageBreak/>
-        <w:t>contratação, bem como aqueles tratados como tais pela Parte divulgadora ou que, por sua natureza, devam ser assim considerados.</w:t>
+        <w:t>Consideram-se Informações Confidenciais todas as informações, dados, documentos, opiniões, pareceres, minutas, estratégias, know-how e demais conteúdos, em qualquer forma ou meio, compartilhados entre as Partes ou por elas elaborados em razão da presente contratação, bem como aqueles tratados como tais pela Parte divulgadora ou que, por sua natureza, devam ser assim considerados.</w:t>
       </w:r>
     </w:p>
     <w:p>
@@ -8314,7 +8770,16 @@
           <w:sz w:val="20"/>
           <w:szCs w:val="20"/>
         </w:rPr>
-        <w:t xml:space="preserve"> fora das hipóteses legais ou contratuais, a submeter eventuais suboperadores a obrigações equivalentes e a notificar a outra Parte, em até 24 (vinte e quatro) horas da ciência, de qualquer incidente de segurança envolvendo dados pessoais desta contratação.</w:t>
+        <w:t xml:space="preserve"> fora das hipóteses legais ou contratuais, a submeter eventuais suboperadores a obrigações equivalentes e a notificar a outra Parte, em até 24 (vinte e quatro) </w:t>
+      </w:r>
+      <w:r>
+        <w:rPr>
+          <w:rFonts w:ascii="Arvo" w:hAnsi="Arvo"/>
+          <w:sz w:val="20"/>
+          <w:szCs w:val="20"/>
+        </w:rPr>
+        <w:lastRenderedPageBreak/>
+        <w:t>horas da ciência, de qualquer incidente de segurança envolvendo dados pessoais desta contratação.</w:t>
       </w:r>
     </w:p>
     <w:p>
@@ -8351,7 +8816,6 @@
           <w:sz w:val="20"/>
           <w:szCs w:val="20"/>
         </w:rPr>
-        <w:lastRenderedPageBreak/>
         <w:t>As Partes cooperarão de boa-fé para o atendimento das requisições dos titulares de dados e das autoridades competentes, respondendo cada qual, na respectiva medida de responsabilidade, pelos ônus decorrentes do descumprimento desta cláusula.</w:t>
       </w:r>
     </w:p>
@@ -8427,7 +8891,39 @@
           <w:sz w:val="20"/>
           <w:szCs w:val="20"/>
         </w:rPr>
-        <w:t>A responsabilidade do Contratado limita-se aos danos diretos e efetivamente comprovados decorrentes de culpa ou dolo na execução dos serviços, excluídos, expressamente, os danos indiretos, lucros cessantes, perda de chance, danos reflexos e demais danos consequenciais, salvo nas hipóteses em que a lei vedar a limitação de responsabilidade.</w:t>
+        <w:t>A responsabilidade do Contratado</w:t>
+      </w:r>
+      <w:r>
+        <w:rPr>
+          <w:rFonts w:ascii="Arvo" w:hAnsi="Arvo"/>
+          <w:sz w:val="20"/>
+          <w:szCs w:val="20"/>
+        </w:rPr>
+        <w:t>, em qualquer hipótese, fica limitada ao valor total efetivamente pago pelo Contratante</w:t>
+      </w:r>
+      <w:r>
+        <w:rPr>
+          <w:rFonts w:ascii="Arvo" w:hAnsi="Arvo"/>
+          <w:sz w:val="20"/>
+          <w:szCs w:val="20"/>
+        </w:rPr>
+        <w:t xml:space="preserve"> ao Contratado</w:t>
+      </w:r>
+      <w:r>
+        <w:rPr>
+          <w:rFonts w:ascii="Arvo" w:hAnsi="Arvo"/>
+          <w:sz w:val="20"/>
+          <w:szCs w:val="20"/>
+        </w:rPr>
+        <w:t xml:space="preserve"> nos 12 (doze) meses anteriores, respondendo exclusivamente por danos diretos e efetivamente comprovados decorrentes de culpa ou dolo na execução dos serviços. Ficam expressamente excluídos quaisquer danos indiretos, lucros cessantes, perda de chance, danos reflexos e</w:t>
+      </w:r>
+      <w:r>
+        <w:rPr>
+          <w:rFonts w:ascii="Arvo" w:hAnsi="Arvo"/>
+          <w:sz w:val="20"/>
+          <w:szCs w:val="20"/>
+        </w:rPr>
+        <w:t xml:space="preserve"> danos consequenciais, salvo nas hipóteses em que a lei vedar a limitação de responsabilidade.</w:t>
       </w:r>
     </w:p>
     <w:p>
@@ -8808,6 +9304,7 @@
           <w:sz w:val="20"/>
           <w:szCs w:val="20"/>
         </w:rPr>
+        <w:lastRenderedPageBreak/>
         <w:t xml:space="preserve">A declarada nulidade, invalidade ou ineficácia de qualquer disposição não afetará as demais, permanecendo </w:t>
       </w:r>
       <w:r>
@@ -8861,7 +9358,6 @@
           <w:sz w:val="20"/>
           <w:szCs w:val="20"/>
         </w:rPr>
-        <w:lastRenderedPageBreak/>
         <w:t>As comunicações relativas a est</w:t>
       </w:r>
       <w:r>
@@ -9531,6 +10027,7 @@
                 <w:sz w:val="20"/>
                 <w:szCs w:val="20"/>
               </w:rPr>
+              <w:lastRenderedPageBreak/>
               <w:t>____________________________________________</w:t>
             </w:r>
           </w:p>
@@ -9587,9 +10084,12 @@
       </w:pPr>
     </w:p>
     <w:sectPr>
-      <w:headerReference w:type="default" r:id="rId10"/>
-      <w:footerReference w:type="even" r:id="rId11"/>
-      <w:footerReference w:type="default" r:id="rId12"/>
+      <w:headerReference w:type="even" r:id="rId10"/>
+      <w:headerReference w:type="default" r:id="rId11"/>
+      <w:footerReference w:type="even" r:id="rId12"/>
+      <w:footerReference w:type="default" r:id="rId13"/>
+      <w:headerReference w:type="first" r:id="rId14"/>
+      <w:footerReference w:type="first" r:id="rId15"/>
       <w:pgSz w:w="11906" w:h="16838"/>
       <w:pgMar w:top="2268" w:right="1134" w:bottom="2268" w:left="1134" w:header="720" w:footer="720" w:gutter="0"/>
       <w:cols w:space="720"/>
@@ -9745,6 +10245,16 @@
 </w:ftr>
 </file>
 
+<file path=word/footer3.xml><?xml version="1.0" encoding="utf-8"?>
+<w:ftr xmlns:wpc="http://schemas.microsoft.com/office/word/2010/wordprocessingCanvas" xmlns:cx="http://schemas.microsoft.com/office/drawing/2014/chartex" xmlns:cx1="http://schemas.microsoft.com/office/drawing/2015/9/8/chartex" xmlns:cx2="http://schemas.microsoft.com/office/drawing/2015/10/21/chartex" xmlns:cx3="http://schemas.microsoft.com/office/drawing/2016/5/9/chartex" xmlns:cx4="http://schemas.microsoft.com/office/drawing/2016/5/10/chartex" xmlns:cx5="http://schemas.microsoft.com/office/drawing/2016/5/11/chartex" xmlns:cx6="http://schemas.microsoft.com/office/drawing/2016/5/12/chartex" xmlns:cx7="http://schemas.microsoft.com/office/drawing/2016/5/13/chartex" xmlns:cx8="http://schemas.microsoft.com/office/drawing/2016/5/14/chartex" xmlns:mc="http://schemas.openxmlformats.org/markup-compatibility/2006" xmlns:aink="http://schemas.microsoft.com/office/drawing/2016/ink" xmlns:am3d="http://schemas.microsoft.com/office/drawing/2017/model3d" xmlns:o="urn:schemas-microsoft-com:office:office" xmlns:oel="http://schemas.microsoft.com/office/2019/extlst" xmlns:r="http://schemas.openxmlformats.org/officeDocument/2006/relationships" xmlns:m="http://schemas.openxmlformats.org/officeDocument/2006/math" xmlns:v="urn:schemas-microsoft-com:vml" xmlns:wp14="http://schemas.microsoft.com/office/word/2010/wordprocessingDrawing" xmlns:wp="http://schemas.openxmlformats.org/drawingml/2006/wordprocessingDrawing" xmlns:w10="urn:schemas-microsoft-com:office:word" xmlns:w="http://schemas.openxmlformats.org/wordprocessingml/2006/main" xmlns:w14="http://schemas.microsoft.com/office/word/2010/wordml" xmlns:w15="http://schemas.microsoft.com/office/word/2012/wordml" xmlns:w16cex="http://schemas.microsoft.com/office/word/2018/wordml/cex" xmlns:w16cid="http://schemas.microsoft.com/office/word/2016/wordml/cid" xmlns:w16="http://schemas.microsoft.com/office/word/2018/wordml" xmlns:w16du="http://schemas.microsoft.com/office/word/2023/wordml/word16du" xmlns:w16sdtdh="http://schemas.microsoft.com/office/word/2020/wordml/sdtdatahash" xmlns:w16sdtfl="http://schemas.microsoft.com/office/word/2024/wordml/sdtformatlock" xmlns:w16se="http://schemas.microsoft.com/office/word/2015/wordml/symex" xmlns:wpg="http://schemas.microsoft.com/office/word/2010/wordprocessingGroup" xmlns:wpi="http://schemas.microsoft.com/office/word/2010/wordprocessingInk" xmlns:wne="http://schemas.microsoft.com/office/word/2006/wordml" xmlns:wps="http://schemas.microsoft.com/office/word/2010/wordprocessingShape" mc:Ignorable="w14 w15 w16se w16cid w16 w16cex w16sdtdh w16sdtfl w16du wp14">
+  <w:p>
+    <w:pPr>
+      <w:pStyle w:val="Rodap"/>
+    </w:pPr>
+  </w:p>
+</w:ftr>
+</file>
+
 <file path=word/footnotes.xml><?xml version="1.0" encoding="utf-8"?>
 <w:footnotes xmlns:wpc="http://schemas.microsoft.com/office/word/2010/wordprocessingCanvas" xmlns:cx="http://schemas.microsoft.com/office/drawing/2014/chartex" xmlns:cx1="http://schemas.microsoft.com/office/drawing/2015/9/8/chartex" xmlns:cx2="http://schemas.microsoft.com/office/drawing/2015/10/21/chartex" xmlns:cx3="http://schemas.microsoft.com/office/drawing/2016/5/9/chartex" xmlns:cx4="http://schemas.microsoft.com/office/drawing/2016/5/10/chartex" xmlns:cx5="http://schemas.microsoft.com/office/drawing/2016/5/11/chartex" xmlns:cx6="http://schemas.microsoft.com/office/drawing/2016/5/12/chartex" xmlns:cx7="http://schemas.microsoft.com/office/drawing/2016/5/13/chartex" xmlns:cx8="http://schemas.microsoft.com/office/drawing/2016/5/14/chartex" xmlns:mc="http://schemas.openxmlformats.org/markup-compatibility/2006" xmlns:aink="http://schemas.microsoft.com/office/drawing/2016/ink" xmlns:am3d="http://schemas.microsoft.com/office/drawing/2017/model3d" xmlns:o="urn:schemas-microsoft-com:office:office" xmlns:oel="http://schemas.microsoft.com/office/2019/extlst" xmlns:r="http://schemas.openxmlformats.org/officeDocument/2006/relationships" xmlns:m="http://schemas.openxmlformats.org/officeDocument/2006/math" xmlns:v="urn:schemas-microsoft-com:vml" xmlns:wp14="http://schemas.microsoft.com/office/word/2010/wordprocessingDrawing" xmlns:wp="http://schemas.openxmlformats.org/drawingml/2006/wordprocessingDrawing" xmlns:w10="urn:schemas-microsoft-com:office:word" xmlns:w="http://schemas.openxmlformats.org/wordprocessingml/2006/main" xmlns:w14="http://schemas.microsoft.com/office/word/2010/wordml" xmlns:w15="http://schemas.microsoft.com/office/word/2012/wordml" xmlns:w16cex="http://schemas.microsoft.com/office/word/2018/wordml/cex" xmlns:w16cid="http://schemas.microsoft.com/office/word/2016/wordml/cid" xmlns:w16="http://schemas.microsoft.com/office/word/2018/wordml" xmlns:w16du="http://schemas.microsoft.com/office/word/2023/wordml/word16du" xmlns:w16sdtdh="http://schemas.microsoft.com/office/word/2020/wordml/sdtdatahash" xmlns:w16sdtfl="http://schemas.microsoft.com/office/word/2024/wordml/sdtformatlock" xmlns:w16se="http://schemas.microsoft.com/office/word/2015/wordml/symex" xmlns:wpg="http://schemas.microsoft.com/office/word/2010/wordprocessingGroup" xmlns:wpi="http://schemas.microsoft.com/office/word/2010/wordprocessingInk" xmlns:wne="http://schemas.microsoft.com/office/word/2006/wordml" xmlns:wps="http://schemas.microsoft.com/office/word/2010/wordprocessingShape" mc:Ignorable="w14 w15 w16se w16cid w16 w16cex w16sdtdh w16sdtfl w16du wp14">
   <w:footnote w:type="separator" w:id="-1">
@@ -9765,6 +10275,16 @@
 </file>
 
 <file path=word/header1.xml><?xml version="1.0" encoding="utf-8"?>
+<w:hdr xmlns:wpc="http://schemas.microsoft.com/office/word/2010/wordprocessingCanvas" xmlns:cx="http://schemas.microsoft.com/office/drawing/2014/chartex" xmlns:cx1="http://schemas.microsoft.com/office/drawing/2015/9/8/chartex" xmlns:cx2="http://schemas.microsoft.com/office/drawing/2015/10/21/chartex" xmlns:cx3="http://schemas.microsoft.com/office/drawing/2016/5/9/chartex" xmlns:cx4="http://schemas.microsoft.com/office/drawing/2016/5/10/chartex" xmlns:cx5="http://schemas.microsoft.com/office/drawing/2016/5/11/chartex" xmlns:cx6="http://schemas.microsoft.com/office/drawing/2016/5/12/chartex" xmlns:cx7="http://schemas.microsoft.com/office/drawing/2016/5/13/chartex" xmlns:cx8="http://schemas.microsoft.com/office/drawing/2016/5/14/chartex" xmlns:mc="http://schemas.openxmlformats.org/markup-compatibility/2006" xmlns:aink="http://schemas.microsoft.com/office/drawing/2016/ink" xmlns:am3d="http://schemas.microsoft.com/office/drawing/2017/model3d" xmlns:o="urn:schemas-microsoft-com:office:office" xmlns:oel="http://schemas.microsoft.com/office/2019/extlst" xmlns:r="http://schemas.openxmlformats.org/officeDocument/2006/relationships" xmlns:m="http://schemas.openxmlformats.org/officeDocument/2006/math" xmlns:v="urn:schemas-microsoft-com:vml" xmlns:wp14="http://schemas.microsoft.com/office/word/2010/wordprocessingDrawing" xmlns:wp="http://schemas.openxmlformats.org/drawingml/2006/wordprocessingDrawing" xmlns:w10="urn:schemas-microsoft-com:office:word" xmlns:w="http://schemas.openxmlformats.org/wordprocessingml/2006/main" xmlns:w14="http://schemas.microsoft.com/office/word/2010/wordml" xmlns:w15="http://schemas.microsoft.com/office/word/2012/wordml" xmlns:w16cex="http://schemas.microsoft.com/office/word/2018/wordml/cex" xmlns:w16cid="http://schemas.microsoft.com/office/word/2016/wordml/cid" xmlns:w16="http://schemas.microsoft.com/office/word/2018/wordml" xmlns:w16du="http://schemas.microsoft.com/office/word/2023/wordml/word16du" xmlns:w16sdtdh="http://schemas.microsoft.com/office/word/2020/wordml/sdtdatahash" xmlns:w16sdtfl="http://schemas.microsoft.com/office/word/2024/wordml/sdtformatlock" xmlns:w16se="http://schemas.microsoft.com/office/word/2015/wordml/symex" xmlns:wpg="http://schemas.microsoft.com/office/word/2010/wordprocessingGroup" xmlns:wpi="http://schemas.microsoft.com/office/word/2010/wordprocessingInk" xmlns:wne="http://schemas.microsoft.com/office/word/2006/wordml" xmlns:wps="http://schemas.microsoft.com/office/word/2010/wordprocessingShape" mc:Ignorable="w14 w15 w16se w16cid w16 w16cex w16sdtdh w16sdtfl w16du wp14">
+  <w:p>
+    <w:pPr>
+      <w:pStyle w:val="Cabealho"/>
+    </w:pPr>
+  </w:p>
+</w:hdr>
+</file>
+
+<file path=word/header2.xml><?xml version="1.0" encoding="utf-8"?>
 <w:hdr xmlns:wpc="http://schemas.microsoft.com/office/word/2010/wordprocessingCanvas" xmlns:cx="http://schemas.microsoft.com/office/drawing/2014/chartex" xmlns:cx1="http://schemas.microsoft.com/office/drawing/2015/9/8/chartex" xmlns:cx2="http://schemas.microsoft.com/office/drawing/2015/10/21/chartex" xmlns:cx3="http://schemas.microsoft.com/office/drawing/2016/5/9/chartex" xmlns:cx4="http://schemas.microsoft.com/office/drawing/2016/5/10/chartex" xmlns:cx5="http://schemas.microsoft.com/office/drawing/2016/5/11/chartex" xmlns:cx6="http://schemas.microsoft.com/office/drawing/2016/5/12/chartex" xmlns:cx7="http://schemas.microsoft.com/office/drawing/2016/5/13/chartex" xmlns:cx8="http://schemas.microsoft.com/office/drawing/2016/5/14/chartex" xmlns:mc="http://schemas.openxmlformats.org/markup-compatibility/2006" xmlns:aink="http://schemas.microsoft.com/office/drawing/2016/ink" xmlns:am3d="http://schemas.microsoft.com/office/drawing/2017/model3d" xmlns:o="urn:schemas-microsoft-com:office:office" xmlns:oel="http://schemas.microsoft.com/office/2019/extlst" xmlns:r="http://schemas.openxmlformats.org/officeDocument/2006/relationships" xmlns:m="http://schemas.openxmlformats.org/officeDocument/2006/math" xmlns:v="urn:schemas-microsoft-com:vml" xmlns:wp14="http://schemas.microsoft.com/office/word/2010/wordprocessingDrawing" xmlns:wp="http://schemas.openxmlformats.org/drawingml/2006/wordprocessingDrawing" xmlns:w10="urn:schemas-microsoft-com:office:word" xmlns:w="http://schemas.openxmlformats.org/wordprocessingml/2006/main" xmlns:w14="http://schemas.microsoft.com/office/word/2010/wordml" xmlns:w15="http://schemas.microsoft.com/office/word/2012/wordml" xmlns:w16cex="http://schemas.microsoft.com/office/word/2018/wordml/cex" xmlns:w16cid="http://schemas.microsoft.com/office/word/2016/wordml/cid" xmlns:w16="http://schemas.microsoft.com/office/word/2018/wordml" xmlns:w16du="http://schemas.microsoft.com/office/word/2023/wordml/word16du" xmlns:w16sdtdh="http://schemas.microsoft.com/office/word/2020/wordml/sdtdatahash" xmlns:w16sdtfl="http://schemas.microsoft.com/office/word/2024/wordml/sdtformatlock" xmlns:w16se="http://schemas.microsoft.com/office/word/2015/wordml/symex" xmlns:wpg="http://schemas.microsoft.com/office/word/2010/wordprocessingGroup" xmlns:wpi="http://schemas.microsoft.com/office/word/2010/wordprocessingInk" xmlns:wne="http://schemas.microsoft.com/office/word/2006/wordml" xmlns:wps="http://schemas.microsoft.com/office/word/2010/wordprocessingShape" mc:Ignorable="w14 w15 w16se w16cid w16 w16cex w16sdtdh w16sdtfl w16du wp14">
   <w:p>
     <w:r>
@@ -9832,6 +10352,16 @@
 </w:hdr>
 </file>
 
+<file path=word/header3.xml><?xml version="1.0" encoding="utf-8"?>
+<w:hdr xmlns:wpc="http://schemas.microsoft.com/office/word/2010/wordprocessingCanvas" xmlns:cx="http://schemas.microsoft.com/office/drawing/2014/chartex" xmlns:cx1="http://schemas.microsoft.com/office/drawing/2015/9/8/chartex" xmlns:cx2="http://schemas.microsoft.com/office/drawing/2015/10/21/chartex" xmlns:cx3="http://schemas.microsoft.com/office/drawing/2016/5/9/chartex" xmlns:cx4="http://schemas.microsoft.com/office/drawing/2016/5/10/chartex" xmlns:cx5="http://schemas.microsoft.com/office/drawing/2016/5/11/chartex" xmlns:cx6="http://schemas.microsoft.com/office/drawing/2016/5/12/chartex" xmlns:cx7="http://schemas.microsoft.com/office/drawing/2016/5/13/chartex" xmlns:cx8="http://schemas.microsoft.com/office/drawing/2016/5/14/chartex" xmlns:mc="http://schemas.openxmlformats.org/markup-compatibility/2006" xmlns:aink="http://schemas.microsoft.com/office/drawing/2016/ink" xmlns:am3d="http://schemas.microsoft.com/office/drawing/2017/model3d" xmlns:o="urn:schemas-microsoft-com:office:office" xmlns:oel="http://schemas.microsoft.com/office/2019/extlst" xmlns:r="http://schemas.openxmlformats.org/officeDocument/2006/relationships" xmlns:m="http://schemas.openxmlformats.org/officeDocument/2006/math" xmlns:v="urn:schemas-microsoft-com:vml" xmlns:wp14="http://schemas.microsoft.com/office/word/2010/wordprocessingDrawing" xmlns:wp="http://schemas.openxmlformats.org/drawingml/2006/wordprocessingDrawing" xmlns:w10="urn:schemas-microsoft-com:office:word" xmlns:w="http://schemas.openxmlformats.org/wordprocessingml/2006/main" xmlns:w14="http://schemas.microsoft.com/office/word/2010/wordml" xmlns:w15="http://schemas.microsoft.com/office/word/2012/wordml" xmlns:w16cex="http://schemas.microsoft.com/office/word/2018/wordml/cex" xmlns:w16cid="http://schemas.microsoft.com/office/word/2016/wordml/cid" xmlns:w16="http://schemas.microsoft.com/office/word/2018/wordml" xmlns:w16du="http://schemas.microsoft.com/office/word/2023/wordml/word16du" xmlns:w16sdtdh="http://schemas.microsoft.com/office/word/2020/wordml/sdtdatahash" xmlns:w16sdtfl="http://schemas.microsoft.com/office/word/2024/wordml/sdtformatlock" xmlns:w16se="http://schemas.microsoft.com/office/word/2015/wordml/symex" xmlns:wpg="http://schemas.microsoft.com/office/word/2010/wordprocessingGroup" xmlns:wpi="http://schemas.microsoft.com/office/word/2010/wordprocessingInk" xmlns:wne="http://schemas.microsoft.com/office/word/2006/wordml" xmlns:wps="http://schemas.microsoft.com/office/word/2010/wordprocessingShape" mc:Ignorable="w14 w15 w16se w16cid w16 w16cex w16sdtdh w16sdtfl w16du wp14">
+  <w:p>
+    <w:pPr>
+      <w:pStyle w:val="Cabealho"/>
+    </w:pPr>
+  </w:p>
+</w:hdr>
+</file>
+
 <file path=word/numbering.xml><?xml version="1.0" encoding="utf-8"?>
 <w:numbering xmlns:wpc="http://schemas.microsoft.com/office/word/2010/wordprocessingCanvas" xmlns:cx="http://schemas.microsoft.com/office/drawing/2014/chartex" xmlns:cx1="http://schemas.microsoft.com/office/drawing/2015/9/8/chartex" xmlns:cx2="http://schemas.microsoft.com/office/drawing/2015/10/21/chartex" xmlns:cx3="http://schemas.microsoft.com/office/drawing/2016/5/9/chartex" xmlns:cx4="http://schemas.microsoft.com/office/drawing/2016/5/10/chartex" xmlns:cx5="http://schemas.microsoft.com/office/drawing/2016/5/11/chartex" xmlns:cx6="http://schemas.microsoft.com/office/drawing/2016/5/12/chartex" xmlns:cx7="http://schemas.microsoft.com/office/drawing/2016/5/13/chartex" xmlns:cx8="http://schemas.microsoft.com/office/drawing/2016/5/14/chartex" xmlns:mc="http://schemas.openxmlformats.org/markup-compatibility/2006" xmlns:aink="http://schemas.microsoft.com/office/drawing/2016/ink" xmlns:am3d="http://schemas.microsoft.com/office/drawing/2017/model3d" xmlns:o="urn:schemas-microsoft-com:office:office" xmlns:oel="http://schemas.microsoft.com/office/2019/extlst" xmlns:r="http://schemas.openxmlformats.org/officeDocument/2006/relationships" xmlns:m="http://schemas.openxmlformats.org/officeDocument/2006/math" xmlns:v="urn:schemas-microsoft-com:vml" xmlns:wp14="http://schemas.microsoft.com/office/word/2010/wordprocessingDrawing" xmlns:wp="http://schemas.openxmlformats.org/drawingml/2006/wordprocessingDrawing" xmlns:w10="urn:schemas-microsoft-com:office:word" xmlns:w="http://schemas.openxmlformats.org/wordprocessingml/2006/main" xmlns:w14="http://schemas.microsoft.com/office/word/2010/wordml" xmlns:w15="http://schemas.microsoft.com/office/word/2012/wordml" xmlns:w16cex="http://schemas.microsoft.com/office/word/2018/wordml/cex" xmlns:w16cid="http://schemas.microsoft.com/office/word/2016/wordml/cid" xmlns:w16="http://schemas.microsoft.com/office/word/2018/wordml" xmlns:w16du="http://schemas.microsoft.com/office/word/2023/wordml/word16du" xmlns:w16sdtdh="http://schemas.microsoft.com/office/word/2020/wordml/sdtdatahash" xmlns:w16sdtfl="http://schemas.microsoft.com/office/word/2024/wordml/sdtformatlock" xmlns:w16se="http://schemas.microsoft.com/office/word/2015/wordml/symex" xmlns:wpg="http://schemas.microsoft.com/office/word/2010/wordprocessingGroup" xmlns:wpi="http://schemas.microsoft.com/office/word/2010/wordprocessingInk" xmlns:wne="http://schemas.microsoft.com/office/word/2006/wordml" xmlns:wps="http://schemas.microsoft.com/office/word/2010/wordprocessingShape" mc:Ignorable="w14 w15 w16se w16cid w16 w16cex w16sdtdh w16sdtfl w16du wp14">
   <w:abstractNum w:abstractNumId="0" w15:restartNumberingAfterBreak="0">
@@ -10059,7 +10589,7 @@
   <w:docDefaults>
     <w:rPrDefault>
       <w:rPr>
-        <w:rFonts w:ascii="Arvo" w:eastAsia="Arvo" w:hAnsi="Arvo" w:cs="Arvo"/>
+        <w:rFonts w:ascii="Arial Narrow" w:eastAsia="Arial Narrow" w:hAnsi="Arial Narrow" w:cs="Arial Narrow"/>
         <w:sz w:val="22"/>
         <w:szCs w:val="22"/>
         <w:lang w:val="pt-BR" w:eastAsia="pt-BR" w:bidi="ar-SA"/>

</xml_diff>

<commit_message>
Toggle com/sem cap no Preço Global consultivo (v2.0.16)
O usuário pode ativar um cap de horas que aparece condicionalmente
na tabela do documento. Inclui marcadores [SE_LINHA_CONS_PRECO_GLOBAL_CAP]
e [CONS_PRECO_GLOBAL_CAP] no template, novos campos no schema e UI com toggle.

https://claude.ai/code/session_01QYVgUedAdGPCf2tFmVT5S5

Co-authored-by: Claude <noreply@anthropic.com>
</commit_message>
<xml_diff>
--- a/resources/templates/PMRA_Template_Jinja.docx
+++ b/resources/templates/PMRA_Template_Jinja.docx
@@ -137,6 +137,38 @@
           <w:szCs w:val="20"/>
         </w:rPr>
       </w:pPr>
+      <w:r>
+        <w:rPr>
+          <w:rFonts w:ascii="Arvo" w:hAnsi="Arvo"/>
+          <w:sz w:val="20"/>
+          <w:szCs w:val="20"/>
+        </w:rPr>
+        <w:t>{% if contratante.pf %}CPF{% endif %}{% if contratante.pj %}</w:t>
+      </w:r>
+      <w:r>
+        <w:rPr>
+          <w:rFonts w:ascii="Arvo" w:hAnsi="Arvo"/>
+          <w:sz w:val="20"/>
+          <w:szCs w:val="20"/>
+        </w:rPr>
+        <w:t>CNPJ</w:t>
+      </w:r>
+      <w:r>
+        <w:rPr>
+          <w:rFonts w:ascii="Arvo" w:hAnsi="Arvo"/>
+          <w:sz w:val="20"/>
+          <w:szCs w:val="20"/>
+        </w:rPr>
+        <w:t>{% endif %}</w:t>
+      </w:r>
+      <w:r>
+        <w:rPr>
+          <w:rFonts w:ascii="Arvo" w:hAnsi="Arvo"/>
+          <w:sz w:val="20"/>
+          <w:szCs w:val="20"/>
+        </w:rPr>
+        <w:t xml:space="preserve">: </w:t>
+      </w:r>
       <w:r>
         <w:rPr>
           <w:rFonts w:ascii="Arvo" w:hAnsi="Arvo"/>
@@ -915,6 +947,7 @@
                 <w:sz w:val="20"/>
                 <w:szCs w:val="20"/>
               </w:rPr>
+              <w:lastRenderedPageBreak/>
               <w:t>Categoria</w:t>
             </w:r>
           </w:p>
@@ -993,7 +1026,6 @@
                 <w:sz w:val="20"/>
                 <w:szCs w:val="20"/>
               </w:rPr>
-              <w:lastRenderedPageBreak/>
               <w:t>{%tr for s in consultiva.tabela_senioridade %}</w:t>
             </w:r>
           </w:p>
@@ -1798,7 +1830,23 @@
           <w:sz w:val="20"/>
           <w:szCs w:val="20"/>
         </w:rPr>
-        <w:t>, distribuído conforme o cronograma de pagamento abaixo.</w:t>
+        <w:t xml:space="preserve">, </w:t>
+      </w:r>
+      <w:r>
+        <w:rPr>
+          <w:rFonts w:ascii="Arvo" w:hAnsi="Arvo"/>
+          <w:sz w:val="20"/>
+          <w:szCs w:val="20"/>
+        </w:rPr>
+        <w:t>conforme abaixo</w:t>
+      </w:r>
+      <w:r>
+        <w:rPr>
+          <w:rFonts w:ascii="Arvo" w:hAnsi="Arvo"/>
+          <w:sz w:val="20"/>
+          <w:szCs w:val="20"/>
+        </w:rPr>
+        <w:t>.</w:t>
       </w:r>
     </w:p>
     <w:p>
@@ -1942,6 +1990,328 @@
             <w:r>
               <w:rPr>
                 <w:rFonts w:ascii="Arvo" w:hAnsi="Arvo"/>
+                <w:sz w:val="20"/>
+                <w:szCs w:val="20"/>
+              </w:rPr>
+              <w:t>{%tr if consultiva.show_valor_projeto_cap %}</w:t>
+            </w:r>
+          </w:p>
+        </w:tc>
+        <w:tc>
+          <w:tcPr>
+            <w:tcW w:w="6378" w:type="dxa"/>
+            <w:tcBorders>
+              <w:top w:val="single" w:sz="4" w:space="0" w:color="1A3557"/>
+              <w:left w:val="single" w:sz="4" w:space="0" w:color="1A3557"/>
+              <w:bottom w:val="single" w:sz="4" w:space="0" w:color="1A3557"/>
+              <w:right w:val="single" w:sz="4" w:space="0" w:color="1A3557"/>
+            </w:tcBorders>
+            <w:tcMar>
+              <w:top w:w="100" w:type="dxa"/>
+              <w:left w:w="120" w:type="dxa"/>
+              <w:bottom w:w="100" w:type="dxa"/>
+              <w:right w:w="120" w:type="dxa"/>
+            </w:tcMar>
+          </w:tcPr>
+          <w:p>
+            <w:pPr>
+              <w:snapToGrid w:val="0"/>
+              <w:spacing w:line="276" w:lineRule="auto"/>
+              <w:rPr>
+                <w:rFonts w:ascii="Arvo" w:hAnsi="Arvo"/>
+                <w:sz w:val="20"/>
+                <w:szCs w:val="20"/>
+              </w:rPr>
+            </w:pPr>
+          </w:p>
+        </w:tc>
+      </w:tr>
+      <w:tr>
+        <w:tc>
+          <w:tcPr>
+            <w:tcW w:w="3256" w:type="dxa"/>
+            <w:tcBorders>
+              <w:top w:val="single" w:sz="4" w:space="0" w:color="1A3557"/>
+              <w:left w:val="single" w:sz="4" w:space="0" w:color="1A3557"/>
+              <w:bottom w:val="single" w:sz="4" w:space="0" w:color="1A3557"/>
+              <w:right w:val="single" w:sz="4" w:space="0" w:color="1A3557"/>
+            </w:tcBorders>
+            <w:shd w:val="clear" w:color="auto" w:fill="FFF9F4"/>
+            <w:tcMar>
+              <w:top w:w="100" w:type="dxa"/>
+              <w:left w:w="120" w:type="dxa"/>
+              <w:bottom w:w="100" w:type="dxa"/>
+              <w:right w:w="120" w:type="dxa"/>
+            </w:tcMar>
+          </w:tcPr>
+          <w:p>
+            <w:pPr>
+              <w:snapToGrid w:val="0"/>
+              <w:spacing w:line="276" w:lineRule="auto"/>
+              <w:rPr>
+                <w:rFonts w:ascii="Arvo" w:hAnsi="Arvo"/>
+                <w:sz w:val="20"/>
+                <w:szCs w:val="20"/>
+              </w:rPr>
+            </w:pPr>
+            <w:r>
+              <w:rPr>
+                <w:rFonts w:ascii="Arvo" w:hAnsi="Arvo"/>
+                <w:b/>
+                <w:bCs/>
+                <w:sz w:val="20"/>
+                <w:szCs w:val="20"/>
+              </w:rPr>
+              <w:t>Cap de Horas</w:t>
+            </w:r>
+          </w:p>
+        </w:tc>
+        <w:tc>
+          <w:tcPr>
+            <w:tcW w:w="6378" w:type="dxa"/>
+            <w:tcBorders>
+              <w:top w:val="single" w:sz="4" w:space="0" w:color="1A3557"/>
+              <w:left w:val="single" w:sz="4" w:space="0" w:color="1A3557"/>
+              <w:bottom w:val="single" w:sz="4" w:space="0" w:color="1A3557"/>
+              <w:right w:val="single" w:sz="4" w:space="0" w:color="1A3557"/>
+            </w:tcBorders>
+            <w:tcMar>
+              <w:top w:w="100" w:type="dxa"/>
+              <w:left w:w="120" w:type="dxa"/>
+              <w:bottom w:w="100" w:type="dxa"/>
+              <w:right w:w="120" w:type="dxa"/>
+            </w:tcMar>
+          </w:tcPr>
+          <w:p>
+            <w:pPr>
+              <w:snapToGrid w:val="0"/>
+              <w:spacing w:line="276" w:lineRule="auto"/>
+              <w:rPr>
+                <w:rFonts w:ascii="Arvo" w:hAnsi="Arvo"/>
+                <w:sz w:val="20"/>
+                <w:szCs w:val="20"/>
+              </w:rPr>
+            </w:pPr>
+            <w:r>
+              <w:rPr>
+                <w:rFonts w:ascii="Arvo" w:hAnsi="Arvo"/>
+                <w:sz w:val="20"/>
+                <w:szCs w:val="20"/>
+              </w:rPr>
+              <w:t xml:space="preserve">{{consultiva.valor_projeto_cap}} horas</w:t>
+            </w:r>
+          </w:p>
+        </w:tc>
+      </w:tr>
+      <w:tr>
+        <w:tc>
+          <w:tcPr>
+            <w:tcW w:w="3256" w:type="dxa"/>
+            <w:tcBorders>
+              <w:top w:val="single" w:sz="4" w:space="0" w:color="1A3557"/>
+              <w:left w:val="single" w:sz="4" w:space="0" w:color="1A3557"/>
+              <w:bottom w:val="single" w:sz="4" w:space="0" w:color="1A3557"/>
+              <w:right w:val="single" w:sz="4" w:space="0" w:color="1A3557"/>
+            </w:tcBorders>
+            <w:shd w:val="clear" w:color="auto" w:fill="FFF9F4"/>
+            <w:tcMar>
+              <w:top w:w="100" w:type="dxa"/>
+              <w:left w:w="120" w:type="dxa"/>
+              <w:bottom w:w="100" w:type="dxa"/>
+              <w:right w:w="120" w:type="dxa"/>
+            </w:tcMar>
+          </w:tcPr>
+          <w:p>
+            <w:pPr>
+              <w:snapToGrid w:val="0"/>
+              <w:spacing w:line="276" w:lineRule="auto"/>
+              <w:rPr>
+                <w:rFonts w:ascii="Arvo" w:hAnsi="Arvo"/>
+                <w:sz w:val="20"/>
+                <w:szCs w:val="20"/>
+              </w:rPr>
+            </w:pPr>
+            <w:r>
+              <w:rPr>
+                <w:rFonts w:ascii="Arvo" w:hAnsi="Arvo"/>
+                <w:sz w:val="20"/>
+                <w:szCs w:val="20"/>
+              </w:rPr>
+              <w:t>{%tr endif %}</w:t>
+            </w:r>
+          </w:p>
+        </w:tc>
+        <w:tc>
+          <w:tcPr>
+            <w:tcW w:w="6378" w:type="dxa"/>
+            <w:tcBorders>
+              <w:top w:val="single" w:sz="4" w:space="0" w:color="1A3557"/>
+              <w:left w:val="single" w:sz="4" w:space="0" w:color="1A3557"/>
+              <w:bottom w:val="single" w:sz="4" w:space="0" w:color="1A3557"/>
+              <w:right w:val="single" w:sz="4" w:space="0" w:color="1A3557"/>
+            </w:tcBorders>
+            <w:tcMar>
+              <w:top w:w="100" w:type="dxa"/>
+              <w:left w:w="120" w:type="dxa"/>
+              <w:bottom w:w="100" w:type="dxa"/>
+              <w:right w:w="120" w:type="dxa"/>
+            </w:tcMar>
+          </w:tcPr>
+          <w:p>
+            <w:pPr>
+              <w:snapToGrid w:val="0"/>
+              <w:spacing w:line="276" w:lineRule="auto"/>
+              <w:rPr>
+                <w:rFonts w:ascii="Arvo" w:hAnsi="Arvo"/>
+                <w:sz w:val="20"/>
+                <w:szCs w:val="20"/>
+              </w:rPr>
+            </w:pPr>
+          </w:p>
+        </w:tc>
+      </w:tr>
+      <w:tr>
+        <w:tc>
+          <w:tcPr>
+            <w:tcW w:w="3256" w:type="dxa"/>
+            <w:tcBorders>
+              <w:top w:val="single" w:sz="4" w:space="0" w:color="1A3557"/>
+              <w:left w:val="single" w:sz="4" w:space="0" w:color="1A3557"/>
+              <w:bottom w:val="single" w:sz="4" w:space="0" w:color="1A3557"/>
+              <w:right w:val="single" w:sz="4" w:space="0" w:color="1A3557"/>
+            </w:tcBorders>
+            <w:shd w:val="clear" w:color="auto" w:fill="FFF9F4"/>
+            <w:tcMar>
+              <w:top w:w="100" w:type="dxa"/>
+              <w:left w:w="120" w:type="dxa"/>
+              <w:bottom w:w="100" w:type="dxa"/>
+              <w:right w:w="120" w:type="dxa"/>
+            </w:tcMar>
+          </w:tcPr>
+          <w:p>
+            <w:pPr>
+              <w:snapToGrid w:val="0"/>
+              <w:spacing w:line="276" w:lineRule="auto"/>
+              <w:rPr>
+                <w:rFonts w:ascii="Arvo" w:hAnsi="Arvo"/>
+                <w:b/>
+                <w:bCs/>
+                <w:sz w:val="20"/>
+                <w:szCs w:val="20"/>
+              </w:rPr>
+            </w:pPr>
+            <w:r>
+              <w:rPr>
+                <w:rFonts w:ascii="Arvo" w:hAnsi="Arvo"/>
+                <w:b/>
+                <w:bCs/>
+                <w:sz w:val="20"/>
+                <w:szCs w:val="20"/>
+              </w:rPr>
+              <w:t>Cap de Horas</w:t>
+            </w:r>
+          </w:p>
+        </w:tc>
+        <w:tc>
+          <w:tcPr>
+            <w:tcW w:w="6378" w:type="dxa"/>
+            <w:tcBorders>
+              <w:top w:val="single" w:sz="4" w:space="0" w:color="1A3557"/>
+              <w:left w:val="single" w:sz="4" w:space="0" w:color="1A3557"/>
+              <w:bottom w:val="single" w:sz="4" w:space="0" w:color="1A3557"/>
+              <w:right w:val="single" w:sz="4" w:space="0" w:color="1A3557"/>
+            </w:tcBorders>
+            <w:tcMar>
+              <w:top w:w="100" w:type="dxa"/>
+              <w:left w:w="120" w:type="dxa"/>
+              <w:bottom w:w="100" w:type="dxa"/>
+              <w:right w:w="120" w:type="dxa"/>
+            </w:tcMar>
+          </w:tcPr>
+          <w:p>
+            <w:pPr>
+              <w:snapToGrid w:val="0"/>
+              <w:spacing w:line="276" w:lineRule="auto"/>
+              <w:rPr>
+                <w:rFonts w:ascii="Arvo" w:hAnsi="Arvo"/>
+                <w:sz w:val="20"/>
+                <w:szCs w:val="20"/>
+              </w:rPr>
+            </w:pPr>
+            <w:r>
+              <w:rPr>
+                <w:rFonts w:ascii="Arvo" w:hAnsi="Arvo"/>
+                <w:sz w:val="20"/>
+                <w:szCs w:val="20"/>
+              </w:rPr>
+              <w:t>[CONS_</w:t>
+            </w:r>
+            <w:r>
+              <w:rPr>
+                <w:rFonts w:ascii="Arvo" w:hAnsi="Arvo"/>
+                <w:sz w:val="20"/>
+                <w:szCs w:val="20"/>
+              </w:rPr>
+              <w:t>PRECO</w:t>
+            </w:r>
+            <w:r>
+              <w:rPr>
+                <w:rFonts w:ascii="Arvo" w:hAnsi="Arvo"/>
+                <w:sz w:val="20"/>
+                <w:szCs w:val="20"/>
+              </w:rPr>
+              <w:t>_</w:t>
+            </w:r>
+            <w:r>
+              <w:rPr>
+                <w:rFonts w:ascii="Arvo" w:hAnsi="Arvo"/>
+                <w:sz w:val="20"/>
+                <w:szCs w:val="20"/>
+              </w:rPr>
+              <w:t>GLOBAL</w:t>
+            </w:r>
+            <w:r>
+              <w:rPr>
+                <w:rFonts w:ascii="Arvo" w:hAnsi="Arvo"/>
+                <w:sz w:val="20"/>
+                <w:szCs w:val="20"/>
+              </w:rPr>
+              <w:t>_CAP] horas</w:t>
+            </w:r>
+          </w:p>
+        </w:tc>
+      </w:tr>
+      <w:tr>
+        <w:tc>
+          <w:tcPr>
+            <w:tcW w:w="3256" w:type="dxa"/>
+            <w:tcBorders>
+              <w:top w:val="single" w:sz="4" w:space="0" w:color="1A3557"/>
+              <w:left w:val="single" w:sz="4" w:space="0" w:color="1A3557"/>
+              <w:bottom w:val="single" w:sz="4" w:space="0" w:color="1A3557"/>
+              <w:right w:val="single" w:sz="4" w:space="0" w:color="1A3557"/>
+            </w:tcBorders>
+            <w:shd w:val="clear" w:color="auto" w:fill="FFF9F4"/>
+            <w:tcMar>
+              <w:top w:w="100" w:type="dxa"/>
+              <w:left w:w="120" w:type="dxa"/>
+              <w:bottom w:w="100" w:type="dxa"/>
+              <w:right w:w="120" w:type="dxa"/>
+            </w:tcMar>
+          </w:tcPr>
+          <w:p>
+            <w:pPr>
+              <w:snapToGrid w:val="0"/>
+              <w:spacing w:line="276" w:lineRule="auto"/>
+              <w:rPr>
+                <w:rFonts w:ascii="Arvo" w:hAnsi="Arvo"/>
+                <w:sz w:val="20"/>
+                <w:szCs w:val="20"/>
+              </w:rPr>
+            </w:pPr>
+            <w:r>
+              <w:rPr>
+                <w:rFonts w:ascii="Arvo" w:hAnsi="Arvo"/>
                 <w:b/>
                 <w:bCs/>
                 <w:sz w:val="20"/>
@@ -2060,7 +2430,41 @@
           <w:sz w:val="20"/>
           <w:szCs w:val="20"/>
         </w:rPr>
-        <w:t>Qualquer ampliação, redução ou alteração qualitativa do escopo originalmente pactuado deverá ser previamente comunicada pelo Contratante ao Contratado por escrito. Verificado o impacto sobre o volume de trabalho ou a natureza das entregas, as Partes negociarão, de boa-fé, o reajuste proporcional dos honorários, a ser formalizado por aditamento a esta Proposta. Serviços prestados fora do escopo definido, sem a devida formalização, serão remunerados conforme a tabela horária vigente aplicável à modalidade correspondente.</w:t>
+        <w:t>Qualquer ampliação, redução ou alteração qualitativa do escopo originalmente pactuado deverá ser previamente comunicada pelo Contratante ao Contratado por escrito. Verificado o impacto sobre o volume de trabalho ou a natureza das entregas,</w:t>
+      </w:r>
+      <w:r>
+        <w:rPr>
+          <w:rFonts w:ascii="Arvo" w:hAnsi="Arvo"/>
+          <w:sz w:val="20"/>
+          <w:szCs w:val="20"/>
+        </w:rPr>
+        <w:t xml:space="preserve"> ou em caso de atingido o </w:t>
+      </w:r>
+      <w:r>
+        <w:rPr>
+          <w:rFonts w:ascii="Arvo" w:hAnsi="Arvo"/>
+          <w:i/>
+          <w:iCs/>
+          <w:sz w:val="20"/>
+          <w:szCs w:val="20"/>
+        </w:rPr>
+        <w:t>cap</w:t>
+      </w:r>
+      <w:r>
+        <w:rPr>
+          <w:rFonts w:ascii="Arvo" w:hAnsi="Arvo"/>
+          <w:sz w:val="20"/>
+          <w:szCs w:val="20"/>
+        </w:rPr>
+        <w:t>, se definido acima,</w:t>
+      </w:r>
+      <w:r>
+        <w:rPr>
+          <w:rFonts w:ascii="Arvo" w:hAnsi="Arvo"/>
+          <w:sz w:val="20"/>
+          <w:szCs w:val="20"/>
+        </w:rPr>
+        <w:t xml:space="preserve"> as Partes negociarão, de boa-fé, o reajuste proporcional dos honorários, a ser formalizado por aditamento a esta Proposta. Serviços prestados fora do escopo definido, sem a devida formalização, serão remunerados conforme a tabela horária vigente aplicável à modalidade correspondente.</w:t>
       </w:r>
     </w:p>
     <w:p>
@@ -2124,6 +2528,7 @@
           <w:sz w:val="2"/>
           <w:szCs w:val="2"/>
         </w:rPr>
+        <w:lastRenderedPageBreak/>
         <w:t>{%p if escopo.show_contenciosa %}</w:t>
       </w:r>
     </w:p>
@@ -2202,7 +2607,6 @@
           <w:sz w:val="20"/>
           <w:szCs w:val="20"/>
         </w:rPr>
-        <w:lastRenderedPageBreak/>
         <w:t xml:space="preserve">Valor </w:t>
       </w:r>
       <w:r>
@@ -2383,7 +2787,7 @@
                 <w:sz w:val="20"/>
                 <w:szCs w:val="20"/>
               </w:rPr>
-              <w:t>Fase Processual Coberta</w:t>
+              <w:t>Instâncias de Atuação</w:t>
             </w:r>
           </w:p>
         </w:tc>
@@ -3833,6 +4237,7 @@
                 <w:sz w:val="20"/>
                 <w:szCs w:val="20"/>
               </w:rPr>
+              <w:lastRenderedPageBreak/>
               <w:t>Valor Total</w:t>
             </w:r>
           </w:p>
@@ -3910,7 +4315,6 @@
                 <w:sz w:val="20"/>
                 <w:szCs w:val="20"/>
               </w:rPr>
-              <w:lastRenderedPageBreak/>
               <w:t>Ações e Fases Cobertas</w:t>
             </w:r>
           </w:p>
@@ -4279,7 +4683,57 @@
           <w:sz w:val="20"/>
           <w:szCs w:val="20"/>
         </w:rPr>
-        <w:t xml:space="preserve"> O Contratante reconhece que a realização de leitura de publicações em painéis, sistemas, DJe, e/ou qualquer outro meio de publicação oficial dos órgãos do poder público, poderá acarretar no início da fluência de prazos processuais e/ou administrativos, peremptórios ou não, de modo que o Contratante isenta o Contratado de todo e qualquer prejuízo advindo da leitura de publicações realizadas pelo Contratante, notadamente em razão do escoamento do prazo em data antecipada ao que ocorreria caso o Contratante não procedesse à leitura da publicação.</w:t>
+        <w:t xml:space="preserve"> O Contratante reconhece que a realização de leitura de publicações em painéis, sistemas, </w:t>
+      </w:r>
+      <w:proofErr w:type="spellStart"/>
+      <w:r>
+        <w:rPr>
+          <w:rFonts w:ascii="Arvo" w:hAnsi="Arvo"/>
+          <w:sz w:val="20"/>
+          <w:szCs w:val="20"/>
+        </w:rPr>
+        <w:t>DJe</w:t>
+      </w:r>
+      <w:proofErr w:type="spellEnd"/>
+      <w:r>
+        <w:rPr>
+          <w:rFonts w:ascii="Arvo" w:hAnsi="Arvo"/>
+          <w:sz w:val="20"/>
+          <w:szCs w:val="20"/>
+        </w:rPr>
+        <w:t xml:space="preserve">, </w:t>
+      </w:r>
+      <w:r>
+        <w:rPr>
+          <w:rFonts w:ascii="Arvo" w:hAnsi="Arvo"/>
+          <w:sz w:val="20"/>
+          <w:szCs w:val="20"/>
+        </w:rPr>
+        <w:t xml:space="preserve">aviso de recebimento de correspondências </w:t>
+      </w:r>
+      <w:r>
+        <w:rPr>
+          <w:rFonts w:ascii="Arvo" w:hAnsi="Arvo"/>
+          <w:sz w:val="20"/>
+          <w:szCs w:val="20"/>
+        </w:rPr>
+        <w:t>e/ou qualquer outro meio de publicação oficial dos órgãos do poder público, poderá acarretar no início da fluência de prazos processuais e/ou administrativos, peremptórios ou não, de modo que o Contratante isenta o Contratado de todo e qualquer prejuízo advindo da leitura</w:t>
+      </w:r>
+      <w:r>
+        <w:rPr>
+          <w:rFonts w:ascii="Arvo" w:hAnsi="Arvo"/>
+          <w:sz w:val="20"/>
+          <w:szCs w:val="20"/>
+        </w:rPr>
+        <w:t xml:space="preserve"> ou recebimento</w:t>
+      </w:r>
+      <w:r>
+        <w:rPr>
+          <w:rFonts w:ascii="Arvo" w:hAnsi="Arvo"/>
+          <w:sz w:val="20"/>
+          <w:szCs w:val="20"/>
+        </w:rPr>
+        <w:t xml:space="preserve"> de publicações realizadas pelo Contratante, notadamente em razão do escoamento do prazo em data antecipada ao que ocorreria caso o Contratante não procedesse à leitura da publicação.</w:t>
       </w:r>
     </w:p>
     <w:p>
@@ -6133,7 +6587,16 @@
           <w:sz w:val="20"/>
           <w:szCs w:val="20"/>
         </w:rPr>
-        <w:t xml:space="preserve"> Termos e Condições. Eventuais alterações</w:t>
+        <w:t xml:space="preserve"> Termos e Condições. </w:t>
+      </w:r>
+      <w:r>
+        <w:rPr>
+          <w:rFonts w:ascii="Arvo" w:hAnsi="Arvo"/>
+          <w:sz w:val="20"/>
+          <w:szCs w:val="20"/>
+        </w:rPr>
+        <w:lastRenderedPageBreak/>
+        <w:t>Eventuais alterações</w:t>
       </w:r>
       <w:r>
         <w:rPr>
@@ -6844,6 +7307,7 @@
           <w:sz w:val="20"/>
           <w:szCs w:val="20"/>
         </w:rPr>
+        <w:lastRenderedPageBreak/>
         <w:t xml:space="preserve">As despesas incorridas pelo Contratado </w:t>
       </w:r>
       <w:r>
@@ -7490,6 +7954,7 @@
           <w:sz w:val="20"/>
           <w:szCs w:val="20"/>
         </w:rPr>
+        <w:lastRenderedPageBreak/>
         <w:t xml:space="preserve">Abster-se de atuar em demandas em que se verifique incompatibilidade </w:t>
       </w:r>
       <w:r>
@@ -7543,7 +8008,6 @@
           <w:sz w:val="20"/>
           <w:szCs w:val="20"/>
         </w:rPr>
-        <w:lastRenderedPageBreak/>
         <w:t>Emitir os documentos fiscais correspondentes aos honorários e despesas cobrados, na forma da legislação tributária aplicável.</w:t>
       </w:r>
     </w:p>
@@ -7944,6 +8408,7 @@
           <w:sz w:val="20"/>
           <w:szCs w:val="20"/>
         </w:rPr>
+        <w:lastRenderedPageBreak/>
         <w:t>CONFIDENCIALIDADE</w:t>
       </w:r>
     </w:p>
@@ -7981,16 +8446,7 @@
           <w:sz w:val="20"/>
           <w:szCs w:val="20"/>
         </w:rPr>
-        <w:t xml:space="preserve">Consideram-se Informações Confidenciais todas as informações, dados, documentos, opiniões, pareceres, minutas, estratégias, know-how e demais conteúdos, em qualquer forma ou meio, compartilhados entre as Partes ou por elas elaborados em razão da presente </w:t>
-      </w:r>
-      <w:r>
-        <w:rPr>
-          <w:rFonts w:ascii="Arvo" w:hAnsi="Arvo"/>
-          <w:sz w:val="20"/>
-          <w:szCs w:val="20"/>
-        </w:rPr>
-        <w:lastRenderedPageBreak/>
-        <w:t>contratação, bem como aqueles tratados como tais pela Parte divulgadora ou que, por sua natureza, devam ser assim considerados.</w:t>
+        <w:t>Consideram-se Informações Confidenciais todas as informações, dados, documentos, opiniões, pareceres, minutas, estratégias, know-how e demais conteúdos, em qualquer forma ou meio, compartilhados entre as Partes ou por elas elaborados em razão da presente contratação, bem como aqueles tratados como tais pela Parte divulgadora ou que, por sua natureza, devam ser assim considerados.</w:t>
       </w:r>
     </w:p>
     <w:p>
@@ -8314,7 +8770,16 @@
           <w:sz w:val="20"/>
           <w:szCs w:val="20"/>
         </w:rPr>
-        <w:t xml:space="preserve"> fora das hipóteses legais ou contratuais, a submeter eventuais suboperadores a obrigações equivalentes e a notificar a outra Parte, em até 24 (vinte e quatro) horas da ciência, de qualquer incidente de segurança envolvendo dados pessoais desta contratação.</w:t>
+        <w:t xml:space="preserve"> fora das hipóteses legais ou contratuais, a submeter eventuais suboperadores a obrigações equivalentes e a notificar a outra Parte, em até 24 (vinte e quatro) </w:t>
+      </w:r>
+      <w:r>
+        <w:rPr>
+          <w:rFonts w:ascii="Arvo" w:hAnsi="Arvo"/>
+          <w:sz w:val="20"/>
+          <w:szCs w:val="20"/>
+        </w:rPr>
+        <w:lastRenderedPageBreak/>
+        <w:t>horas da ciência, de qualquer incidente de segurança envolvendo dados pessoais desta contratação.</w:t>
       </w:r>
     </w:p>
     <w:p>
@@ -8351,7 +8816,6 @@
           <w:sz w:val="20"/>
           <w:szCs w:val="20"/>
         </w:rPr>
-        <w:lastRenderedPageBreak/>
         <w:t>As Partes cooperarão de boa-fé para o atendimento das requisições dos titulares de dados e das autoridades competentes, respondendo cada qual, na respectiva medida de responsabilidade, pelos ônus decorrentes do descumprimento desta cláusula.</w:t>
       </w:r>
     </w:p>
@@ -8427,7 +8891,39 @@
           <w:sz w:val="20"/>
           <w:szCs w:val="20"/>
         </w:rPr>
-        <w:t>A responsabilidade do Contratado limita-se aos danos diretos e efetivamente comprovados decorrentes de culpa ou dolo na execução dos serviços, excluídos, expressamente, os danos indiretos, lucros cessantes, perda de chance, danos reflexos e demais danos consequenciais, salvo nas hipóteses em que a lei vedar a limitação de responsabilidade.</w:t>
+        <w:t>A responsabilidade do Contratado</w:t>
+      </w:r>
+      <w:r>
+        <w:rPr>
+          <w:rFonts w:ascii="Arvo" w:hAnsi="Arvo"/>
+          <w:sz w:val="20"/>
+          <w:szCs w:val="20"/>
+        </w:rPr>
+        <w:t>, em qualquer hipótese, fica limitada ao valor total efetivamente pago pelo Contratante</w:t>
+      </w:r>
+      <w:r>
+        <w:rPr>
+          <w:rFonts w:ascii="Arvo" w:hAnsi="Arvo"/>
+          <w:sz w:val="20"/>
+          <w:szCs w:val="20"/>
+        </w:rPr>
+        <w:t xml:space="preserve"> ao Contratado</w:t>
+      </w:r>
+      <w:r>
+        <w:rPr>
+          <w:rFonts w:ascii="Arvo" w:hAnsi="Arvo"/>
+          <w:sz w:val="20"/>
+          <w:szCs w:val="20"/>
+        </w:rPr>
+        <w:t xml:space="preserve"> nos 12 (doze) meses anteriores, respondendo exclusivamente por danos diretos e efetivamente comprovados decorrentes de culpa ou dolo na execução dos serviços. Ficam expressamente excluídos quaisquer danos indiretos, lucros cessantes, perda de chance, danos reflexos e</w:t>
+      </w:r>
+      <w:r>
+        <w:rPr>
+          <w:rFonts w:ascii="Arvo" w:hAnsi="Arvo"/>
+          <w:sz w:val="20"/>
+          <w:szCs w:val="20"/>
+        </w:rPr>
+        <w:t xml:space="preserve"> danos consequenciais, salvo nas hipóteses em que a lei vedar a limitação de responsabilidade.</w:t>
       </w:r>
     </w:p>
     <w:p>
@@ -8808,6 +9304,7 @@
           <w:sz w:val="20"/>
           <w:szCs w:val="20"/>
         </w:rPr>
+        <w:lastRenderedPageBreak/>
         <w:t xml:space="preserve">A declarada nulidade, invalidade ou ineficácia de qualquer disposição não afetará as demais, permanecendo </w:t>
       </w:r>
       <w:r>
@@ -8861,7 +9358,6 @@
           <w:sz w:val="20"/>
           <w:szCs w:val="20"/>
         </w:rPr>
-        <w:lastRenderedPageBreak/>
         <w:t>As comunicações relativas a est</w:t>
       </w:r>
       <w:r>
@@ -9531,6 +10027,7 @@
                 <w:sz w:val="20"/>
                 <w:szCs w:val="20"/>
               </w:rPr>
+              <w:lastRenderedPageBreak/>
               <w:t>____________________________________________</w:t>
             </w:r>
           </w:p>
@@ -9587,9 +10084,12 @@
       </w:pPr>
     </w:p>
     <w:sectPr>
-      <w:headerReference w:type="default" r:id="rId10"/>
-      <w:footerReference w:type="even" r:id="rId11"/>
-      <w:footerReference w:type="default" r:id="rId12"/>
+      <w:headerReference w:type="even" r:id="rId10"/>
+      <w:headerReference w:type="default" r:id="rId11"/>
+      <w:footerReference w:type="even" r:id="rId12"/>
+      <w:footerReference w:type="default" r:id="rId13"/>
+      <w:headerReference w:type="first" r:id="rId14"/>
+      <w:footerReference w:type="first" r:id="rId15"/>
       <w:pgSz w:w="11906" w:h="16838"/>
       <w:pgMar w:top="2268" w:right="1134" w:bottom="2268" w:left="1134" w:header="720" w:footer="720" w:gutter="0"/>
       <w:cols w:space="720"/>
@@ -9745,6 +10245,16 @@
 </w:ftr>
 </file>
 
+<file path=word/footer3.xml><?xml version="1.0" encoding="utf-8"?>
+<w:ftr xmlns:wpc="http://schemas.microsoft.com/office/word/2010/wordprocessingCanvas" xmlns:cx="http://schemas.microsoft.com/office/drawing/2014/chartex" xmlns:cx1="http://schemas.microsoft.com/office/drawing/2015/9/8/chartex" xmlns:cx2="http://schemas.microsoft.com/office/drawing/2015/10/21/chartex" xmlns:cx3="http://schemas.microsoft.com/office/drawing/2016/5/9/chartex" xmlns:cx4="http://schemas.microsoft.com/office/drawing/2016/5/10/chartex" xmlns:cx5="http://schemas.microsoft.com/office/drawing/2016/5/11/chartex" xmlns:cx6="http://schemas.microsoft.com/office/drawing/2016/5/12/chartex" xmlns:cx7="http://schemas.microsoft.com/office/drawing/2016/5/13/chartex" xmlns:cx8="http://schemas.microsoft.com/office/drawing/2016/5/14/chartex" xmlns:mc="http://schemas.openxmlformats.org/markup-compatibility/2006" xmlns:aink="http://schemas.microsoft.com/office/drawing/2016/ink" xmlns:am3d="http://schemas.microsoft.com/office/drawing/2017/model3d" xmlns:o="urn:schemas-microsoft-com:office:office" xmlns:oel="http://schemas.microsoft.com/office/2019/extlst" xmlns:r="http://schemas.openxmlformats.org/officeDocument/2006/relationships" xmlns:m="http://schemas.openxmlformats.org/officeDocument/2006/math" xmlns:v="urn:schemas-microsoft-com:vml" xmlns:wp14="http://schemas.microsoft.com/office/word/2010/wordprocessingDrawing" xmlns:wp="http://schemas.openxmlformats.org/drawingml/2006/wordprocessingDrawing" xmlns:w10="urn:schemas-microsoft-com:office:word" xmlns:w="http://schemas.openxmlformats.org/wordprocessingml/2006/main" xmlns:w14="http://schemas.microsoft.com/office/word/2010/wordml" xmlns:w15="http://schemas.microsoft.com/office/word/2012/wordml" xmlns:w16cex="http://schemas.microsoft.com/office/word/2018/wordml/cex" xmlns:w16cid="http://schemas.microsoft.com/office/word/2016/wordml/cid" xmlns:w16="http://schemas.microsoft.com/office/word/2018/wordml" xmlns:w16du="http://schemas.microsoft.com/office/word/2023/wordml/word16du" xmlns:w16sdtdh="http://schemas.microsoft.com/office/word/2020/wordml/sdtdatahash" xmlns:w16sdtfl="http://schemas.microsoft.com/office/word/2024/wordml/sdtformatlock" xmlns:w16se="http://schemas.microsoft.com/office/word/2015/wordml/symex" xmlns:wpg="http://schemas.microsoft.com/office/word/2010/wordprocessingGroup" xmlns:wpi="http://schemas.microsoft.com/office/word/2010/wordprocessingInk" xmlns:wne="http://schemas.microsoft.com/office/word/2006/wordml" xmlns:wps="http://schemas.microsoft.com/office/word/2010/wordprocessingShape" mc:Ignorable="w14 w15 w16se w16cid w16 w16cex w16sdtdh w16sdtfl w16du wp14">
+  <w:p>
+    <w:pPr>
+      <w:pStyle w:val="Rodap"/>
+    </w:pPr>
+  </w:p>
+</w:ftr>
+</file>
+
 <file path=word/footnotes.xml><?xml version="1.0" encoding="utf-8"?>
 <w:footnotes xmlns:wpc="http://schemas.microsoft.com/office/word/2010/wordprocessingCanvas" xmlns:cx="http://schemas.microsoft.com/office/drawing/2014/chartex" xmlns:cx1="http://schemas.microsoft.com/office/drawing/2015/9/8/chartex" xmlns:cx2="http://schemas.microsoft.com/office/drawing/2015/10/21/chartex" xmlns:cx3="http://schemas.microsoft.com/office/drawing/2016/5/9/chartex" xmlns:cx4="http://schemas.microsoft.com/office/drawing/2016/5/10/chartex" xmlns:cx5="http://schemas.microsoft.com/office/drawing/2016/5/11/chartex" xmlns:cx6="http://schemas.microsoft.com/office/drawing/2016/5/12/chartex" xmlns:cx7="http://schemas.microsoft.com/office/drawing/2016/5/13/chartex" xmlns:cx8="http://schemas.microsoft.com/office/drawing/2016/5/14/chartex" xmlns:mc="http://schemas.openxmlformats.org/markup-compatibility/2006" xmlns:aink="http://schemas.microsoft.com/office/drawing/2016/ink" xmlns:am3d="http://schemas.microsoft.com/office/drawing/2017/model3d" xmlns:o="urn:schemas-microsoft-com:office:office" xmlns:oel="http://schemas.microsoft.com/office/2019/extlst" xmlns:r="http://schemas.openxmlformats.org/officeDocument/2006/relationships" xmlns:m="http://schemas.openxmlformats.org/officeDocument/2006/math" xmlns:v="urn:schemas-microsoft-com:vml" xmlns:wp14="http://schemas.microsoft.com/office/word/2010/wordprocessingDrawing" xmlns:wp="http://schemas.openxmlformats.org/drawingml/2006/wordprocessingDrawing" xmlns:w10="urn:schemas-microsoft-com:office:word" xmlns:w="http://schemas.openxmlformats.org/wordprocessingml/2006/main" xmlns:w14="http://schemas.microsoft.com/office/word/2010/wordml" xmlns:w15="http://schemas.microsoft.com/office/word/2012/wordml" xmlns:w16cex="http://schemas.microsoft.com/office/word/2018/wordml/cex" xmlns:w16cid="http://schemas.microsoft.com/office/word/2016/wordml/cid" xmlns:w16="http://schemas.microsoft.com/office/word/2018/wordml" xmlns:w16du="http://schemas.microsoft.com/office/word/2023/wordml/word16du" xmlns:w16sdtdh="http://schemas.microsoft.com/office/word/2020/wordml/sdtdatahash" xmlns:w16sdtfl="http://schemas.microsoft.com/office/word/2024/wordml/sdtformatlock" xmlns:w16se="http://schemas.microsoft.com/office/word/2015/wordml/symex" xmlns:wpg="http://schemas.microsoft.com/office/word/2010/wordprocessingGroup" xmlns:wpi="http://schemas.microsoft.com/office/word/2010/wordprocessingInk" xmlns:wne="http://schemas.microsoft.com/office/word/2006/wordml" xmlns:wps="http://schemas.microsoft.com/office/word/2010/wordprocessingShape" mc:Ignorable="w14 w15 w16se w16cid w16 w16cex w16sdtdh w16sdtfl w16du wp14">
   <w:footnote w:type="separator" w:id="-1">
@@ -9765,6 +10275,16 @@
 </file>
 
 <file path=word/header1.xml><?xml version="1.0" encoding="utf-8"?>
+<w:hdr xmlns:wpc="http://schemas.microsoft.com/office/word/2010/wordprocessingCanvas" xmlns:cx="http://schemas.microsoft.com/office/drawing/2014/chartex" xmlns:cx1="http://schemas.microsoft.com/office/drawing/2015/9/8/chartex" xmlns:cx2="http://schemas.microsoft.com/office/drawing/2015/10/21/chartex" xmlns:cx3="http://schemas.microsoft.com/office/drawing/2016/5/9/chartex" xmlns:cx4="http://schemas.microsoft.com/office/drawing/2016/5/10/chartex" xmlns:cx5="http://schemas.microsoft.com/office/drawing/2016/5/11/chartex" xmlns:cx6="http://schemas.microsoft.com/office/drawing/2016/5/12/chartex" xmlns:cx7="http://schemas.microsoft.com/office/drawing/2016/5/13/chartex" xmlns:cx8="http://schemas.microsoft.com/office/drawing/2016/5/14/chartex" xmlns:mc="http://schemas.openxmlformats.org/markup-compatibility/2006" xmlns:aink="http://schemas.microsoft.com/office/drawing/2016/ink" xmlns:am3d="http://schemas.microsoft.com/office/drawing/2017/model3d" xmlns:o="urn:schemas-microsoft-com:office:office" xmlns:oel="http://schemas.microsoft.com/office/2019/extlst" xmlns:r="http://schemas.openxmlformats.org/officeDocument/2006/relationships" xmlns:m="http://schemas.openxmlformats.org/officeDocument/2006/math" xmlns:v="urn:schemas-microsoft-com:vml" xmlns:wp14="http://schemas.microsoft.com/office/word/2010/wordprocessingDrawing" xmlns:wp="http://schemas.openxmlformats.org/drawingml/2006/wordprocessingDrawing" xmlns:w10="urn:schemas-microsoft-com:office:word" xmlns:w="http://schemas.openxmlformats.org/wordprocessingml/2006/main" xmlns:w14="http://schemas.microsoft.com/office/word/2010/wordml" xmlns:w15="http://schemas.microsoft.com/office/word/2012/wordml" xmlns:w16cex="http://schemas.microsoft.com/office/word/2018/wordml/cex" xmlns:w16cid="http://schemas.microsoft.com/office/word/2016/wordml/cid" xmlns:w16="http://schemas.microsoft.com/office/word/2018/wordml" xmlns:w16du="http://schemas.microsoft.com/office/word/2023/wordml/word16du" xmlns:w16sdtdh="http://schemas.microsoft.com/office/word/2020/wordml/sdtdatahash" xmlns:w16sdtfl="http://schemas.microsoft.com/office/word/2024/wordml/sdtformatlock" xmlns:w16se="http://schemas.microsoft.com/office/word/2015/wordml/symex" xmlns:wpg="http://schemas.microsoft.com/office/word/2010/wordprocessingGroup" xmlns:wpi="http://schemas.microsoft.com/office/word/2010/wordprocessingInk" xmlns:wne="http://schemas.microsoft.com/office/word/2006/wordml" xmlns:wps="http://schemas.microsoft.com/office/word/2010/wordprocessingShape" mc:Ignorable="w14 w15 w16se w16cid w16 w16cex w16sdtdh w16sdtfl w16du wp14">
+  <w:p>
+    <w:pPr>
+      <w:pStyle w:val="Cabealho"/>
+    </w:pPr>
+  </w:p>
+</w:hdr>
+</file>
+
+<file path=word/header2.xml><?xml version="1.0" encoding="utf-8"?>
 <w:hdr xmlns:wpc="http://schemas.microsoft.com/office/word/2010/wordprocessingCanvas" xmlns:cx="http://schemas.microsoft.com/office/drawing/2014/chartex" xmlns:cx1="http://schemas.microsoft.com/office/drawing/2015/9/8/chartex" xmlns:cx2="http://schemas.microsoft.com/office/drawing/2015/10/21/chartex" xmlns:cx3="http://schemas.microsoft.com/office/drawing/2016/5/9/chartex" xmlns:cx4="http://schemas.microsoft.com/office/drawing/2016/5/10/chartex" xmlns:cx5="http://schemas.microsoft.com/office/drawing/2016/5/11/chartex" xmlns:cx6="http://schemas.microsoft.com/office/drawing/2016/5/12/chartex" xmlns:cx7="http://schemas.microsoft.com/office/drawing/2016/5/13/chartex" xmlns:cx8="http://schemas.microsoft.com/office/drawing/2016/5/14/chartex" xmlns:mc="http://schemas.openxmlformats.org/markup-compatibility/2006" xmlns:aink="http://schemas.microsoft.com/office/drawing/2016/ink" xmlns:am3d="http://schemas.microsoft.com/office/drawing/2017/model3d" xmlns:o="urn:schemas-microsoft-com:office:office" xmlns:oel="http://schemas.microsoft.com/office/2019/extlst" xmlns:r="http://schemas.openxmlformats.org/officeDocument/2006/relationships" xmlns:m="http://schemas.openxmlformats.org/officeDocument/2006/math" xmlns:v="urn:schemas-microsoft-com:vml" xmlns:wp14="http://schemas.microsoft.com/office/word/2010/wordprocessingDrawing" xmlns:wp="http://schemas.openxmlformats.org/drawingml/2006/wordprocessingDrawing" xmlns:w10="urn:schemas-microsoft-com:office:word" xmlns:w="http://schemas.openxmlformats.org/wordprocessingml/2006/main" xmlns:w14="http://schemas.microsoft.com/office/word/2010/wordml" xmlns:w15="http://schemas.microsoft.com/office/word/2012/wordml" xmlns:w16cex="http://schemas.microsoft.com/office/word/2018/wordml/cex" xmlns:w16cid="http://schemas.microsoft.com/office/word/2016/wordml/cid" xmlns:w16="http://schemas.microsoft.com/office/word/2018/wordml" xmlns:w16du="http://schemas.microsoft.com/office/word/2023/wordml/word16du" xmlns:w16sdtdh="http://schemas.microsoft.com/office/word/2020/wordml/sdtdatahash" xmlns:w16sdtfl="http://schemas.microsoft.com/office/word/2024/wordml/sdtformatlock" xmlns:w16se="http://schemas.microsoft.com/office/word/2015/wordml/symex" xmlns:wpg="http://schemas.microsoft.com/office/word/2010/wordprocessingGroup" xmlns:wpi="http://schemas.microsoft.com/office/word/2010/wordprocessingInk" xmlns:wne="http://schemas.microsoft.com/office/word/2006/wordml" xmlns:wps="http://schemas.microsoft.com/office/word/2010/wordprocessingShape" mc:Ignorable="w14 w15 w16se w16cid w16 w16cex w16sdtdh w16sdtfl w16du wp14">
   <w:p>
     <w:r>
@@ -9832,6 +10352,16 @@
 </w:hdr>
 </file>
 
+<file path=word/header3.xml><?xml version="1.0" encoding="utf-8"?>
+<w:hdr xmlns:wpc="http://schemas.microsoft.com/office/word/2010/wordprocessingCanvas" xmlns:cx="http://schemas.microsoft.com/office/drawing/2014/chartex" xmlns:cx1="http://schemas.microsoft.com/office/drawing/2015/9/8/chartex" xmlns:cx2="http://schemas.microsoft.com/office/drawing/2015/10/21/chartex" xmlns:cx3="http://schemas.microsoft.com/office/drawing/2016/5/9/chartex" xmlns:cx4="http://schemas.microsoft.com/office/drawing/2016/5/10/chartex" xmlns:cx5="http://schemas.microsoft.com/office/drawing/2016/5/11/chartex" xmlns:cx6="http://schemas.microsoft.com/office/drawing/2016/5/12/chartex" xmlns:cx7="http://schemas.microsoft.com/office/drawing/2016/5/13/chartex" xmlns:cx8="http://schemas.microsoft.com/office/drawing/2016/5/14/chartex" xmlns:mc="http://schemas.openxmlformats.org/markup-compatibility/2006" xmlns:aink="http://schemas.microsoft.com/office/drawing/2016/ink" xmlns:am3d="http://schemas.microsoft.com/office/drawing/2017/model3d" xmlns:o="urn:schemas-microsoft-com:office:office" xmlns:oel="http://schemas.microsoft.com/office/2019/extlst" xmlns:r="http://schemas.openxmlformats.org/officeDocument/2006/relationships" xmlns:m="http://schemas.openxmlformats.org/officeDocument/2006/math" xmlns:v="urn:schemas-microsoft-com:vml" xmlns:wp14="http://schemas.microsoft.com/office/word/2010/wordprocessingDrawing" xmlns:wp="http://schemas.openxmlformats.org/drawingml/2006/wordprocessingDrawing" xmlns:w10="urn:schemas-microsoft-com:office:word" xmlns:w="http://schemas.openxmlformats.org/wordprocessingml/2006/main" xmlns:w14="http://schemas.microsoft.com/office/word/2010/wordml" xmlns:w15="http://schemas.microsoft.com/office/word/2012/wordml" xmlns:w16cex="http://schemas.microsoft.com/office/word/2018/wordml/cex" xmlns:w16cid="http://schemas.microsoft.com/office/word/2016/wordml/cid" xmlns:w16="http://schemas.microsoft.com/office/word/2018/wordml" xmlns:w16du="http://schemas.microsoft.com/office/word/2023/wordml/word16du" xmlns:w16sdtdh="http://schemas.microsoft.com/office/word/2020/wordml/sdtdatahash" xmlns:w16sdtfl="http://schemas.microsoft.com/office/word/2024/wordml/sdtformatlock" xmlns:w16se="http://schemas.microsoft.com/office/word/2015/wordml/symex" xmlns:wpg="http://schemas.microsoft.com/office/word/2010/wordprocessingGroup" xmlns:wpi="http://schemas.microsoft.com/office/word/2010/wordprocessingInk" xmlns:wne="http://schemas.microsoft.com/office/word/2006/wordml" xmlns:wps="http://schemas.microsoft.com/office/word/2010/wordprocessingShape" mc:Ignorable="w14 w15 w16se w16cid w16 w16cex w16sdtdh w16sdtfl w16du wp14">
+  <w:p>
+    <w:pPr>
+      <w:pStyle w:val="Cabealho"/>
+    </w:pPr>
+  </w:p>
+</w:hdr>
+</file>
+
 <file path=word/numbering.xml><?xml version="1.0" encoding="utf-8"?>
 <w:numbering xmlns:wpc="http://schemas.microsoft.com/office/word/2010/wordprocessingCanvas" xmlns:cx="http://schemas.microsoft.com/office/drawing/2014/chartex" xmlns:cx1="http://schemas.microsoft.com/office/drawing/2015/9/8/chartex" xmlns:cx2="http://schemas.microsoft.com/office/drawing/2015/10/21/chartex" xmlns:cx3="http://schemas.microsoft.com/office/drawing/2016/5/9/chartex" xmlns:cx4="http://schemas.microsoft.com/office/drawing/2016/5/10/chartex" xmlns:cx5="http://schemas.microsoft.com/office/drawing/2016/5/11/chartex" xmlns:cx6="http://schemas.microsoft.com/office/drawing/2016/5/12/chartex" xmlns:cx7="http://schemas.microsoft.com/office/drawing/2016/5/13/chartex" xmlns:cx8="http://schemas.microsoft.com/office/drawing/2016/5/14/chartex" xmlns:mc="http://schemas.openxmlformats.org/markup-compatibility/2006" xmlns:aink="http://schemas.microsoft.com/office/drawing/2016/ink" xmlns:am3d="http://schemas.microsoft.com/office/drawing/2017/model3d" xmlns:o="urn:schemas-microsoft-com:office:office" xmlns:oel="http://schemas.microsoft.com/office/2019/extlst" xmlns:r="http://schemas.openxmlformats.org/officeDocument/2006/relationships" xmlns:m="http://schemas.openxmlformats.org/officeDocument/2006/math" xmlns:v="urn:schemas-microsoft-com:vml" xmlns:wp14="http://schemas.microsoft.com/office/word/2010/wordprocessingDrawing" xmlns:wp="http://schemas.openxmlformats.org/drawingml/2006/wordprocessingDrawing" xmlns:w10="urn:schemas-microsoft-com:office:word" xmlns:w="http://schemas.openxmlformats.org/wordprocessingml/2006/main" xmlns:w14="http://schemas.microsoft.com/office/word/2010/wordml" xmlns:w15="http://schemas.microsoft.com/office/word/2012/wordml" xmlns:w16cex="http://schemas.microsoft.com/office/word/2018/wordml/cex" xmlns:w16cid="http://schemas.microsoft.com/office/word/2016/wordml/cid" xmlns:w16="http://schemas.microsoft.com/office/word/2018/wordml" xmlns:w16du="http://schemas.microsoft.com/office/word/2023/wordml/word16du" xmlns:w16sdtdh="http://schemas.microsoft.com/office/word/2020/wordml/sdtdatahash" xmlns:w16sdtfl="http://schemas.microsoft.com/office/word/2024/wordml/sdtformatlock" xmlns:w16se="http://schemas.microsoft.com/office/word/2015/wordml/symex" xmlns:wpg="http://schemas.microsoft.com/office/word/2010/wordprocessingGroup" xmlns:wpi="http://schemas.microsoft.com/office/word/2010/wordprocessingInk" xmlns:wne="http://schemas.microsoft.com/office/word/2006/wordml" xmlns:wps="http://schemas.microsoft.com/office/word/2010/wordprocessingShape" mc:Ignorable="w14 w15 w16se w16cid w16 w16cex w16sdtdh w16sdtfl w16du wp14">
   <w:abstractNum w:abstractNumId="0" w15:restartNumberingAfterBreak="0">
@@ -10059,7 +10589,7 @@
   <w:docDefaults>
     <w:rPrDefault>
       <w:rPr>
-        <w:rFonts w:ascii="Arvo" w:eastAsia="Arvo" w:hAnsi="Arvo" w:cs="Arvo"/>
+        <w:rFonts w:ascii="Arial Narrow" w:eastAsia="Arial Narrow" w:hAnsi="Arial Narrow" w:cs="Arial Narrow"/>
         <w:sz w:val="22"/>
         <w:szCs w:val="22"/>
         <w:lang w:val="pt-BR" w:eastAsia="pt-BR" w:bidi="ar-SA"/>

</xml_diff>

<commit_message>
Remove linha de cap duplicada (avulsa) do template Preço Global consultivo
Linha já existia no markers original com texto fragmentado em runs XML,
passando despercebida na busca. Mantida apenas a versão condicional.

https://claude.ai/code/session_01QYVgUedAdGPCf2tFmVT5S5
</commit_message>
<xml_diff>
--- a/resources/templates/PMRA_Template_Jinja.docx
+++ b/resources/templates/PMRA_Template_Jinja.docx
@@ -2167,117 +2167,6 @@
                 <w:szCs w:val="20"/>
               </w:rPr>
             </w:pPr>
-          </w:p>
-        </w:tc>
-      </w:tr>
-      <w:tr>
-        <w:tc>
-          <w:tcPr>
-            <w:tcW w:w="3256" w:type="dxa"/>
-            <w:tcBorders>
-              <w:top w:val="single" w:sz="4" w:space="0" w:color="1A3557"/>
-              <w:left w:val="single" w:sz="4" w:space="0" w:color="1A3557"/>
-              <w:bottom w:val="single" w:sz="4" w:space="0" w:color="1A3557"/>
-              <w:right w:val="single" w:sz="4" w:space="0" w:color="1A3557"/>
-            </w:tcBorders>
-            <w:shd w:val="clear" w:color="auto" w:fill="FFF9F4"/>
-            <w:tcMar>
-              <w:top w:w="100" w:type="dxa"/>
-              <w:left w:w="120" w:type="dxa"/>
-              <w:bottom w:w="100" w:type="dxa"/>
-              <w:right w:w="120" w:type="dxa"/>
-            </w:tcMar>
-          </w:tcPr>
-          <w:p>
-            <w:pPr>
-              <w:snapToGrid w:val="0"/>
-              <w:spacing w:line="276" w:lineRule="auto"/>
-              <w:rPr>
-                <w:rFonts w:ascii="Arvo" w:hAnsi="Arvo"/>
-                <w:b/>
-                <w:bCs/>
-                <w:sz w:val="20"/>
-                <w:szCs w:val="20"/>
-              </w:rPr>
-            </w:pPr>
-            <w:r>
-              <w:rPr>
-                <w:rFonts w:ascii="Arvo" w:hAnsi="Arvo"/>
-                <w:b/>
-                <w:bCs/>
-                <w:sz w:val="20"/>
-                <w:szCs w:val="20"/>
-              </w:rPr>
-              <w:t>Cap de Horas</w:t>
-            </w:r>
-          </w:p>
-        </w:tc>
-        <w:tc>
-          <w:tcPr>
-            <w:tcW w:w="6378" w:type="dxa"/>
-            <w:tcBorders>
-              <w:top w:val="single" w:sz="4" w:space="0" w:color="1A3557"/>
-              <w:left w:val="single" w:sz="4" w:space="0" w:color="1A3557"/>
-              <w:bottom w:val="single" w:sz="4" w:space="0" w:color="1A3557"/>
-              <w:right w:val="single" w:sz="4" w:space="0" w:color="1A3557"/>
-            </w:tcBorders>
-            <w:tcMar>
-              <w:top w:w="100" w:type="dxa"/>
-              <w:left w:w="120" w:type="dxa"/>
-              <w:bottom w:w="100" w:type="dxa"/>
-              <w:right w:w="120" w:type="dxa"/>
-            </w:tcMar>
-          </w:tcPr>
-          <w:p>
-            <w:pPr>
-              <w:snapToGrid w:val="0"/>
-              <w:spacing w:line="276" w:lineRule="auto"/>
-              <w:rPr>
-                <w:rFonts w:ascii="Arvo" w:hAnsi="Arvo"/>
-                <w:sz w:val="20"/>
-                <w:szCs w:val="20"/>
-              </w:rPr>
-            </w:pPr>
-            <w:r>
-              <w:rPr>
-                <w:rFonts w:ascii="Arvo" w:hAnsi="Arvo"/>
-                <w:sz w:val="20"/>
-                <w:szCs w:val="20"/>
-              </w:rPr>
-              <w:t>[CONS_</w:t>
-            </w:r>
-            <w:r>
-              <w:rPr>
-                <w:rFonts w:ascii="Arvo" w:hAnsi="Arvo"/>
-                <w:sz w:val="20"/>
-                <w:szCs w:val="20"/>
-              </w:rPr>
-              <w:t>PRECO</w:t>
-            </w:r>
-            <w:r>
-              <w:rPr>
-                <w:rFonts w:ascii="Arvo" w:hAnsi="Arvo"/>
-                <w:sz w:val="20"/>
-                <w:szCs w:val="20"/>
-              </w:rPr>
-              <w:t>_</w:t>
-            </w:r>
-            <w:r>
-              <w:rPr>
-                <w:rFonts w:ascii="Arvo" w:hAnsi="Arvo"/>
-                <w:sz w:val="20"/>
-                <w:szCs w:val="20"/>
-              </w:rPr>
-              <w:t>GLOBAL</w:t>
-            </w:r>
-            <w:r>
-              <w:rPr>
-                <w:rFonts w:ascii="Arvo" w:hAnsi="Arvo"/>
-                <w:sz w:val="20"/>
-                <w:szCs w:val="20"/>
-              </w:rPr>
-              <w:t>_CAP] horas</w:t>
-            </w:r>
           </w:p>
         </w:tc>
       </w:tr>

</xml_diff>

<commit_message>
Corrige linha de cap duplicada no template (v2.0.17)
Linha já existia no markers original com texto fragmentado em runs XML,
passando despercebida na busca. Mantida apenas a versão condicional.

https://claude.ai/code/session_01QYVgUedAdGPCf2tFmVT5S5

Co-authored-by: Claude <noreply@anthropic.com>
</commit_message>
<xml_diff>
--- a/resources/templates/PMRA_Template_Jinja.docx
+++ b/resources/templates/PMRA_Template_Jinja.docx
@@ -2167,117 +2167,6 @@
                 <w:szCs w:val="20"/>
               </w:rPr>
             </w:pPr>
-          </w:p>
-        </w:tc>
-      </w:tr>
-      <w:tr>
-        <w:tc>
-          <w:tcPr>
-            <w:tcW w:w="3256" w:type="dxa"/>
-            <w:tcBorders>
-              <w:top w:val="single" w:sz="4" w:space="0" w:color="1A3557"/>
-              <w:left w:val="single" w:sz="4" w:space="0" w:color="1A3557"/>
-              <w:bottom w:val="single" w:sz="4" w:space="0" w:color="1A3557"/>
-              <w:right w:val="single" w:sz="4" w:space="0" w:color="1A3557"/>
-            </w:tcBorders>
-            <w:shd w:val="clear" w:color="auto" w:fill="FFF9F4"/>
-            <w:tcMar>
-              <w:top w:w="100" w:type="dxa"/>
-              <w:left w:w="120" w:type="dxa"/>
-              <w:bottom w:w="100" w:type="dxa"/>
-              <w:right w:w="120" w:type="dxa"/>
-            </w:tcMar>
-          </w:tcPr>
-          <w:p>
-            <w:pPr>
-              <w:snapToGrid w:val="0"/>
-              <w:spacing w:line="276" w:lineRule="auto"/>
-              <w:rPr>
-                <w:rFonts w:ascii="Arvo" w:hAnsi="Arvo"/>
-                <w:b/>
-                <w:bCs/>
-                <w:sz w:val="20"/>
-                <w:szCs w:val="20"/>
-              </w:rPr>
-            </w:pPr>
-            <w:r>
-              <w:rPr>
-                <w:rFonts w:ascii="Arvo" w:hAnsi="Arvo"/>
-                <w:b/>
-                <w:bCs/>
-                <w:sz w:val="20"/>
-                <w:szCs w:val="20"/>
-              </w:rPr>
-              <w:t>Cap de Horas</w:t>
-            </w:r>
-          </w:p>
-        </w:tc>
-        <w:tc>
-          <w:tcPr>
-            <w:tcW w:w="6378" w:type="dxa"/>
-            <w:tcBorders>
-              <w:top w:val="single" w:sz="4" w:space="0" w:color="1A3557"/>
-              <w:left w:val="single" w:sz="4" w:space="0" w:color="1A3557"/>
-              <w:bottom w:val="single" w:sz="4" w:space="0" w:color="1A3557"/>
-              <w:right w:val="single" w:sz="4" w:space="0" w:color="1A3557"/>
-            </w:tcBorders>
-            <w:tcMar>
-              <w:top w:w="100" w:type="dxa"/>
-              <w:left w:w="120" w:type="dxa"/>
-              <w:bottom w:w="100" w:type="dxa"/>
-              <w:right w:w="120" w:type="dxa"/>
-            </w:tcMar>
-          </w:tcPr>
-          <w:p>
-            <w:pPr>
-              <w:snapToGrid w:val="0"/>
-              <w:spacing w:line="276" w:lineRule="auto"/>
-              <w:rPr>
-                <w:rFonts w:ascii="Arvo" w:hAnsi="Arvo"/>
-                <w:sz w:val="20"/>
-                <w:szCs w:val="20"/>
-              </w:rPr>
-            </w:pPr>
-            <w:r>
-              <w:rPr>
-                <w:rFonts w:ascii="Arvo" w:hAnsi="Arvo"/>
-                <w:sz w:val="20"/>
-                <w:szCs w:val="20"/>
-              </w:rPr>
-              <w:t>[CONS_</w:t>
-            </w:r>
-            <w:r>
-              <w:rPr>
-                <w:rFonts w:ascii="Arvo" w:hAnsi="Arvo"/>
-                <w:sz w:val="20"/>
-                <w:szCs w:val="20"/>
-              </w:rPr>
-              <w:t>PRECO</w:t>
-            </w:r>
-            <w:r>
-              <w:rPr>
-                <w:rFonts w:ascii="Arvo" w:hAnsi="Arvo"/>
-                <w:sz w:val="20"/>
-                <w:szCs w:val="20"/>
-              </w:rPr>
-              <w:t>_</w:t>
-            </w:r>
-            <w:r>
-              <w:rPr>
-                <w:rFonts w:ascii="Arvo" w:hAnsi="Arvo"/>
-                <w:sz w:val="20"/>
-                <w:szCs w:val="20"/>
-              </w:rPr>
-              <w:t>GLOBAL</w:t>
-            </w:r>
-            <w:r>
-              <w:rPr>
-                <w:rFonts w:ascii="Arvo" w:hAnsi="Arvo"/>
-                <w:sz w:val="20"/>
-                <w:szCs w:val="20"/>
-              </w:rPr>
-              <w:t>_CAP] horas</w:t>
-            </w:r>
           </w:p>
         </w:tc>
       </w:tr>

</xml_diff>

<commit_message>
Atualiza template Markers e rebuilda Jinja (96 markers convertidos)
https://claude.ai/code/session_01QYVgUedAdGPCf2tFmVT5S5
</commit_message>
<xml_diff>
--- a/resources/templates/PMRA_Template_Jinja.docx
+++ b/resources/templates/PMRA_Template_Jinja.docx
@@ -1297,7 +1297,25 @@
           <w:sz w:val="20"/>
           <w:szCs w:val="20"/>
         </w:rPr>
-        <w:t>, ao valor de {{consultiva.hora_fixa_valor}} por hora dedicada.</w:t>
+        <w:t xml:space="preserve">, ao valor de </w:t>
+      </w:r>
+      <w:r>
+        <w:rPr>
+          <w:rFonts w:ascii="Arvo" w:hAnsi="Arvo"/>
+          <w:b/>
+          <w:bCs/>
+          <w:sz w:val="20"/>
+          <w:szCs w:val="20"/>
+        </w:rPr>
+        <w:t>{{consultiva.hora_fixa_valor}}</w:t>
+      </w:r>
+      <w:r>
+        <w:rPr>
+          <w:rFonts w:ascii="Arvo" w:hAnsi="Arvo"/>
+          <w:sz w:val="20"/>
+          <w:szCs w:val="20"/>
+        </w:rPr>
+        <w:t xml:space="preserve"> por hora dedicada.</w:t>
       </w:r>
     </w:p>
     <w:p>
@@ -1879,8 +1897,8 @@
         <w:tblLook w:val="04A0" w:firstRow="1" w:lastRow="0" w:firstColumn="1" w:lastColumn="0" w:noHBand="0" w:noVBand="1"/>
       </w:tblPr>
       <w:tblGrid>
-        <w:gridCol w:w="3256"/>
-        <w:gridCol w:w="6378"/>
+        <w:gridCol w:w="4370"/>
+        <w:gridCol w:w="5264"/>
       </w:tblGrid>
       <w:tr>
         <w:tc>
@@ -2098,7 +2116,7 @@
                 <w:sz w:val="20"/>
                 <w:szCs w:val="20"/>
               </w:rPr>
-              <w:t xml:space="preserve">{{consultiva.valor_projeto_cap}} horas</w:t>
+              <w:t>{{consultiva.valor_projeto_cap}} horas</w:t>
             </w:r>
           </w:p>
         </w:tc>
@@ -2353,7 +2371,16 @@
           <w:sz w:val="20"/>
           <w:szCs w:val="20"/>
         </w:rPr>
-        <w:t xml:space="preserve"> as Partes negociarão, de boa-fé, o reajuste proporcional dos honorários, a ser formalizado por aditamento a esta Proposta. Serviços prestados fora do escopo definido, sem a devida formalização, serão remunerados conforme a tabela horária vigente aplicável à modalidade correspondente.</w:t>
+        <w:t xml:space="preserve"> as Partes negociarão, de boa-fé, o reajuste </w:t>
+      </w:r>
+      <w:r>
+        <w:rPr>
+          <w:rFonts w:ascii="Arvo" w:hAnsi="Arvo"/>
+          <w:sz w:val="20"/>
+          <w:szCs w:val="20"/>
+        </w:rPr>
+        <w:lastRenderedPageBreak/>
+        <w:t>proporcional dos honorários, a ser formalizado por aditamento a esta Proposta. Serviços prestados fora do escopo definido, sem a devida formalização, serão remunerados conforme a tabela horária vigente aplicável à modalidade correspondente.</w:t>
       </w:r>
     </w:p>
     <w:p>
@@ -2417,7 +2444,6 @@
           <w:sz w:val="2"/>
           <w:szCs w:val="2"/>
         </w:rPr>
-        <w:lastRenderedPageBreak/>
         <w:t>{%p if escopo.show_contenciosa %}</w:t>
       </w:r>
     </w:p>
@@ -4018,6 +4044,7 @@
           <w:sz w:val="20"/>
           <w:szCs w:val="20"/>
         </w:rPr>
+        <w:lastRenderedPageBreak/>
         <w:t>Preço Global</w:t>
       </w:r>
     </w:p>
@@ -4126,7 +4153,6 @@
                 <w:sz w:val="20"/>
                 <w:szCs w:val="20"/>
               </w:rPr>
-              <w:lastRenderedPageBreak/>
               <w:t>Valor Total</w:t>
             </w:r>
           </w:p>
@@ -5167,6 +5193,7 @@
           <w:sz w:val="20"/>
           <w:szCs w:val="20"/>
         </w:rPr>
+        <w:lastRenderedPageBreak/>
         <w:t>Hora Fixa (independente do executor)</w:t>
       </w:r>
     </w:p>
@@ -6372,6 +6399,7 @@
           <w:sz w:val="20"/>
           <w:szCs w:val="20"/>
         </w:rPr>
+        <w:lastRenderedPageBreak/>
         <w:t>OBJETO</w:t>
       </w:r>
     </w:p>
@@ -6476,16 +6504,7 @@
           <w:sz w:val="20"/>
           <w:szCs w:val="20"/>
         </w:rPr>
-        <w:t xml:space="preserve"> Termos e Condições. </w:t>
-      </w:r>
-      <w:r>
-        <w:rPr>
-          <w:rFonts w:ascii="Arvo" w:hAnsi="Arvo"/>
-          <w:sz w:val="20"/>
-          <w:szCs w:val="20"/>
-        </w:rPr>
-        <w:lastRenderedPageBreak/>
-        <w:t>Eventuais alterações</w:t>
+        <w:t xml:space="preserve"> Termos e Condições. Eventuais alterações</w:t>
       </w:r>
       <w:r>
         <w:rPr>
@@ -7114,6 +7133,7 @@
           <w:sz w:val="20"/>
           <w:szCs w:val="20"/>
         </w:rPr>
+        <w:lastRenderedPageBreak/>
         <w:t>Caso aplicável a esta Proposta, os honorários de sucumbência arbitrados em favor da parte patrocinada, nos termos do artigo 85 do Código de Processo Civil e do artigo 22 da Lei n. 8.906/1994, pertencem com exclusividade ao Contratado.</w:t>
       </w:r>
     </w:p>
@@ -7196,7 +7216,6 @@
           <w:sz w:val="20"/>
           <w:szCs w:val="20"/>
         </w:rPr>
-        <w:lastRenderedPageBreak/>
         <w:t xml:space="preserve">As despesas incorridas pelo Contratado </w:t>
       </w:r>
       <w:r>
@@ -7843,7 +7862,6 @@
           <w:sz w:val="20"/>
           <w:szCs w:val="20"/>
         </w:rPr>
-        <w:lastRenderedPageBreak/>
         <w:t xml:space="preserve">Abster-se de atuar em demandas em que se verifique incompatibilidade </w:t>
       </w:r>
       <w:r>
@@ -8259,7 +8277,16 @@
           <w:sz w:val="20"/>
           <w:szCs w:val="20"/>
         </w:rPr>
-        <w:t>, sem prejuízo das sanções legais cabíveis e do ressarcimento integral dos prejuízos experimentados pela Parte inocente, obrigando-se cada Parte a notificar a outra imediatamente, por escrito, ao tomar conhecimento de qualquer indício de descumprimento, cooperando de boa-fé para a sua apuração.</w:t>
+        <w:t xml:space="preserve">, sem prejuízo das sanções legais cabíveis e do ressarcimento integral dos prejuízos experimentados pela Parte inocente, obrigando-se cada Parte a notificar a outra imediatamente, por escrito, ao </w:t>
+      </w:r>
+      <w:r>
+        <w:rPr>
+          <w:rFonts w:ascii="Arvo" w:hAnsi="Arvo"/>
+          <w:sz w:val="20"/>
+          <w:szCs w:val="20"/>
+        </w:rPr>
+        <w:lastRenderedPageBreak/>
+        <w:t>tomar conhecimento de qualquer indício de descumprimento, cooperando de boa-fé para a sua apuração.</w:t>
       </w:r>
     </w:p>
     <w:p>
@@ -8297,7 +8324,6 @@
           <w:sz w:val="20"/>
           <w:szCs w:val="20"/>
         </w:rPr>
-        <w:lastRenderedPageBreak/>
         <w:t>CONFIDENCIALIDADE</w:t>
       </w:r>
     </w:p>
@@ -8643,6 +8669,7 @@
           <w:sz w:val="20"/>
           <w:szCs w:val="20"/>
         </w:rPr>
+        <w:lastRenderedPageBreak/>
         <w:t xml:space="preserve">As Partes comprometem-se a adotar medidas técnicas e administrativas adequadas para proteger os dados pessoais tratados contra acessos não autorizados e situações ilícitas, a não </w:t>
       </w:r>
       <w:r>
@@ -8659,16 +8686,7 @@
           <w:sz w:val="20"/>
           <w:szCs w:val="20"/>
         </w:rPr>
-        <w:t xml:space="preserve"> fora das hipóteses legais ou contratuais, a submeter eventuais suboperadores a obrigações equivalentes e a notificar a outra Parte, em até 24 (vinte e quatro) </w:t>
-      </w:r>
-      <w:r>
-        <w:rPr>
-          <w:rFonts w:ascii="Arvo" w:hAnsi="Arvo"/>
-          <w:sz w:val="20"/>
-          <w:szCs w:val="20"/>
-        </w:rPr>
-        <w:lastRenderedPageBreak/>
-        <w:t>horas da ciência, de qualquer incidente de segurança envolvendo dados pessoais desta contratação.</w:t>
+        <w:t xml:space="preserve"> fora das hipóteses legais ou contratuais, a submeter eventuais suboperadores a obrigações equivalentes e a notificar a outra Parte, em até 24 (vinte e quatro) horas da ciência, de qualquer incidente de segurança envolvendo dados pessoais desta contratação.</w:t>
       </w:r>
     </w:p>
     <w:p>
@@ -9140,6 +9158,7 @@
           <w:sz w:val="20"/>
           <w:szCs w:val="20"/>
         </w:rPr>
+        <w:lastRenderedPageBreak/>
         <w:t>A presente Proposta</w:t>
       </w:r>
       <w:r>
@@ -9193,7 +9212,6 @@
           <w:sz w:val="20"/>
           <w:szCs w:val="20"/>
         </w:rPr>
-        <w:lastRenderedPageBreak/>
         <w:t xml:space="preserve">A declarada nulidade, invalidade ou ineficácia de qualquer disposição não afetará as demais, permanecendo </w:t>
       </w:r>
       <w:r>
@@ -9801,6 +9819,7 @@
           <w:sz w:val="20"/>
           <w:szCs w:val="20"/>
         </w:rPr>
+        <w:lastRenderedPageBreak/>
         <w:t>(preencher e assinar caso firmado com assinaturas físicas ou por meio de certificado digital)</w:t>
       </w:r>
     </w:p>
@@ -9916,7 +9935,6 @@
                 <w:sz w:val="20"/>
                 <w:szCs w:val="20"/>
               </w:rPr>
-              <w:lastRenderedPageBreak/>
               <w:t>____________________________________________</w:t>
             </w:r>
           </w:p>
@@ -11485,26 +11503,6 @@
 </file>
 
 <file path=customXml/item1.xml><?xml version="1.0" encoding="utf-8"?>
-<?mso-contentType ?>
-<FormTemplates xmlns="http://schemas.microsoft.com/sharepoint/v3/contenttype/forms">
-  <Display>DocumentLibraryForm</Display>
-  <Edit>DocumentLibraryForm</Edit>
-  <New>DocumentLibraryForm</New>
-</FormTemplates>
-</file>
-
-<file path=customXml/item2.xml><?xml version="1.0" encoding="utf-8"?>
-<p:properties xmlns:p="http://schemas.microsoft.com/office/2006/metadata/properties" xmlns:xsi="http://www.w3.org/2001/XMLSchema-instance" xmlns:pc="http://schemas.microsoft.com/office/infopath/2007/PartnerControls">
-  <documentManagement>
-    <lcf76f155ced4ddcb4097134ff3c332f xmlns="e5b1cd33-4eca-41a4-b7d8-fdf3e6200119">
-      <Terms xmlns="http://schemas.microsoft.com/office/infopath/2007/PartnerControls"/>
-    </lcf76f155ced4ddcb4097134ff3c332f>
-    <TaxCatchAll xmlns="c710a95f-4097-48d0-b72e-528dcf24b561" xsi:nil="true"/>
-  </documentManagement>
-</p:properties>
-</file>
-
-<file path=customXml/item3.xml><?xml version="1.0" encoding="utf-8"?>
 <ct:contentTypeSchema xmlns:ct="http://schemas.microsoft.com/office/2006/metadata/contentType" xmlns:ma="http://schemas.microsoft.com/office/2006/metadata/properties/metaAttributes" ct:_="" ma:_="" ma:contentTypeName="Documento" ma:contentTypeID="0x010100C538FE3DE9F5C249B208F757A39C9CF1" ma:contentTypeVersion="13" ma:contentTypeDescription="Crie um novo documento." ma:contentTypeScope="" ma:versionID="f58841031a2b8acc55807e179e1eb129">
   <xsd:schema xmlns:xsd="http://www.w3.org/2001/XMLSchema" xmlns:xs="http://www.w3.org/2001/XMLSchema" xmlns:p="http://schemas.microsoft.com/office/2006/metadata/properties" xmlns:ns2="e5b1cd33-4eca-41a4-b7d8-fdf3e6200119" xmlns:ns3="c710a95f-4097-48d0-b72e-528dcf24b561" targetNamespace="http://schemas.microsoft.com/office/2006/metadata/properties" ma:root="true" ma:fieldsID="eabb80da9e4a7645788b9624de58e5c8" ns2:_="" ns3:_="">
     <xsd:import namespace="e5b1cd33-4eca-41a4-b7d8-fdf3e6200119"/>
@@ -11711,10 +11709,41 @@
 </ct:contentTypeSchema>
 </file>
 
+<file path=customXml/item2.xml><?xml version="1.0" encoding="utf-8"?>
+<p:properties xmlns:p="http://schemas.microsoft.com/office/2006/metadata/properties" xmlns:xsi="http://www.w3.org/2001/XMLSchema-instance" xmlns:pc="http://schemas.microsoft.com/office/infopath/2007/PartnerControls">
+  <documentManagement>
+    <lcf76f155ced4ddcb4097134ff3c332f xmlns="e5b1cd33-4eca-41a4-b7d8-fdf3e6200119">
+      <Terms xmlns="http://schemas.microsoft.com/office/infopath/2007/PartnerControls"/>
+    </lcf76f155ced4ddcb4097134ff3c332f>
+    <TaxCatchAll xmlns="c710a95f-4097-48d0-b72e-528dcf24b561" xsi:nil="true"/>
+  </documentManagement>
+</p:properties>
+</file>
+
+<file path=customXml/item3.xml><?xml version="1.0" encoding="utf-8"?>
+<?mso-contentType ?>
+<FormTemplates xmlns="http://schemas.microsoft.com/sharepoint/v3/contenttype/forms">
+  <Display>DocumentLibraryForm</Display>
+  <Edit>DocumentLibraryForm</Edit>
+  <New>DocumentLibraryForm</New>
+</FormTemplates>
+</file>
+
 <file path=customXml/itemProps1.xml><?xml version="1.0" encoding="utf-8"?>
-<ds:datastoreItem xmlns:ds="http://schemas.openxmlformats.org/officeDocument/2006/customXml" ds:itemID="{A5ED3DFB-4F39-4BF8-995C-27FE2C86527B}">
+<ds:datastoreItem xmlns:ds="http://schemas.openxmlformats.org/officeDocument/2006/customXml" ds:itemID="{527C8FAF-F895-460C-92FD-63B7C6027339}">
   <ds:schemaRefs>
-    <ds:schemaRef ds:uri="http://schemas.microsoft.com/sharepoint/v3/contenttype/forms"/>
+    <ds:schemaRef ds:uri="http://schemas.microsoft.com/office/2006/metadata/contentType"/>
+    <ds:schemaRef ds:uri="http://schemas.microsoft.com/office/2006/metadata/properties/metaAttributes"/>
+    <ds:schemaRef ds:uri="http://www.w3.org/2001/XMLSchema"/>
+    <ds:schemaRef ds:uri="http://schemas.microsoft.com/office/2006/metadata/properties"/>
+    <ds:schemaRef ds:uri="e5b1cd33-4eca-41a4-b7d8-fdf3e6200119"/>
+    <ds:schemaRef ds:uri="c710a95f-4097-48d0-b72e-528dcf24b561"/>
+    <ds:schemaRef ds:uri="http://schemas.microsoft.com/office/2006/documentManagement/types"/>
+    <ds:schemaRef ds:uri="http://schemas.microsoft.com/office/infopath/2007/PartnerControls"/>
+    <ds:schemaRef ds:uri="http://schemas.openxmlformats.org/package/2006/metadata/core-properties"/>
+    <ds:schemaRef ds:uri="http://purl.org/dc/elements/1.1/"/>
+    <ds:schemaRef ds:uri="http://purl.org/dc/terms/"/>
+    <ds:schemaRef ds:uri="http://schemas.microsoft.com/internal/obd"/>
   </ds:schemaRefs>
 </ds:datastoreItem>
 </file>
@@ -11731,20 +11760,9 @@
 </file>
 
 <file path=customXml/itemProps3.xml><?xml version="1.0" encoding="utf-8"?>
-<ds:datastoreItem xmlns:ds="http://schemas.openxmlformats.org/officeDocument/2006/customXml" ds:itemID="{527C8FAF-F895-460C-92FD-63B7C6027339}">
+<ds:datastoreItem xmlns:ds="http://schemas.openxmlformats.org/officeDocument/2006/customXml" ds:itemID="{A5ED3DFB-4F39-4BF8-995C-27FE2C86527B}">
   <ds:schemaRefs>
-    <ds:schemaRef ds:uri="http://schemas.microsoft.com/office/2006/metadata/contentType"/>
-    <ds:schemaRef ds:uri="http://schemas.microsoft.com/office/2006/metadata/properties/metaAttributes"/>
-    <ds:schemaRef ds:uri="http://www.w3.org/2001/XMLSchema"/>
-    <ds:schemaRef ds:uri="http://schemas.microsoft.com/office/2006/metadata/properties"/>
-    <ds:schemaRef ds:uri="e5b1cd33-4eca-41a4-b7d8-fdf3e6200119"/>
-    <ds:schemaRef ds:uri="c710a95f-4097-48d0-b72e-528dcf24b561"/>
-    <ds:schemaRef ds:uri="http://schemas.microsoft.com/office/2006/documentManagement/types"/>
-    <ds:schemaRef ds:uri="http://schemas.microsoft.com/office/infopath/2007/PartnerControls"/>
-    <ds:schemaRef ds:uri="http://schemas.openxmlformats.org/package/2006/metadata/core-properties"/>
-    <ds:schemaRef ds:uri="http://purl.org/dc/elements/1.1/"/>
-    <ds:schemaRef ds:uri="http://purl.org/dc/terms/"/>
-    <ds:schemaRef ds:uri="http://schemas.microsoft.com/internal/obd"/>
+    <ds:schemaRef ds:uri="http://schemas.microsoft.com/sharepoint/v3/contenttype/forms"/>
   </ds:schemaRefs>
 </ds:datastoreItem>
 </file>
</xml_diff>

<commit_message>
Atualiza template Markers e rebuilda Jinja (v2.0.23)
https://claude.ai/code/session_01QYVgUedAdGPCf2tFmVT5S5

Co-authored-by: Claude <noreply@anthropic.com>
</commit_message>
<xml_diff>
--- a/resources/templates/PMRA_Template_Jinja.docx
+++ b/resources/templates/PMRA_Template_Jinja.docx
@@ -1297,7 +1297,25 @@
           <w:sz w:val="20"/>
           <w:szCs w:val="20"/>
         </w:rPr>
-        <w:t>, ao valor de {{consultiva.hora_fixa_valor}} por hora dedicada.</w:t>
+        <w:t xml:space="preserve">, ao valor de </w:t>
+      </w:r>
+      <w:r>
+        <w:rPr>
+          <w:rFonts w:ascii="Arvo" w:hAnsi="Arvo"/>
+          <w:b/>
+          <w:bCs/>
+          <w:sz w:val="20"/>
+          <w:szCs w:val="20"/>
+        </w:rPr>
+        <w:t>{{consultiva.hora_fixa_valor}}</w:t>
+      </w:r>
+      <w:r>
+        <w:rPr>
+          <w:rFonts w:ascii="Arvo" w:hAnsi="Arvo"/>
+          <w:sz w:val="20"/>
+          <w:szCs w:val="20"/>
+        </w:rPr>
+        <w:t xml:space="preserve"> por hora dedicada.</w:t>
       </w:r>
     </w:p>
     <w:p>
@@ -1879,8 +1897,8 @@
         <w:tblLook w:val="04A0" w:firstRow="1" w:lastRow="0" w:firstColumn="1" w:lastColumn="0" w:noHBand="0" w:noVBand="1"/>
       </w:tblPr>
       <w:tblGrid>
-        <w:gridCol w:w="3256"/>
-        <w:gridCol w:w="6378"/>
+        <w:gridCol w:w="4370"/>
+        <w:gridCol w:w="5264"/>
       </w:tblGrid>
       <w:tr>
         <w:tc>
@@ -2098,7 +2116,7 @@
                 <w:sz w:val="20"/>
                 <w:szCs w:val="20"/>
               </w:rPr>
-              <w:t xml:space="preserve">{{consultiva.valor_projeto_cap}} horas</w:t>
+              <w:t>{{consultiva.valor_projeto_cap}} horas</w:t>
             </w:r>
           </w:p>
         </w:tc>
@@ -2353,7 +2371,16 @@
           <w:sz w:val="20"/>
           <w:szCs w:val="20"/>
         </w:rPr>
-        <w:t xml:space="preserve"> as Partes negociarão, de boa-fé, o reajuste proporcional dos honorários, a ser formalizado por aditamento a esta Proposta. Serviços prestados fora do escopo definido, sem a devida formalização, serão remunerados conforme a tabela horária vigente aplicável à modalidade correspondente.</w:t>
+        <w:t xml:space="preserve"> as Partes negociarão, de boa-fé, o reajuste </w:t>
+      </w:r>
+      <w:r>
+        <w:rPr>
+          <w:rFonts w:ascii="Arvo" w:hAnsi="Arvo"/>
+          <w:sz w:val="20"/>
+          <w:szCs w:val="20"/>
+        </w:rPr>
+        <w:lastRenderedPageBreak/>
+        <w:t>proporcional dos honorários, a ser formalizado por aditamento a esta Proposta. Serviços prestados fora do escopo definido, sem a devida formalização, serão remunerados conforme a tabela horária vigente aplicável à modalidade correspondente.</w:t>
       </w:r>
     </w:p>
     <w:p>
@@ -2417,7 +2444,6 @@
           <w:sz w:val="2"/>
           <w:szCs w:val="2"/>
         </w:rPr>
-        <w:lastRenderedPageBreak/>
         <w:t>{%p if escopo.show_contenciosa %}</w:t>
       </w:r>
     </w:p>
@@ -4018,6 +4044,7 @@
           <w:sz w:val="20"/>
           <w:szCs w:val="20"/>
         </w:rPr>
+        <w:lastRenderedPageBreak/>
         <w:t>Preço Global</w:t>
       </w:r>
     </w:p>
@@ -4126,7 +4153,6 @@
                 <w:sz w:val="20"/>
                 <w:szCs w:val="20"/>
               </w:rPr>
-              <w:lastRenderedPageBreak/>
               <w:t>Valor Total</w:t>
             </w:r>
           </w:p>
@@ -5167,6 +5193,7 @@
           <w:sz w:val="20"/>
           <w:szCs w:val="20"/>
         </w:rPr>
+        <w:lastRenderedPageBreak/>
         <w:t>Hora Fixa (independente do executor)</w:t>
       </w:r>
     </w:p>
@@ -6372,6 +6399,7 @@
           <w:sz w:val="20"/>
           <w:szCs w:val="20"/>
         </w:rPr>
+        <w:lastRenderedPageBreak/>
         <w:t>OBJETO</w:t>
       </w:r>
     </w:p>
@@ -6476,16 +6504,7 @@
           <w:sz w:val="20"/>
           <w:szCs w:val="20"/>
         </w:rPr>
-        <w:t xml:space="preserve"> Termos e Condições. </w:t>
-      </w:r>
-      <w:r>
-        <w:rPr>
-          <w:rFonts w:ascii="Arvo" w:hAnsi="Arvo"/>
-          <w:sz w:val="20"/>
-          <w:szCs w:val="20"/>
-        </w:rPr>
-        <w:lastRenderedPageBreak/>
-        <w:t>Eventuais alterações</w:t>
+        <w:t xml:space="preserve"> Termos e Condições. Eventuais alterações</w:t>
       </w:r>
       <w:r>
         <w:rPr>
@@ -7114,6 +7133,7 @@
           <w:sz w:val="20"/>
           <w:szCs w:val="20"/>
         </w:rPr>
+        <w:lastRenderedPageBreak/>
         <w:t>Caso aplicável a esta Proposta, os honorários de sucumbência arbitrados em favor da parte patrocinada, nos termos do artigo 85 do Código de Processo Civil e do artigo 22 da Lei n. 8.906/1994, pertencem com exclusividade ao Contratado.</w:t>
       </w:r>
     </w:p>
@@ -7196,7 +7216,6 @@
           <w:sz w:val="20"/>
           <w:szCs w:val="20"/>
         </w:rPr>
-        <w:lastRenderedPageBreak/>
         <w:t xml:space="preserve">As despesas incorridas pelo Contratado </w:t>
       </w:r>
       <w:r>
@@ -7843,7 +7862,6 @@
           <w:sz w:val="20"/>
           <w:szCs w:val="20"/>
         </w:rPr>
-        <w:lastRenderedPageBreak/>
         <w:t xml:space="preserve">Abster-se de atuar em demandas em que se verifique incompatibilidade </w:t>
       </w:r>
       <w:r>
@@ -8259,7 +8277,16 @@
           <w:sz w:val="20"/>
           <w:szCs w:val="20"/>
         </w:rPr>
-        <w:t>, sem prejuízo das sanções legais cabíveis e do ressarcimento integral dos prejuízos experimentados pela Parte inocente, obrigando-se cada Parte a notificar a outra imediatamente, por escrito, ao tomar conhecimento de qualquer indício de descumprimento, cooperando de boa-fé para a sua apuração.</w:t>
+        <w:t xml:space="preserve">, sem prejuízo das sanções legais cabíveis e do ressarcimento integral dos prejuízos experimentados pela Parte inocente, obrigando-se cada Parte a notificar a outra imediatamente, por escrito, ao </w:t>
+      </w:r>
+      <w:r>
+        <w:rPr>
+          <w:rFonts w:ascii="Arvo" w:hAnsi="Arvo"/>
+          <w:sz w:val="20"/>
+          <w:szCs w:val="20"/>
+        </w:rPr>
+        <w:lastRenderedPageBreak/>
+        <w:t>tomar conhecimento de qualquer indício de descumprimento, cooperando de boa-fé para a sua apuração.</w:t>
       </w:r>
     </w:p>
     <w:p>
@@ -8297,7 +8324,6 @@
           <w:sz w:val="20"/>
           <w:szCs w:val="20"/>
         </w:rPr>
-        <w:lastRenderedPageBreak/>
         <w:t>CONFIDENCIALIDADE</w:t>
       </w:r>
     </w:p>
@@ -8643,6 +8669,7 @@
           <w:sz w:val="20"/>
           <w:szCs w:val="20"/>
         </w:rPr>
+        <w:lastRenderedPageBreak/>
         <w:t xml:space="preserve">As Partes comprometem-se a adotar medidas técnicas e administrativas adequadas para proteger os dados pessoais tratados contra acessos não autorizados e situações ilícitas, a não </w:t>
       </w:r>
       <w:r>
@@ -8659,16 +8686,7 @@
           <w:sz w:val="20"/>
           <w:szCs w:val="20"/>
         </w:rPr>
-        <w:t xml:space="preserve"> fora das hipóteses legais ou contratuais, a submeter eventuais suboperadores a obrigações equivalentes e a notificar a outra Parte, em até 24 (vinte e quatro) </w:t>
-      </w:r>
-      <w:r>
-        <w:rPr>
-          <w:rFonts w:ascii="Arvo" w:hAnsi="Arvo"/>
-          <w:sz w:val="20"/>
-          <w:szCs w:val="20"/>
-        </w:rPr>
-        <w:lastRenderedPageBreak/>
-        <w:t>horas da ciência, de qualquer incidente de segurança envolvendo dados pessoais desta contratação.</w:t>
+        <w:t xml:space="preserve"> fora das hipóteses legais ou contratuais, a submeter eventuais suboperadores a obrigações equivalentes e a notificar a outra Parte, em até 24 (vinte e quatro) horas da ciência, de qualquer incidente de segurança envolvendo dados pessoais desta contratação.</w:t>
       </w:r>
     </w:p>
     <w:p>
@@ -9140,6 +9158,7 @@
           <w:sz w:val="20"/>
           <w:szCs w:val="20"/>
         </w:rPr>
+        <w:lastRenderedPageBreak/>
         <w:t>A presente Proposta</w:t>
       </w:r>
       <w:r>
@@ -9193,7 +9212,6 @@
           <w:sz w:val="20"/>
           <w:szCs w:val="20"/>
         </w:rPr>
-        <w:lastRenderedPageBreak/>
         <w:t xml:space="preserve">A declarada nulidade, invalidade ou ineficácia de qualquer disposição não afetará as demais, permanecendo </w:t>
       </w:r>
       <w:r>
@@ -9801,6 +9819,7 @@
           <w:sz w:val="20"/>
           <w:szCs w:val="20"/>
         </w:rPr>
+        <w:lastRenderedPageBreak/>
         <w:t>(preencher e assinar caso firmado com assinaturas físicas ou por meio de certificado digital)</w:t>
       </w:r>
     </w:p>
@@ -9916,7 +9935,6 @@
                 <w:sz w:val="20"/>
                 <w:szCs w:val="20"/>
               </w:rPr>
-              <w:lastRenderedPageBreak/>
               <w:t>____________________________________________</w:t>
             </w:r>
           </w:p>
@@ -11485,26 +11503,6 @@
 </file>
 
 <file path=customXml/item1.xml><?xml version="1.0" encoding="utf-8"?>
-<?mso-contentType ?>
-<FormTemplates xmlns="http://schemas.microsoft.com/sharepoint/v3/contenttype/forms">
-  <Display>DocumentLibraryForm</Display>
-  <Edit>DocumentLibraryForm</Edit>
-  <New>DocumentLibraryForm</New>
-</FormTemplates>
-</file>
-
-<file path=customXml/item2.xml><?xml version="1.0" encoding="utf-8"?>
-<p:properties xmlns:p="http://schemas.microsoft.com/office/2006/metadata/properties" xmlns:xsi="http://www.w3.org/2001/XMLSchema-instance" xmlns:pc="http://schemas.microsoft.com/office/infopath/2007/PartnerControls">
-  <documentManagement>
-    <lcf76f155ced4ddcb4097134ff3c332f xmlns="e5b1cd33-4eca-41a4-b7d8-fdf3e6200119">
-      <Terms xmlns="http://schemas.microsoft.com/office/infopath/2007/PartnerControls"/>
-    </lcf76f155ced4ddcb4097134ff3c332f>
-    <TaxCatchAll xmlns="c710a95f-4097-48d0-b72e-528dcf24b561" xsi:nil="true"/>
-  </documentManagement>
-</p:properties>
-</file>
-
-<file path=customXml/item3.xml><?xml version="1.0" encoding="utf-8"?>
 <ct:contentTypeSchema xmlns:ct="http://schemas.microsoft.com/office/2006/metadata/contentType" xmlns:ma="http://schemas.microsoft.com/office/2006/metadata/properties/metaAttributes" ct:_="" ma:_="" ma:contentTypeName="Documento" ma:contentTypeID="0x010100C538FE3DE9F5C249B208F757A39C9CF1" ma:contentTypeVersion="13" ma:contentTypeDescription="Crie um novo documento." ma:contentTypeScope="" ma:versionID="f58841031a2b8acc55807e179e1eb129">
   <xsd:schema xmlns:xsd="http://www.w3.org/2001/XMLSchema" xmlns:xs="http://www.w3.org/2001/XMLSchema" xmlns:p="http://schemas.microsoft.com/office/2006/metadata/properties" xmlns:ns2="e5b1cd33-4eca-41a4-b7d8-fdf3e6200119" xmlns:ns3="c710a95f-4097-48d0-b72e-528dcf24b561" targetNamespace="http://schemas.microsoft.com/office/2006/metadata/properties" ma:root="true" ma:fieldsID="eabb80da9e4a7645788b9624de58e5c8" ns2:_="" ns3:_="">
     <xsd:import namespace="e5b1cd33-4eca-41a4-b7d8-fdf3e6200119"/>
@@ -11711,10 +11709,41 @@
 </ct:contentTypeSchema>
 </file>
 
+<file path=customXml/item2.xml><?xml version="1.0" encoding="utf-8"?>
+<p:properties xmlns:p="http://schemas.microsoft.com/office/2006/metadata/properties" xmlns:xsi="http://www.w3.org/2001/XMLSchema-instance" xmlns:pc="http://schemas.microsoft.com/office/infopath/2007/PartnerControls">
+  <documentManagement>
+    <lcf76f155ced4ddcb4097134ff3c332f xmlns="e5b1cd33-4eca-41a4-b7d8-fdf3e6200119">
+      <Terms xmlns="http://schemas.microsoft.com/office/infopath/2007/PartnerControls"/>
+    </lcf76f155ced4ddcb4097134ff3c332f>
+    <TaxCatchAll xmlns="c710a95f-4097-48d0-b72e-528dcf24b561" xsi:nil="true"/>
+  </documentManagement>
+</p:properties>
+</file>
+
+<file path=customXml/item3.xml><?xml version="1.0" encoding="utf-8"?>
+<?mso-contentType ?>
+<FormTemplates xmlns="http://schemas.microsoft.com/sharepoint/v3/contenttype/forms">
+  <Display>DocumentLibraryForm</Display>
+  <Edit>DocumentLibraryForm</Edit>
+  <New>DocumentLibraryForm</New>
+</FormTemplates>
+</file>
+
 <file path=customXml/itemProps1.xml><?xml version="1.0" encoding="utf-8"?>
-<ds:datastoreItem xmlns:ds="http://schemas.openxmlformats.org/officeDocument/2006/customXml" ds:itemID="{A5ED3DFB-4F39-4BF8-995C-27FE2C86527B}">
+<ds:datastoreItem xmlns:ds="http://schemas.openxmlformats.org/officeDocument/2006/customXml" ds:itemID="{527C8FAF-F895-460C-92FD-63B7C6027339}">
   <ds:schemaRefs>
-    <ds:schemaRef ds:uri="http://schemas.microsoft.com/sharepoint/v3/contenttype/forms"/>
+    <ds:schemaRef ds:uri="http://schemas.microsoft.com/office/2006/metadata/contentType"/>
+    <ds:schemaRef ds:uri="http://schemas.microsoft.com/office/2006/metadata/properties/metaAttributes"/>
+    <ds:schemaRef ds:uri="http://www.w3.org/2001/XMLSchema"/>
+    <ds:schemaRef ds:uri="http://schemas.microsoft.com/office/2006/metadata/properties"/>
+    <ds:schemaRef ds:uri="e5b1cd33-4eca-41a4-b7d8-fdf3e6200119"/>
+    <ds:schemaRef ds:uri="c710a95f-4097-48d0-b72e-528dcf24b561"/>
+    <ds:schemaRef ds:uri="http://schemas.microsoft.com/office/2006/documentManagement/types"/>
+    <ds:schemaRef ds:uri="http://schemas.microsoft.com/office/infopath/2007/PartnerControls"/>
+    <ds:schemaRef ds:uri="http://schemas.openxmlformats.org/package/2006/metadata/core-properties"/>
+    <ds:schemaRef ds:uri="http://purl.org/dc/elements/1.1/"/>
+    <ds:schemaRef ds:uri="http://purl.org/dc/terms/"/>
+    <ds:schemaRef ds:uri="http://schemas.microsoft.com/internal/obd"/>
   </ds:schemaRefs>
 </ds:datastoreItem>
 </file>
@@ -11731,20 +11760,9 @@
 </file>
 
 <file path=customXml/itemProps3.xml><?xml version="1.0" encoding="utf-8"?>
-<ds:datastoreItem xmlns:ds="http://schemas.openxmlformats.org/officeDocument/2006/customXml" ds:itemID="{527C8FAF-F895-460C-92FD-63B7C6027339}">
+<ds:datastoreItem xmlns:ds="http://schemas.openxmlformats.org/officeDocument/2006/customXml" ds:itemID="{A5ED3DFB-4F39-4BF8-995C-27FE2C86527B}">
   <ds:schemaRefs>
-    <ds:schemaRef ds:uri="http://schemas.microsoft.com/office/2006/metadata/contentType"/>
-    <ds:schemaRef ds:uri="http://schemas.microsoft.com/office/2006/metadata/properties/metaAttributes"/>
-    <ds:schemaRef ds:uri="http://www.w3.org/2001/XMLSchema"/>
-    <ds:schemaRef ds:uri="http://schemas.microsoft.com/office/2006/metadata/properties"/>
-    <ds:schemaRef ds:uri="e5b1cd33-4eca-41a4-b7d8-fdf3e6200119"/>
-    <ds:schemaRef ds:uri="c710a95f-4097-48d0-b72e-528dcf24b561"/>
-    <ds:schemaRef ds:uri="http://schemas.microsoft.com/office/2006/documentManagement/types"/>
-    <ds:schemaRef ds:uri="http://schemas.microsoft.com/office/infopath/2007/PartnerControls"/>
-    <ds:schemaRef ds:uri="http://schemas.openxmlformats.org/package/2006/metadata/core-properties"/>
-    <ds:schemaRef ds:uri="http://purl.org/dc/elements/1.1/"/>
-    <ds:schemaRef ds:uri="http://purl.org/dc/terms/"/>
-    <ds:schemaRef ds:uri="http://schemas.microsoft.com/internal/obd"/>
+    <ds:schemaRef ds:uri="http://schemas.microsoft.com/sharepoint/v3/contenttype/forms"/>
   </ds:schemaRefs>
 </ds:datastoreItem>
 </file>
</xml_diff>

<commit_message>
Fix template: êxito/horas extra estavam dentro do "not forma_por_escopo"
Sem o patch, ao gerar proposta no modo forma_pagamento_por_escopo_contenciosa,
as seções de Honorários de Êxito e Horas Extra Escopo desapareciam, pois
ficaram envolvidas pelo condicional `not contenciosa.forma_por_escopo`
adicionado pelo commit estrutural.

Patch: scripts/fix_template_exito.py move o `{%p endif %}` antes do bloco
de êxito e abre um novo `{%p if escopo.show_contenciosa %}` que vai até o
endif original, garantindo que êxito + horas extra renderizem sempre que
houver atuação contenciosa, independente do modo.

Inclui também scripts/generate_demo.py: gera proposta demo com 3 escopos
distintos A/B/C por modalidade, cada um com forma de pagamento independente
e todos os campos preenchidos.

https://claude.ai/code/session_012AQuGGrkZo1QrHGcyvhfSB
</commit_message>
<xml_diff>
--- a/resources/templates/PMRA_Template_Jinja.docx
+++ b/resources/templates/PMRA_Template_Jinja.docx
@@ -4918,6 +4918,42 @@
           <w:szCs w:val="2"/>
         </w:rPr>
         <w:t>{%p endif %}</w:t>
+      </w:r>
+    </w:p>
+    <w:p>
+      <w:pPr>
+        <w:spacing w:line="276" w:lineRule="auto"/>
+        <w:rPr>
+          <w:rFonts w:ascii="Arvo" w:hAnsi="Arvo"/>
+          <w:sz w:val="2"/>
+          <w:szCs w:val="2"/>
+        </w:rPr>
+      </w:pPr>
+      <w:r>
+        <w:rPr>
+          <w:rFonts w:ascii="Arvo" w:hAnsi="Arvo"/>
+          <w:sz w:val="2"/>
+          <w:szCs w:val="2"/>
+        </w:rPr>
+        <w:t>{%p endif %}</w:t>
+      </w:r>
+    </w:p>
+    <w:p>
+      <w:pPr>
+        <w:spacing w:line="276" w:lineRule="auto"/>
+        <w:rPr>
+          <w:rFonts w:ascii="Arvo" w:hAnsi="Arvo"/>
+          <w:sz w:val="2"/>
+          <w:szCs w:val="2"/>
+        </w:rPr>
+      </w:pPr>
+      <w:r>
+        <w:rPr>
+          <w:rFonts w:ascii="Arvo" w:hAnsi="Arvo"/>
+          <w:sz w:val="2"/>
+          <w:szCs w:val="2"/>
+        </w:rPr>
+        <w:t>{%p if escopo.show_contenciosa %}</w:t>
       </w:r>
     </w:p>
     <w:p>

</xml_diff>

<commit_message>
fix: pré-preenche tabelas em multi-escopo e inline honorários por escopo
Issue 1: tabelas de senioridade e atos processuais agora vêm pré-preenchidas
ao criar novos escopos no modo multi-escopo. _hon_cons_default e
_hon_cont_default passam a incluir SENIORIDADE_DEFAULT e
ATOS_PROCESSUAIS_DEFAULT respectivamente; sessão Streamlit é pré-populada
antes de _render_rows para que o widget exiba os defaults.

Issue 2: quando forma_pagamento_por_escopo está ativo, cada honorários agora
aparece imediatamente abaixo do escopo correspondente no documento final
(Escopo A → Honorários A → Escopo B → Honorários B). A seção consolidada
"Honorários Propostos para os Escopos X" foi removida neste fluxo via
show_consolidated=False. Template atualizado com {{p item.subdoc}} inline
nos loops de itens_consultivos e itens_contenciosos.

https://claude.ai/code/session_012snjMX98d8NAZ9MosCsbYN
</commit_message>
<xml_diff>
--- a/resources/templates/PMRA_Template_Jinja.docx
+++ b/resources/templates/PMRA_Template_Jinja.docx
@@ -623,6 +623,60 @@
         <w:spacing w:line="276" w:lineRule="auto"/>
         <w:rPr>
           <w:rFonts w:ascii="Arvo" w:hAnsi="Arvo"/>
+          <w:sz w:val="2"/>
+          <w:szCs w:val="2"/>
+        </w:rPr>
+      </w:pPr>
+      <w:r>
+        <w:rPr>
+          <w:rFonts w:ascii="Arvo" w:hAnsi="Arvo"/>
+          <w:sz w:val="2"/>
+          <w:szCs w:val="2"/>
+        </w:rPr>
+        <w:t>{%p if item.subdoc %}</w:t>
+      </w:r>
+    </w:p>
+    <w:p>
+      <w:pPr>
+        <w:spacing w:line="276" w:lineRule="auto"/>
+        <w:rPr>
+          <w:rFonts w:ascii="Arvo" w:hAnsi="Arvo"/>
+          <w:sz w:val="2"/>
+          <w:szCs w:val="2"/>
+        </w:rPr>
+      </w:pPr>
+      <w:r>
+        <w:rPr>
+          <w:rFonts w:ascii="Arvo" w:hAnsi="Arvo"/>
+          <w:sz w:val="2"/>
+          <w:szCs w:val="2"/>
+        </w:rPr>
+        <w:t>{{p item.subdoc}}</w:t>
+      </w:r>
+    </w:p>
+    <w:p>
+      <w:pPr>
+        <w:spacing w:line="276" w:lineRule="auto"/>
+        <w:rPr>
+          <w:rFonts w:ascii="Arvo" w:hAnsi="Arvo"/>
+          <w:sz w:val="2"/>
+          <w:szCs w:val="2"/>
+        </w:rPr>
+      </w:pPr>
+      <w:r>
+        <w:rPr>
+          <w:rFonts w:ascii="Arvo" w:hAnsi="Arvo"/>
+          <w:sz w:val="2"/>
+          <w:szCs w:val="2"/>
+        </w:rPr>
+        <w:t>{%p endif %}</w:t>
+      </w:r>
+    </w:p>
+    <w:p>
+      <w:pPr>
+        <w:spacing w:line="276" w:lineRule="auto"/>
+        <w:rPr>
+          <w:rFonts w:ascii="Arvo" w:hAnsi="Arvo"/>
           <w:sz w:val="20"/>
           <w:szCs w:val="20"/>
         </w:rPr>
@@ -970,6 +1024,60 @@
           <w:szCs w:val="20"/>
         </w:rPr>
         <w:t xml:space="preserve">{{item.descricao}}</w:t>
+      </w:r>
+    </w:p>
+    <w:p>
+      <w:pPr>
+        <w:spacing w:line="276" w:lineRule="auto"/>
+        <w:rPr>
+          <w:rFonts w:ascii="Arvo" w:hAnsi="Arvo"/>
+          <w:sz w:val="2"/>
+          <w:szCs w:val="2"/>
+        </w:rPr>
+      </w:pPr>
+      <w:r>
+        <w:rPr>
+          <w:rFonts w:ascii="Arvo" w:hAnsi="Arvo"/>
+          <w:sz w:val="2"/>
+          <w:szCs w:val="2"/>
+        </w:rPr>
+        <w:t>{%p if item.subdoc %}</w:t>
+      </w:r>
+    </w:p>
+    <w:p>
+      <w:pPr>
+        <w:spacing w:line="276" w:lineRule="auto"/>
+        <w:rPr>
+          <w:rFonts w:ascii="Arvo" w:hAnsi="Arvo"/>
+          <w:sz w:val="2"/>
+          <w:szCs w:val="2"/>
+        </w:rPr>
+      </w:pPr>
+      <w:r>
+        <w:rPr>
+          <w:rFonts w:ascii="Arvo" w:hAnsi="Arvo"/>
+          <w:sz w:val="2"/>
+          <w:szCs w:val="2"/>
+        </w:rPr>
+        <w:t>{{p item.subdoc}}</w:t>
+      </w:r>
+    </w:p>
+    <w:p>
+      <w:pPr>
+        <w:spacing w:line="276" w:lineRule="auto"/>
+        <w:rPr>
+          <w:rFonts w:ascii="Arvo" w:hAnsi="Arvo"/>
+          <w:sz w:val="2"/>
+          <w:szCs w:val="2"/>
+        </w:rPr>
+      </w:pPr>
+      <w:r>
+        <w:rPr>
+          <w:rFonts w:ascii="Arvo" w:hAnsi="Arvo"/>
+          <w:sz w:val="2"/>
+          <w:szCs w:val="2"/>
+        </w:rPr>
+        <w:t>{%p endif %}</w:t>
       </w:r>
     </w:p>
     <w:p>
@@ -2712,7 +2820,7 @@
           <w:sz w:val="2"/>
           <w:szCs w:val="2"/>
         </w:rPr>
-        <w:t>{%p if escopo.show_consultiva and consultiva.forma_por_escopo %}</w:t>
+        <w:t>{%p if escopo.show_consultiva and consultiva.show_consolidated %}</w:t>
       </w:r>
     </w:p>
     <w:p>
@@ -5855,7 +5963,7 @@
           <w:sz w:val="2"/>
           <w:szCs w:val="2"/>
         </w:rPr>
-        <w:t>{%p if escopo.show_contenciosa and contenciosa.forma_por_escopo %}</w:t>
+        <w:t>{%p if escopo.show_contenciosa and contenciosa.show_consolidated %}</w:t>
       </w:r>
     </w:p>
     <w:p>

</xml_diff>

<commit_message>
fix: justifica textos do corpo no template e sincroniza markers map
Adiciona <w:jc w:val="both"/> aos 5 parágrafos do template que renderizam
texto livre do usuário (atuação consultiva, atuação contenciosa, SLA,
disposições específicas, nota das condições específicas), garantindo
alinhamento justificado consistente. Cabeçalho de destinatário e nota de
testemunhas permanecem com alinhamento original (design).

Atualiza markers_map.py para refletir as mudanças do template:
- Adiciona [SE_HONORARIO_INLINE] e [HONORARIO_INLINE] para o subdoc inline
- Renomeia [SE_*_FORMA_POR_ESCOPO] → [SE_*_SECAO_CONSOLIDADA] após troca
  da condição de forma_por_escopo para show_consolidated

https://claude.ai/code/session_012snjMX98d8NAZ9MosCsbYN
</commit_message>
<xml_diff>
--- a/resources/templates/PMRA_Template_Jinja.docx
+++ b/resources/templates/PMRA_Template_Jinja.docx
@@ -504,6 +504,7 @@
           <w:sz w:val="20"/>
           <w:szCs w:val="20"/>
         </w:rPr>
+        <w:jc w:val="both"/>
       </w:pPr>
       <w:r>
         <w:rPr>
@@ -793,6 +794,7 @@
           <w:sz w:val="20"/>
           <w:szCs w:val="20"/>
         </w:rPr>
+        <w:jc w:val="both"/>
       </w:pPr>
       <w:r>
         <w:rPr>
@@ -910,6 +912,7 @@
           <w:sz w:val="20"/>
           <w:szCs w:val="20"/>
         </w:rPr>
+        <w:jc w:val="both"/>
       </w:pPr>
       <w:r>
         <w:rPr>
@@ -6718,6 +6721,7 @@
           <w:sz w:val="20"/>
           <w:szCs w:val="20"/>
         </w:rPr>
+        <w:jc w:val="both"/>
       </w:pPr>
       <w:r>
         <w:rPr>
@@ -6748,6 +6752,7 @@
           <w:sz w:val="20"/>
           <w:szCs w:val="20"/>
         </w:rPr>
+        <w:jc w:val="both"/>
       </w:pPr>
       <w:r>
         <w:rPr>

</xml_diff>

<commit_message>
chore(template): atualiza cláusula LGPD via markers (build_from_markers)
Aplica a edição da cláusula de proteção de dados feita no
PMRA_Template_Markers.docx e regenera o PMRA_Template_Jinja.docx.

Verificado: build_from_markers exit 0 (118 markers, 0 desconhecidos); conjunto
de tags Jinja idêntico ao anterior (48 {{}} + 70 {%%}) — só o texto da cláusula
mudou, nada da intercalação de honorários/justificação foi afetado. 62 testes
passam; smoke e integridade das minutas OK. APP_VERSION → 2.0.35.

https://claude.ai/code/session_01RpmCw8x5rdmexDii3zpYJQ
</commit_message>
<xml_diff>
--- a/resources/templates/PMRA_Template_Jinja.docx
+++ b/resources/templates/PMRA_Template_Jinja.docx
@@ -571,12 +571,12 @@
     <w:p>
       <w:pPr>
         <w:spacing w:line="276" w:lineRule="auto"/>
-        <w:rPr>
-          <w:rFonts w:ascii="Arvo" w:hAnsi="Arvo"/>
-          <w:sz w:val="20"/>
-          <w:szCs w:val="20"/>
-        </w:rPr>
         <w:jc w:val="both"/>
+        <w:rPr>
+          <w:rFonts w:ascii="Arvo" w:hAnsi="Arvo"/>
+          <w:sz w:val="20"/>
+          <w:szCs w:val="20"/>
+        </w:rPr>
       </w:pPr>
       <w:r>
         <w:rPr>
@@ -586,36 +586,36 @@
           <w:sz w:val="20"/>
           <w:szCs w:val="20"/>
         </w:rPr>
-        <w:t xml:space="preserve">Escopo Consultivo {{item.letra}}:</w:t>
-      </w:r>
-    </w:p>
-    <w:p>
-      <w:pPr>
-        <w:spacing w:line="276" w:lineRule="auto"/>
-        <w:rPr>
-          <w:rFonts w:ascii="Arvo" w:hAnsi="Arvo"/>
-          <w:sz w:val="20"/>
-          <w:szCs w:val="20"/>
-        </w:rPr>
-      </w:pPr>
-    </w:p>
-    <w:p>
-      <w:pPr>
-        <w:spacing w:line="276" w:lineRule="auto"/>
-        <w:rPr>
-          <w:rFonts w:ascii="Arvo" w:hAnsi="Arvo"/>
-          <w:sz w:val="20"/>
-          <w:szCs w:val="20"/>
-        </w:rPr>
+        <w:t>Escopo Consultivo {{item.letra}}:</w:t>
+      </w:r>
+    </w:p>
+    <w:p>
+      <w:pPr>
+        <w:spacing w:line="276" w:lineRule="auto"/>
+        <w:rPr>
+          <w:rFonts w:ascii="Arvo" w:hAnsi="Arvo"/>
+          <w:sz w:val="20"/>
+          <w:szCs w:val="20"/>
+        </w:rPr>
+      </w:pPr>
+    </w:p>
+    <w:p>
+      <w:pPr>
+        <w:spacing w:line="276" w:lineRule="auto"/>
         <w:jc w:val="both"/>
-      </w:pPr>
-      <w:r>
-        <w:rPr>
-          <w:rFonts w:ascii="Arvo" w:hAnsi="Arvo"/>
-          <w:sz w:val="20"/>
-          <w:szCs w:val="20"/>
-        </w:rPr>
-        <w:t xml:space="preserve">{{item.descricao}}</w:t>
+        <w:rPr>
+          <w:rFonts w:ascii="Arvo" w:hAnsi="Arvo"/>
+          <w:sz w:val="20"/>
+          <w:szCs w:val="20"/>
+        </w:rPr>
+      </w:pPr>
+      <w:r>
+        <w:rPr>
+          <w:rFonts w:ascii="Arvo" w:hAnsi="Arvo"/>
+          <w:sz w:val="20"/>
+          <w:szCs w:val="20"/>
+        </w:rPr>
+        <w:t>{{item.descricao}}</w:t>
       </w:r>
     </w:p>
     <w:p>
@@ -752,6 +752,7 @@
         <w:keepNext/>
         <w:snapToGrid w:val="0"/>
         <w:spacing w:line="276" w:lineRule="auto"/>
+        <w:jc w:val="both"/>
         <w:rPr>
           <w:rFonts w:ascii="Arvo" w:hAnsi="Arvo"/>
           <w:b/>
@@ -759,18 +760,17 @@
           <w:sz w:val="20"/>
           <w:szCs w:val="20"/>
         </w:rPr>
-        <w:jc w:val="both"/>
       </w:pPr>
       <w:r>
         <w:rPr>
           <w:rFonts w:ascii="Arvo" w:hAnsi="Arvo"/>
           <w:b/>
           <w:bCs/>
+          <w:sz w:val="20"/>
+          <w:szCs w:val="20"/>
           <w:u w:val="single"/>
-          <w:sz w:val="20"/>
-          <w:szCs w:val="20"/>
-        </w:rPr>
-        <w:t xml:space="preserve">{{escopo.sla_titulo}}</w:t>
+        </w:rPr>
+        <w:t>{{escopo.sla_titulo}}</w:t>
       </w:r>
     </w:p>
     <w:p>
@@ -977,6 +977,7 @@
     <w:p>
       <w:pPr>
         <w:spacing w:line="276" w:lineRule="auto"/>
+        <w:jc w:val="both"/>
         <w:rPr>
           <w:rFonts w:ascii="Arvo" w:hAnsi="Arvo"/>
           <w:b/>
@@ -984,7 +985,6 @@
           <w:sz w:val="20"/>
           <w:szCs w:val="20"/>
         </w:rPr>
-        <w:jc w:val="both"/>
       </w:pPr>
       <w:r>
         <w:rPr>
@@ -994,36 +994,36 @@
           <w:sz w:val="20"/>
           <w:szCs w:val="20"/>
         </w:rPr>
-        <w:t xml:space="preserve">Escopo Contencioso {{item.letra}}:</w:t>
-      </w:r>
-    </w:p>
-    <w:p>
-      <w:pPr>
-        <w:spacing w:line="276" w:lineRule="auto"/>
-        <w:rPr>
-          <w:rFonts w:ascii="Arvo" w:hAnsi="Arvo"/>
-          <w:sz w:val="20"/>
-          <w:szCs w:val="20"/>
-        </w:rPr>
-      </w:pPr>
-    </w:p>
-    <w:p>
-      <w:pPr>
-        <w:spacing w:line="276" w:lineRule="auto"/>
-        <w:rPr>
-          <w:rFonts w:ascii="Arvo" w:hAnsi="Arvo"/>
-          <w:sz w:val="20"/>
-          <w:szCs w:val="20"/>
-        </w:rPr>
+        <w:t>Escopo Contencioso {{item.letra}}:</w:t>
+      </w:r>
+    </w:p>
+    <w:p>
+      <w:pPr>
+        <w:spacing w:line="276" w:lineRule="auto"/>
+        <w:rPr>
+          <w:rFonts w:ascii="Arvo" w:hAnsi="Arvo"/>
+          <w:sz w:val="20"/>
+          <w:szCs w:val="20"/>
+        </w:rPr>
+      </w:pPr>
+    </w:p>
+    <w:p>
+      <w:pPr>
+        <w:spacing w:line="276" w:lineRule="auto"/>
         <w:jc w:val="both"/>
-      </w:pPr>
-      <w:r>
-        <w:rPr>
-          <w:rFonts w:ascii="Arvo" w:hAnsi="Arvo"/>
-          <w:sz w:val="20"/>
-          <w:szCs w:val="20"/>
-        </w:rPr>
-        <w:t xml:space="preserve">{{item.descricao}}</w:t>
+        <w:rPr>
+          <w:rFonts w:ascii="Arvo" w:hAnsi="Arvo"/>
+          <w:sz w:val="20"/>
+          <w:szCs w:val="20"/>
+        </w:rPr>
+      </w:pPr>
+      <w:r>
+        <w:rPr>
+          <w:rFonts w:ascii="Arvo" w:hAnsi="Arvo"/>
+          <w:sz w:val="20"/>
+          <w:szCs w:val="20"/>
+        </w:rPr>
+        <w:t>{{item.descricao}}</w:t>
       </w:r>
     </w:p>
     <w:p>
@@ -1333,7 +1333,6 @@
                 <w:sz w:val="20"/>
                 <w:szCs w:val="20"/>
               </w:rPr>
-              <w:lastRenderedPageBreak/>
               <w:t>Categoria</w:t>
             </w:r>
           </w:p>
@@ -2466,6 +2465,7 @@
                 <w:sz w:val="20"/>
                 <w:szCs w:val="20"/>
               </w:rPr>
+              <w:lastRenderedPageBreak/>
               <w:t>Cap de Horas</w:t>
             </w:r>
           </w:p>
@@ -2757,16 +2757,7 @@
           <w:sz w:val="20"/>
           <w:szCs w:val="20"/>
         </w:rPr>
-        <w:t xml:space="preserve"> as Partes negociarão, de boa-fé, o reajuste </w:t>
-      </w:r>
-      <w:r>
-        <w:rPr>
-          <w:rFonts w:ascii="Arvo" w:hAnsi="Arvo"/>
-          <w:sz w:val="20"/>
-          <w:szCs w:val="20"/>
-        </w:rPr>
-        <w:lastRenderedPageBreak/>
-        <w:t>proporcional dos honorários, a ser formalizado por aditamento a esta Proposta. Serviços prestados fora do escopo definido, sem a devida formalização, serão remunerados conforme a tabela horária vigente aplicável à modalidade correspondente.</w:t>
+        <w:t xml:space="preserve"> as Partes negociarão, de boa-fé, o reajuste proporcional dos honorários, a ser formalizado por aditamento a esta Proposta. Serviços prestados fora do escopo definido, sem a devida formalização, serão remunerados conforme a tabela horária vigente aplicável à modalidade correspondente.</w:t>
       </w:r>
     </w:p>
     <w:p>
@@ -4038,6 +4029,7 @@
           <w:sz w:val="20"/>
           <w:szCs w:val="20"/>
         </w:rPr>
+        <w:lastRenderedPageBreak/>
         <w:t xml:space="preserve">Preço </w:t>
       </w:r>
       <w:r>
@@ -4430,7 +4422,6 @@
           <w:sz w:val="20"/>
           <w:szCs w:val="20"/>
         </w:rPr>
-        <w:lastRenderedPageBreak/>
         <w:t>Preço Global</w:t>
       </w:r>
     </w:p>
@@ -5123,6 +5114,7 @@
           <w:sz w:val="20"/>
           <w:szCs w:val="20"/>
         </w:rPr>
+        <w:lastRenderedPageBreak/>
         <w:t xml:space="preserve">Horas para Serviços </w:t>
       </w:r>
       <w:r>
@@ -5615,7 +5607,6 @@
           <w:sz w:val="20"/>
           <w:szCs w:val="20"/>
         </w:rPr>
-        <w:lastRenderedPageBreak/>
         <w:t>Hora Fixa (independente do executor)</w:t>
       </w:r>
     </w:p>
@@ -6479,6 +6470,7 @@
           <w:sz w:val="20"/>
           <w:szCs w:val="20"/>
         </w:rPr>
+        <w:lastRenderedPageBreak/>
         <w:t>{{disposicoes.descricao}}</w:t>
       </w:r>
     </w:p>
@@ -6831,7 +6823,6 @@
           <w:sz w:val="20"/>
           <w:szCs w:val="20"/>
         </w:rPr>
-        <w:lastRenderedPageBreak/>
         <w:t>OBJETO</w:t>
       </w:r>
     </w:p>
@@ -7335,6 +7326,7 @@
           <w:sz w:val="20"/>
           <w:szCs w:val="20"/>
         </w:rPr>
+        <w:lastRenderedPageBreak/>
         <w:t xml:space="preserve">O inadimplemento de qualquer obrigação pecuniária prevista </w:t>
       </w:r>
       <w:r>
@@ -7565,7 +7557,6 @@
           <w:sz w:val="20"/>
           <w:szCs w:val="20"/>
         </w:rPr>
-        <w:lastRenderedPageBreak/>
         <w:t>Caso aplicável a esta Proposta, os honorários de sucumbência arbitrados em favor da parte patrocinada, nos termos do artigo 85 do Código de Processo Civil e do artigo 22 da Lei n. 8.906/1994, pertencem com exclusividade ao Contratado.</w:t>
       </w:r>
     </w:p>
@@ -8045,6 +8036,7 @@
           <w:sz w:val="20"/>
           <w:szCs w:val="20"/>
         </w:rPr>
+        <w:lastRenderedPageBreak/>
         <w:t>OBRIGAÇÕES DO CONTRATADO</w:t>
       </w:r>
     </w:p>
@@ -8709,16 +8701,7 @@
           <w:sz w:val="20"/>
           <w:szCs w:val="20"/>
         </w:rPr>
-        <w:t xml:space="preserve">, sem prejuízo das sanções legais cabíveis e do ressarcimento integral dos prejuízos experimentados pela Parte inocente, obrigando-se cada Parte a notificar a outra imediatamente, por escrito, ao </w:t>
-      </w:r>
-      <w:r>
-        <w:rPr>
-          <w:rFonts w:ascii="Arvo" w:hAnsi="Arvo"/>
-          <w:sz w:val="20"/>
-          <w:szCs w:val="20"/>
-        </w:rPr>
-        <w:lastRenderedPageBreak/>
-        <w:t>tomar conhecimento de qualquer indício de descumprimento, cooperando de boa-fé para a sua apuração.</w:t>
+        <w:t>, sem prejuízo das sanções legais cabíveis e do ressarcimento integral dos prejuízos experimentados pela Parte inocente, obrigando-se cada Parte a notificar a outra imediatamente, por escrito, ao tomar conhecimento de qualquer indício de descumprimento, cooperando de boa-fé para a sua apuração.</w:t>
       </w:r>
     </w:p>
     <w:p>
@@ -8974,6 +8957,7 @@
           <w:sz w:val="20"/>
           <w:szCs w:val="20"/>
         </w:rPr>
+        <w:lastRenderedPageBreak/>
         <w:t>PROTEÇÃO DE DADOS PESSOAIS</w:t>
       </w:r>
     </w:p>
@@ -9011,29 +8995,15 @@
           <w:sz w:val="20"/>
           <w:szCs w:val="20"/>
         </w:rPr>
-        <w:t>No tratamento de dados pessoais realizado em razão dest</w:t>
-      </w:r>
-      <w:r>
-        <w:rPr>
-          <w:rFonts w:ascii="Arvo" w:hAnsi="Arvo"/>
-          <w:sz w:val="20"/>
-          <w:szCs w:val="20"/>
-        </w:rPr>
-        <w:t>a Proposta</w:t>
-      </w:r>
-      <w:r>
-        <w:rPr>
-          <w:rFonts w:ascii="Arvo" w:hAnsi="Arvo"/>
-          <w:sz w:val="20"/>
-          <w:szCs w:val="20"/>
-        </w:rPr>
-        <w:t>, as Partes observarão a Lei n. 13.709/2018 (LGPD) e as normas editadas pela Autoridade Nacional de Proteção de Dados (ANPD), atuando cada qual, conforme o caso, na qualidade de controladora ou operadora, nos termos do artigo 5º da LGPD.</w:t>
+        <w:t>No tratamento de dados pessoais realizado em razão desta Proposta, as Partes observarão a Lei n. 13.709/2018 (LGPD) e as normas editadas pela Autoridade Nacional de Proteção de Dados (ANPD), atuando cada qual, conforme o caso, na qualidade de controladora ou operadora, nos termos do artigo 5º da LGPD. O tratamento de dados pessoais limitar-se-á às finalidades necessárias ou decorrentes do cumprimento das obrigações contratuais, observados os princípios da LGPD.</w:t>
       </w:r>
     </w:p>
     <w:p>
       <w:pPr>
         <w:pStyle w:val="PargrafodaLista"/>
         <w:spacing w:line="276" w:lineRule="auto"/>
+        <w:ind w:left="709" w:hanging="709"/>
+        <w:jc w:val="both"/>
         <w:rPr>
           <w:rFonts w:ascii="Arvo" w:hAnsi="Arvo"/>
           <w:sz w:val="20"/>
@@ -9064,61 +9034,7 @@
           <w:sz w:val="20"/>
           <w:szCs w:val="20"/>
         </w:rPr>
-        <w:t>O tratamento de dados pessoais limitar-se-á às finalidades necessárias ao cumprimento das obrigações contratuais, tendo por base legal, conforme o caso, a execução de contrato, o cumprimento de obrigação legal ou regulatória, o exercício regular de direitos em processos judiciais, administrativos ou arbitrais, ou os interesses legítimos das Partes, observados os princípios da LGPD.</w:t>
-      </w:r>
-    </w:p>
-    <w:p>
-      <w:pPr>
-        <w:pStyle w:val="PargrafodaLista"/>
-        <w:spacing w:line="276" w:lineRule="auto"/>
-        <w:rPr>
-          <w:rFonts w:ascii="Arvo" w:hAnsi="Arvo"/>
-          <w:sz w:val="20"/>
-          <w:szCs w:val="20"/>
-        </w:rPr>
-      </w:pPr>
-    </w:p>
-    <w:p>
-      <w:pPr>
-        <w:pStyle w:val="PargrafodaLista"/>
-        <w:numPr>
-          <w:ilvl w:val="1"/>
-          <w:numId w:val="2"/>
-        </w:numPr>
-        <w:snapToGrid w:val="0"/>
-        <w:spacing w:line="276" w:lineRule="auto"/>
-        <w:ind w:left="709" w:hanging="709"/>
-        <w:jc w:val="both"/>
-        <w:rPr>
-          <w:rFonts w:ascii="Arvo" w:hAnsi="Arvo"/>
-          <w:sz w:val="20"/>
-          <w:szCs w:val="20"/>
-        </w:rPr>
-      </w:pPr>
-      <w:r>
-        <w:rPr>
-          <w:rFonts w:ascii="Arvo" w:hAnsi="Arvo"/>
-          <w:sz w:val="20"/>
-          <w:szCs w:val="20"/>
-        </w:rPr>
-        <w:lastRenderedPageBreak/>
-        <w:t xml:space="preserve">As Partes comprometem-se a adotar medidas técnicas e administrativas adequadas para proteger os dados pessoais tratados contra acessos não autorizados e situações ilícitas, a não </w:t>
-      </w:r>
-      <w:r>
-        <w:rPr>
-          <w:rFonts w:ascii="Arvo" w:hAnsi="Arvo"/>
-          <w:sz w:val="20"/>
-          <w:szCs w:val="20"/>
-        </w:rPr>
-        <w:t>os compartilhar</w:t>
-      </w:r>
-      <w:r>
-        <w:rPr>
-          <w:rFonts w:ascii="Arvo" w:hAnsi="Arvo"/>
-          <w:sz w:val="20"/>
-          <w:szCs w:val="20"/>
-        </w:rPr>
-        <w:t xml:space="preserve"> fora das hipóteses legais ou contratuais, a submeter eventuais suboperadores a obrigações equivalentes e a notificar a outra Parte, em até 24 (vinte e quatro) horas da ciência, de qualquer incidente de segurança envolvendo dados pessoais desta contratação.</w:t>
+        <w:t>A Contratada possui uma Política de Privacidade que estabelece as regras e práticas de tratamento pela Contratada dos dados pessoais dos seus clientes, incluindo dos respectivos representantes legais, diretores e funcionários, podendo o Contratante solicitar à Contratada uma cópia da versão atualizada desse documento. As Partes comprometem-se a adotar medidas técnicas e administrativas adequadas para proteger os dados pessoais tratados contra acessos não autorizados e situações ilícitas, e a não os compartilhar fora das hipóteses legais ou contratuais.</w:t>
       </w:r>
     </w:p>
     <w:p>
@@ -9406,7 +9322,16 @@
           <w:sz w:val="20"/>
           <w:szCs w:val="20"/>
         </w:rPr>
-        <w:t xml:space="preserve">, sem aviso prévio e sem penalidade, nas seguintes hipóteses: (i) inadimplemento de obrigação contratual relevante pela outra Parte, não sanado no prazo de 15 (quinze) dias contados da notificação; (ii) impossibilidade superveniente e objetivamente verificável de cumprimento das obrigações assumidas; (iii) conflito de interesses que, à luz das normas da advocacia, impeça a continuidade da representação; e (iv) </w:t>
+        <w:t xml:space="preserve">, sem aviso prévio e sem penalidade, nas seguintes hipóteses: (i) inadimplemento de obrigação contratual relevante pela outra Parte, não sanado no prazo de 15 (quinze) dias contados da notificação; (ii) impossibilidade superveniente e objetivamente verificável de cumprimento das obrigações assumidas; (iii) conflito de interesses que, à luz das normas da advocacia, impeça </w:t>
+      </w:r>
+      <w:r>
+        <w:rPr>
+          <w:rFonts w:ascii="Arvo" w:hAnsi="Arvo"/>
+          <w:sz w:val="20"/>
+          <w:szCs w:val="20"/>
+        </w:rPr>
+        <w:lastRenderedPageBreak/>
+        <w:t xml:space="preserve">a continuidade da representação; e (iv) </w:t>
       </w:r>
       <w:r>
         <w:rPr>
@@ -9590,7 +9515,6 @@
           <w:sz w:val="20"/>
           <w:szCs w:val="20"/>
         </w:rPr>
-        <w:lastRenderedPageBreak/>
         <w:t>A presente Proposta</w:t>
       </w:r>
       <w:r>
@@ -9931,6 +9855,7 @@
           <w:sz w:val="20"/>
           <w:szCs w:val="20"/>
         </w:rPr>
+        <w:lastRenderedPageBreak/>
         <w:t>.</w:t>
       </w:r>
     </w:p>
@@ -10251,7 +10176,6 @@
           <w:sz w:val="20"/>
           <w:szCs w:val="20"/>
         </w:rPr>
-        <w:lastRenderedPageBreak/>
         <w:t>(preencher e assinar caso firmado com assinaturas físicas ou por meio de certificado digital)</w:t>
       </w:r>
     </w:p>
@@ -11935,6 +11859,26 @@
 </file>
 
 <file path=customXml/item1.xml><?xml version="1.0" encoding="utf-8"?>
+<?mso-contentType ?>
+<FormTemplates xmlns="http://schemas.microsoft.com/sharepoint/v3/contenttype/forms">
+  <Display>DocumentLibraryForm</Display>
+  <Edit>DocumentLibraryForm</Edit>
+  <New>DocumentLibraryForm</New>
+</FormTemplates>
+</file>
+
+<file path=customXml/item2.xml><?xml version="1.0" encoding="utf-8"?>
+<p:properties xmlns:p="http://schemas.microsoft.com/office/2006/metadata/properties" xmlns:xsi="http://www.w3.org/2001/XMLSchema-instance" xmlns:pc="http://schemas.microsoft.com/office/infopath/2007/PartnerControls">
+  <documentManagement>
+    <lcf76f155ced4ddcb4097134ff3c332f xmlns="e5b1cd33-4eca-41a4-b7d8-fdf3e6200119">
+      <Terms xmlns="http://schemas.microsoft.com/office/infopath/2007/PartnerControls"/>
+    </lcf76f155ced4ddcb4097134ff3c332f>
+    <TaxCatchAll xmlns="c710a95f-4097-48d0-b72e-528dcf24b561" xsi:nil="true"/>
+  </documentManagement>
+</p:properties>
+</file>
+
+<file path=customXml/item3.xml><?xml version="1.0" encoding="utf-8"?>
 <ct:contentTypeSchema xmlns:ct="http://schemas.microsoft.com/office/2006/metadata/contentType" xmlns:ma="http://schemas.microsoft.com/office/2006/metadata/properties/metaAttributes" ct:_="" ma:_="" ma:contentTypeName="Documento" ma:contentTypeID="0x010100C538FE3DE9F5C249B208F757A39C9CF1" ma:contentTypeVersion="13" ma:contentTypeDescription="Crie um novo documento." ma:contentTypeScope="" ma:versionID="f58841031a2b8acc55807e179e1eb129">
   <xsd:schema xmlns:xsd="http://www.w3.org/2001/XMLSchema" xmlns:xs="http://www.w3.org/2001/XMLSchema" xmlns:p="http://schemas.microsoft.com/office/2006/metadata/properties" xmlns:ns2="e5b1cd33-4eca-41a4-b7d8-fdf3e6200119" xmlns:ns3="c710a95f-4097-48d0-b72e-528dcf24b561" targetNamespace="http://schemas.microsoft.com/office/2006/metadata/properties" ma:root="true" ma:fieldsID="eabb80da9e4a7645788b9624de58e5c8" ns2:_="" ns3:_="">
     <xsd:import namespace="e5b1cd33-4eca-41a4-b7d8-fdf3e6200119"/>
@@ -12141,27 +12085,26 @@
 </ct:contentTypeSchema>
 </file>
 
-<file path=customXml/item2.xml><?xml version="1.0" encoding="utf-8"?>
-<p:properties xmlns:p="http://schemas.microsoft.com/office/2006/metadata/properties" xmlns:xsi="http://www.w3.org/2001/XMLSchema-instance" xmlns:pc="http://schemas.microsoft.com/office/infopath/2007/PartnerControls">
-  <documentManagement>
-    <lcf76f155ced4ddcb4097134ff3c332f xmlns="e5b1cd33-4eca-41a4-b7d8-fdf3e6200119">
-      <Terms xmlns="http://schemas.microsoft.com/office/infopath/2007/PartnerControls"/>
-    </lcf76f155ced4ddcb4097134ff3c332f>
-    <TaxCatchAll xmlns="c710a95f-4097-48d0-b72e-528dcf24b561" xsi:nil="true"/>
-  </documentManagement>
-</p:properties>
+<file path=customXml/itemProps1.xml><?xml version="1.0" encoding="utf-8"?>
+<ds:datastoreItem xmlns:ds="http://schemas.openxmlformats.org/officeDocument/2006/customXml" ds:itemID="{A5ED3DFB-4F39-4BF8-995C-27FE2C86527B}">
+  <ds:schemaRefs>
+    <ds:schemaRef ds:uri="http://schemas.microsoft.com/sharepoint/v3/contenttype/forms"/>
+  </ds:schemaRefs>
+</ds:datastoreItem>
 </file>
 
-<file path=customXml/item3.xml><?xml version="1.0" encoding="utf-8"?>
-<?mso-contentType ?>
-<FormTemplates xmlns="http://schemas.microsoft.com/sharepoint/v3/contenttype/forms">
-  <Display>DocumentLibraryForm</Display>
-  <Edit>DocumentLibraryForm</Edit>
-  <New>DocumentLibraryForm</New>
-</FormTemplates>
+<file path=customXml/itemProps2.xml><?xml version="1.0" encoding="utf-8"?>
+<ds:datastoreItem xmlns:ds="http://schemas.openxmlformats.org/officeDocument/2006/customXml" ds:itemID="{CB7613A1-A0CB-4E22-AF85-27793339D14D}">
+  <ds:schemaRefs>
+    <ds:schemaRef ds:uri="http://schemas.microsoft.com/office/2006/metadata/properties"/>
+    <ds:schemaRef ds:uri="http://schemas.microsoft.com/office/infopath/2007/PartnerControls"/>
+    <ds:schemaRef ds:uri="e5b1cd33-4eca-41a4-b7d8-fdf3e6200119"/>
+    <ds:schemaRef ds:uri="c710a95f-4097-48d0-b72e-528dcf24b561"/>
+  </ds:schemaRefs>
+</ds:datastoreItem>
 </file>
 
-<file path=customXml/itemProps1.xml><?xml version="1.0" encoding="utf-8"?>
+<file path=customXml/itemProps3.xml><?xml version="1.0" encoding="utf-8"?>
 <ds:datastoreItem xmlns:ds="http://schemas.openxmlformats.org/officeDocument/2006/customXml" ds:itemID="{527C8FAF-F895-460C-92FD-63B7C6027339}">
   <ds:schemaRefs>
     <ds:schemaRef ds:uri="http://schemas.microsoft.com/office/2006/metadata/contentType"/>
@@ -12178,23 +12121,4 @@
     <ds:schemaRef ds:uri="http://schemas.microsoft.com/internal/obd"/>
   </ds:schemaRefs>
 </ds:datastoreItem>
-</file>
-
-<file path=customXml/itemProps2.xml><?xml version="1.0" encoding="utf-8"?>
-<ds:datastoreItem xmlns:ds="http://schemas.openxmlformats.org/officeDocument/2006/customXml" ds:itemID="{CB7613A1-A0CB-4E22-AF85-27793339D14D}">
-  <ds:schemaRefs>
-    <ds:schemaRef ds:uri="http://schemas.microsoft.com/office/2006/metadata/properties"/>
-    <ds:schemaRef ds:uri="http://schemas.microsoft.com/office/infopath/2007/PartnerControls"/>
-    <ds:schemaRef ds:uri="e5b1cd33-4eca-41a4-b7d8-fdf3e6200119"/>
-    <ds:schemaRef ds:uri="c710a95f-4097-48d0-b72e-528dcf24b561"/>
-  </ds:schemaRefs>
-</ds:datastoreItem>
-</file>
-
-<file path=customXml/itemProps3.xml><?xml version="1.0" encoding="utf-8"?>
-<ds:datastoreItem xmlns:ds="http://schemas.openxmlformats.org/officeDocument/2006/customXml" ds:itemID="{A5ED3DFB-4F39-4BF8-995C-27FE2C86527B}">
-  <ds:schemaRefs>
-    <ds:schemaRef ds:uri="http://schemas.microsoft.com/sharepoint/v3/contenttype/forms"/>
-  </ds:schemaRefs>
-</ds:datastoreItem>
 </file>
</xml_diff>

<commit_message>
fix+feat: justificação do texto, honorários intercalados por escopo e correções da revisão
Justificação do texto do formulário no .docx: texto corrido sai justificado;
texto com quebra de linha (Enter) volta a alinhar à esquerda para não esticar.

Honorários intercalados por escopo (multi-escopo com forma de pagamento por
escopo): o honorário de cada escopo é renderizado logo abaixo da descrição dele;
seção renomeada para "Escopo de Trabalho e Honorários". Escopo único e multi com
pagamento compartilhado: inalterados.

Correções encontradas na revisão (app.py): atos processuais pré-preenchidos
voltam a aparecer; última edição preservada ao criar o 2º escopo;
exito_percentual robusto a "%". Cláusula LGPD atualizada via markers. Script de
QA scripts/generate_minuta_completa.py.

62 testes passam; smoke + integridade das minutas OK. APP_VERSION 2.0.30 → 2.0.35.

https://claude.ai/code/session_01RpmCw8x5rdmexDii3zpYJQ
</commit_message>
<xml_diff>
--- a/resources/templates/PMRA_Template_Jinja.docx
+++ b/resources/templates/PMRA_Template_Jinja.docx
@@ -406,7 +406,7 @@
           <w:szCs w:val="20"/>
           <w:u w:val="single"/>
         </w:rPr>
-        <w:t>Escopo de Trabalho</w:t>
+        <w:t>{{escopo.titulo_secao}}</w:t>
       </w:r>
       <w:r>
         <w:rPr>
@@ -571,12 +571,12 @@
     <w:p>
       <w:pPr>
         <w:spacing w:line="276" w:lineRule="auto"/>
-        <w:rPr>
-          <w:rFonts w:ascii="Arvo" w:hAnsi="Arvo"/>
-          <w:sz w:val="20"/>
-          <w:szCs w:val="20"/>
-        </w:rPr>
         <w:jc w:val="both"/>
+        <w:rPr>
+          <w:rFonts w:ascii="Arvo" w:hAnsi="Arvo"/>
+          <w:sz w:val="20"/>
+          <w:szCs w:val="20"/>
+        </w:rPr>
       </w:pPr>
       <w:r>
         <w:rPr>
@@ -586,36 +586,36 @@
           <w:sz w:val="20"/>
           <w:szCs w:val="20"/>
         </w:rPr>
-        <w:t xml:space="preserve">Escopo Consultivo {{item.letra}}:</w:t>
-      </w:r>
-    </w:p>
-    <w:p>
-      <w:pPr>
-        <w:spacing w:line="276" w:lineRule="auto"/>
-        <w:rPr>
-          <w:rFonts w:ascii="Arvo" w:hAnsi="Arvo"/>
-          <w:sz w:val="20"/>
-          <w:szCs w:val="20"/>
-        </w:rPr>
-      </w:pPr>
-    </w:p>
-    <w:p>
-      <w:pPr>
-        <w:spacing w:line="276" w:lineRule="auto"/>
-        <w:rPr>
-          <w:rFonts w:ascii="Arvo" w:hAnsi="Arvo"/>
-          <w:sz w:val="20"/>
-          <w:szCs w:val="20"/>
-        </w:rPr>
+        <w:t>Escopo Consultivo {{item.letra}}:</w:t>
+      </w:r>
+    </w:p>
+    <w:p>
+      <w:pPr>
+        <w:spacing w:line="276" w:lineRule="auto"/>
+        <w:rPr>
+          <w:rFonts w:ascii="Arvo" w:hAnsi="Arvo"/>
+          <w:sz w:val="20"/>
+          <w:szCs w:val="20"/>
+        </w:rPr>
+      </w:pPr>
+    </w:p>
+    <w:p>
+      <w:pPr>
+        <w:spacing w:line="276" w:lineRule="auto"/>
         <w:jc w:val="both"/>
-      </w:pPr>
-      <w:r>
-        <w:rPr>
-          <w:rFonts w:ascii="Arvo" w:hAnsi="Arvo"/>
-          <w:sz w:val="20"/>
-          <w:szCs w:val="20"/>
-        </w:rPr>
-        <w:t xml:space="preserve">{{item.descricao}}</w:t>
+        <w:rPr>
+          <w:rFonts w:ascii="Arvo" w:hAnsi="Arvo"/>
+          <w:sz w:val="20"/>
+          <w:szCs w:val="20"/>
+        </w:rPr>
+      </w:pPr>
+      <w:r>
+        <w:rPr>
+          <w:rFonts w:ascii="Arvo" w:hAnsi="Arvo"/>
+          <w:sz w:val="20"/>
+          <w:szCs w:val="20"/>
+        </w:rPr>
+        <w:t>{{item.descricao}}</w:t>
       </w:r>
     </w:p>
     <w:p>
@@ -643,7 +643,7 @@
           <w:sz w:val="2"/>
           <w:szCs w:val="2"/>
         </w:rPr>
-        <w:t>{%p endfor %}</w:t>
+        <w:t>{%p if consultiva.forma_por_escopo %}</w:t>
       </w:r>
     </w:p>
     <w:p>
@@ -661,19 +661,8 @@
           <w:sz w:val="2"/>
           <w:szCs w:val="2"/>
         </w:rPr>
-        <w:t>{%p endif %}</w:t>
-      </w:r>
-    </w:p>
-    <w:p>
-      <w:pPr>
-        <w:snapToGrid w:val="0"/>
-        <w:spacing w:line="276" w:lineRule="auto"/>
-        <w:rPr>
-          <w:rFonts w:ascii="Arvo" w:hAnsi="Arvo"/>
-          <w:sz w:val="20"/>
-          <w:szCs w:val="20"/>
-        </w:rPr>
-      </w:pPr>
+        <w:t>{{p item.subdoc}}</w:t>
+      </w:r>
     </w:p>
     <w:p>
       <w:pPr>
@@ -690,6 +679,71 @@
           <w:sz w:val="2"/>
           <w:szCs w:val="2"/>
         </w:rPr>
+        <w:t>{%p endif %}</w:t>
+      </w:r>
+    </w:p>
+    <w:p>
+      <w:pPr>
+        <w:spacing w:line="276" w:lineRule="auto"/>
+        <w:rPr>
+          <w:rFonts w:ascii="Arvo" w:hAnsi="Arvo"/>
+          <w:sz w:val="2"/>
+          <w:szCs w:val="2"/>
+        </w:rPr>
+      </w:pPr>
+      <w:r>
+        <w:rPr>
+          <w:rFonts w:ascii="Arvo" w:hAnsi="Arvo"/>
+          <w:sz w:val="2"/>
+          <w:szCs w:val="2"/>
+        </w:rPr>
+        <w:t>{%p endfor %}</w:t>
+      </w:r>
+    </w:p>
+    <w:p>
+      <w:pPr>
+        <w:spacing w:line="276" w:lineRule="auto"/>
+        <w:rPr>
+          <w:rFonts w:ascii="Arvo" w:hAnsi="Arvo"/>
+          <w:sz w:val="2"/>
+          <w:szCs w:val="2"/>
+        </w:rPr>
+      </w:pPr>
+      <w:r>
+        <w:rPr>
+          <w:rFonts w:ascii="Arvo" w:hAnsi="Arvo"/>
+          <w:sz w:val="2"/>
+          <w:szCs w:val="2"/>
+        </w:rPr>
+        <w:t>{%p endif %}</w:t>
+      </w:r>
+    </w:p>
+    <w:p>
+      <w:pPr>
+        <w:snapToGrid w:val="0"/>
+        <w:spacing w:line="276" w:lineRule="auto"/>
+        <w:rPr>
+          <w:rFonts w:ascii="Arvo" w:hAnsi="Arvo"/>
+          <w:sz w:val="20"/>
+          <w:szCs w:val="20"/>
+        </w:rPr>
+      </w:pPr>
+    </w:p>
+    <w:p>
+      <w:pPr>
+        <w:spacing w:line="276" w:lineRule="auto"/>
+        <w:rPr>
+          <w:rFonts w:ascii="Arvo" w:hAnsi="Arvo"/>
+          <w:sz w:val="2"/>
+          <w:szCs w:val="2"/>
+        </w:rPr>
+      </w:pPr>
+      <w:r>
+        <w:rPr>
+          <w:rFonts w:ascii="Arvo" w:hAnsi="Arvo"/>
+          <w:sz w:val="2"/>
+          <w:szCs w:val="2"/>
+        </w:rPr>
         <w:t>{%p if escopo.show_sla %}</w:t>
       </w:r>
     </w:p>
@@ -698,6 +752,7 @@
         <w:keepNext/>
         <w:snapToGrid w:val="0"/>
         <w:spacing w:line="276" w:lineRule="auto"/>
+        <w:jc w:val="both"/>
         <w:rPr>
           <w:rFonts w:ascii="Arvo" w:hAnsi="Arvo"/>
           <w:b/>
@@ -705,18 +760,17 @@
           <w:sz w:val="20"/>
           <w:szCs w:val="20"/>
         </w:rPr>
-        <w:jc w:val="both"/>
       </w:pPr>
       <w:r>
         <w:rPr>
           <w:rFonts w:ascii="Arvo" w:hAnsi="Arvo"/>
           <w:b/>
           <w:bCs/>
+          <w:sz w:val="20"/>
+          <w:szCs w:val="20"/>
           <w:u w:val="single"/>
-          <w:sz w:val="20"/>
-          <w:szCs w:val="20"/>
-        </w:rPr>
-        <w:t xml:space="preserve">{{escopo.sla_titulo}}</w:t>
+        </w:rPr>
+        <w:t>{{escopo.sla_titulo}}</w:t>
       </w:r>
     </w:p>
     <w:p>
@@ -923,6 +977,7 @@
     <w:p>
       <w:pPr>
         <w:spacing w:line="276" w:lineRule="auto"/>
+        <w:jc w:val="both"/>
         <w:rPr>
           <w:rFonts w:ascii="Arvo" w:hAnsi="Arvo"/>
           <w:b/>
@@ -930,7 +985,6 @@
           <w:sz w:val="20"/>
           <w:szCs w:val="20"/>
         </w:rPr>
-        <w:jc w:val="both"/>
       </w:pPr>
       <w:r>
         <w:rPr>
@@ -940,47 +994,101 @@
           <w:sz w:val="20"/>
           <w:szCs w:val="20"/>
         </w:rPr>
-        <w:t xml:space="preserve">Escopo Contencioso {{item.letra}}:</w:t>
-      </w:r>
-    </w:p>
-    <w:p>
-      <w:pPr>
-        <w:spacing w:line="276" w:lineRule="auto"/>
-        <w:rPr>
-          <w:rFonts w:ascii="Arvo" w:hAnsi="Arvo"/>
-          <w:sz w:val="20"/>
-          <w:szCs w:val="20"/>
-        </w:rPr>
-      </w:pPr>
-    </w:p>
-    <w:p>
-      <w:pPr>
-        <w:spacing w:line="276" w:lineRule="auto"/>
-        <w:rPr>
-          <w:rFonts w:ascii="Arvo" w:hAnsi="Arvo"/>
-          <w:sz w:val="20"/>
-          <w:szCs w:val="20"/>
-        </w:rPr>
+        <w:t>Escopo Contencioso {{item.letra}}:</w:t>
+      </w:r>
+    </w:p>
+    <w:p>
+      <w:pPr>
+        <w:spacing w:line="276" w:lineRule="auto"/>
+        <w:rPr>
+          <w:rFonts w:ascii="Arvo" w:hAnsi="Arvo"/>
+          <w:sz w:val="20"/>
+          <w:szCs w:val="20"/>
+        </w:rPr>
+      </w:pPr>
+    </w:p>
+    <w:p>
+      <w:pPr>
+        <w:spacing w:line="276" w:lineRule="auto"/>
         <w:jc w:val="both"/>
-      </w:pPr>
-      <w:r>
-        <w:rPr>
-          <w:rFonts w:ascii="Arvo" w:hAnsi="Arvo"/>
-          <w:sz w:val="20"/>
-          <w:szCs w:val="20"/>
-        </w:rPr>
-        <w:t xml:space="preserve">{{item.descricao}}</w:t>
-      </w:r>
-    </w:p>
-    <w:p>
-      <w:pPr>
-        <w:spacing w:line="276" w:lineRule="auto"/>
-        <w:rPr>
-          <w:rFonts w:ascii="Arvo" w:hAnsi="Arvo"/>
-          <w:sz w:val="20"/>
-          <w:szCs w:val="20"/>
-        </w:rPr>
-      </w:pPr>
+        <w:rPr>
+          <w:rFonts w:ascii="Arvo" w:hAnsi="Arvo"/>
+          <w:sz w:val="20"/>
+          <w:szCs w:val="20"/>
+        </w:rPr>
+      </w:pPr>
+      <w:r>
+        <w:rPr>
+          <w:rFonts w:ascii="Arvo" w:hAnsi="Arvo"/>
+          <w:sz w:val="20"/>
+          <w:szCs w:val="20"/>
+        </w:rPr>
+        <w:t>{{item.descricao}}</w:t>
+      </w:r>
+    </w:p>
+    <w:p>
+      <w:pPr>
+        <w:spacing w:line="276" w:lineRule="auto"/>
+        <w:rPr>
+          <w:rFonts w:ascii="Arvo" w:hAnsi="Arvo"/>
+          <w:sz w:val="20"/>
+          <w:szCs w:val="20"/>
+        </w:rPr>
+      </w:pPr>
+    </w:p>
+    <w:p>
+      <w:pPr>
+        <w:spacing w:line="276" w:lineRule="auto"/>
+        <w:rPr>
+          <w:rFonts w:ascii="Arvo" w:hAnsi="Arvo"/>
+          <w:sz w:val="2"/>
+          <w:szCs w:val="2"/>
+        </w:rPr>
+      </w:pPr>
+      <w:r>
+        <w:rPr>
+          <w:rFonts w:ascii="Arvo" w:hAnsi="Arvo"/>
+          <w:sz w:val="2"/>
+          <w:szCs w:val="2"/>
+        </w:rPr>
+        <w:t>{%p if contenciosa.forma_por_escopo %}</w:t>
+      </w:r>
+    </w:p>
+    <w:p>
+      <w:pPr>
+        <w:spacing w:line="276" w:lineRule="auto"/>
+        <w:rPr>
+          <w:rFonts w:ascii="Arvo" w:hAnsi="Arvo"/>
+          <w:sz w:val="2"/>
+          <w:szCs w:val="2"/>
+        </w:rPr>
+      </w:pPr>
+      <w:r>
+        <w:rPr>
+          <w:rFonts w:ascii="Arvo" w:hAnsi="Arvo"/>
+          <w:sz w:val="2"/>
+          <w:szCs w:val="2"/>
+        </w:rPr>
+        <w:t>{{p item.subdoc}}</w:t>
+      </w:r>
+    </w:p>
+    <w:p>
+      <w:pPr>
+        <w:spacing w:line="276" w:lineRule="auto"/>
+        <w:rPr>
+          <w:rFonts w:ascii="Arvo" w:hAnsi="Arvo"/>
+          <w:sz w:val="2"/>
+          <w:szCs w:val="2"/>
+        </w:rPr>
+      </w:pPr>
+      <w:r>
+        <w:rPr>
+          <w:rFonts w:ascii="Arvo" w:hAnsi="Arvo"/>
+          <w:sz w:val="2"/>
+          <w:szCs w:val="2"/>
+        </w:rPr>
+        <w:t>{%p endif %}</w:t>
+      </w:r>
     </w:p>
     <w:p>
       <w:pPr>
@@ -1225,7 +1333,6 @@
                 <w:sz w:val="20"/>
                 <w:szCs w:val="20"/>
               </w:rPr>
-              <w:lastRenderedPageBreak/>
               <w:t>Categoria</w:t>
             </w:r>
           </w:p>
@@ -2358,6 +2465,7 @@
                 <w:sz w:val="20"/>
                 <w:szCs w:val="20"/>
               </w:rPr>
+              <w:lastRenderedPageBreak/>
               <w:t>Cap de Horas</w:t>
             </w:r>
           </w:p>
@@ -2649,16 +2757,7 @@
           <w:sz w:val="20"/>
           <w:szCs w:val="20"/>
         </w:rPr>
-        <w:t xml:space="preserve"> as Partes negociarão, de boa-fé, o reajuste </w:t>
-      </w:r>
-      <w:r>
-        <w:rPr>
-          <w:rFonts w:ascii="Arvo" w:hAnsi="Arvo"/>
-          <w:sz w:val="20"/>
-          <w:szCs w:val="20"/>
-        </w:rPr>
-        <w:lastRenderedPageBreak/>
-        <w:t>proporcional dos honorários, a ser formalizado por aditamento a esta Proposta. Serviços prestados fora do escopo definido, sem a devida formalização, serão remunerados conforme a tabela horária vigente aplicável à modalidade correspondente.</w:t>
+        <w:t xml:space="preserve"> as Partes negociarão, de boa-fé, o reajuste proporcional dos honorários, a ser formalizado por aditamento a esta Proposta. Serviços prestados fora do escopo definido, sem a devida formalização, serão remunerados conforme a tabela horária vigente aplicável à modalidade correspondente.</w:t>
       </w:r>
     </w:p>
     <w:p>
@@ -2677,128 +2776,6 @@
           <w:szCs w:val="2"/>
         </w:rPr>
         <w:t>{%p endif %}</w:t>
-      </w:r>
-    </w:p>
-    <w:p>
-      <w:pPr>
-        <w:spacing w:line="276" w:lineRule="auto"/>
-        <w:rPr>
-          <w:rFonts w:ascii="Arvo" w:hAnsi="Arvo"/>
-          <w:sz w:val="2"/>
-          <w:szCs w:val="2"/>
-        </w:rPr>
-      </w:pPr>
-      <w:r>
-        <w:rPr>
-          <w:rFonts w:ascii="Arvo" w:hAnsi="Arvo"/>
-          <w:sz w:val="2"/>
-          <w:szCs w:val="2"/>
-        </w:rPr>
-        <w:t>{%p endif %}</w:t>
-      </w:r>
-    </w:p>
-    <w:p>
-      <w:pPr>
-        <w:spacing w:line="276" w:lineRule="auto"/>
-        <w:rPr>
-          <w:rFonts w:ascii="Arvo" w:hAnsi="Arvo"/>
-          <w:sz w:val="2"/>
-          <w:szCs w:val="2"/>
-        </w:rPr>
-      </w:pPr>
-      <w:r>
-        <w:rPr>
-          <w:rFonts w:ascii="Arvo" w:hAnsi="Arvo"/>
-          <w:sz w:val="2"/>
-          <w:szCs w:val="2"/>
-        </w:rPr>
-        <w:t>{%p if escopo.show_consultiva and consultiva.forma_por_escopo %}</w:t>
-      </w:r>
-    </w:p>
-    <w:p>
-      <w:pPr>
-        <w:spacing w:line="276" w:lineRule="auto"/>
-        <w:rPr>
-          <w:rFonts w:ascii="Arvo" w:hAnsi="Arvo"/>
-          <w:sz w:val="20"/>
-          <w:szCs w:val="20"/>
-        </w:rPr>
-        <w:jc w:val="both"/>
-      </w:pPr>
-      <w:r>
-        <w:rPr>
-          <w:rFonts w:ascii="Arvo" w:hAnsi="Arvo"/>
-          <w:b/>
-          <w:bCs/>
-          <w:u w:val="single"/>
-          <w:sz w:val="20"/>
-          <w:szCs w:val="20"/>
-        </w:rPr>
-        <w:t xml:space="preserve">Honorários Propostos para os Escopos Consultivos</w:t>
-      </w:r>
-    </w:p>
-    <w:p>
-      <w:pPr>
-        <w:spacing w:line="276" w:lineRule="auto"/>
-        <w:rPr>
-          <w:rFonts w:ascii="Arvo" w:hAnsi="Arvo"/>
-          <w:sz w:val="20"/>
-          <w:szCs w:val="20"/>
-        </w:rPr>
-      </w:pPr>
-    </w:p>
-    <w:p>
-      <w:pPr>
-        <w:spacing w:line="276" w:lineRule="auto"/>
-        <w:rPr>
-          <w:rFonts w:ascii="Arvo" w:hAnsi="Arvo"/>
-          <w:sz w:val="2"/>
-          <w:szCs w:val="2"/>
-        </w:rPr>
-      </w:pPr>
-      <w:r>
-        <w:rPr>
-          <w:rFonts w:ascii="Arvo" w:hAnsi="Arvo"/>
-          <w:sz w:val="2"/>
-          <w:szCs w:val="2"/>
-        </w:rPr>
-        <w:t>{%p for hon in consultiva.itens %}</w:t>
-      </w:r>
-    </w:p>
-    <w:p>
-      <w:pPr>
-        <w:spacing w:line="276" w:lineRule="auto"/>
-        <w:rPr>
-          <w:rFonts w:ascii="Arvo" w:hAnsi="Arvo"/>
-          <w:sz w:val="2"/>
-          <w:szCs w:val="2"/>
-        </w:rPr>
-      </w:pPr>
-      <w:r>
-        <w:rPr>
-          <w:rFonts w:ascii="Arvo" w:hAnsi="Arvo"/>
-          <w:sz w:val="2"/>
-          <w:szCs w:val="2"/>
-        </w:rPr>
-        <w:t>{{p hon.subdoc}}</w:t>
-      </w:r>
-    </w:p>
-    <w:p>
-      <w:pPr>
-        <w:spacing w:line="276" w:lineRule="auto"/>
-        <w:rPr>
-          <w:rFonts w:ascii="Arvo" w:hAnsi="Arvo"/>
-          <w:sz w:val="2"/>
-          <w:szCs w:val="2"/>
-        </w:rPr>
-      </w:pPr>
-      <w:r>
-        <w:rPr>
-          <w:rFonts w:ascii="Arvo" w:hAnsi="Arvo"/>
-          <w:sz w:val="2"/>
-          <w:szCs w:val="2"/>
-        </w:rPr>
-        <w:t>{%p endfor %}</w:t>
       </w:r>
     </w:p>
     <w:p>
@@ -4052,6 +4029,7 @@
           <w:sz w:val="20"/>
           <w:szCs w:val="20"/>
         </w:rPr>
+        <w:lastRenderedPageBreak/>
         <w:t xml:space="preserve">Preço </w:t>
       </w:r>
       <w:r>
@@ -4444,7 +4422,6 @@
           <w:sz w:val="20"/>
           <w:szCs w:val="20"/>
         </w:rPr>
-        <w:lastRenderedPageBreak/>
         <w:t>Preço Global</w:t>
       </w:r>
     </w:p>
@@ -5137,6 +5114,7 @@
           <w:sz w:val="20"/>
           <w:szCs w:val="20"/>
         </w:rPr>
+        <w:lastRenderedPageBreak/>
         <w:t xml:space="preserve">Horas para Serviços </w:t>
       </w:r>
       <w:r>
@@ -5629,7 +5607,6 @@
           <w:sz w:val="20"/>
           <w:szCs w:val="20"/>
         </w:rPr>
-        <w:lastRenderedPageBreak/>
         <w:t>Hora Fixa (independente do executor)</w:t>
       </w:r>
     </w:p>
@@ -5842,130 +5819,6 @@
     </w:p>
     <w:p>
       <w:pPr>
-        <w:spacing w:line="276" w:lineRule="auto"/>
-        <w:rPr>
-          <w:rFonts w:ascii="Arvo" w:hAnsi="Arvo"/>
-          <w:sz w:val="2"/>
-          <w:szCs w:val="2"/>
-        </w:rPr>
-      </w:pPr>
-      <w:r>
-        <w:rPr>
-          <w:rFonts w:ascii="Arvo" w:hAnsi="Arvo"/>
-          <w:sz w:val="2"/>
-          <w:szCs w:val="2"/>
-        </w:rPr>
-        <w:t>{%p if escopo.show_contenciosa and contenciosa.forma_por_escopo %}</w:t>
-      </w:r>
-    </w:p>
-    <w:p>
-      <w:pPr>
-        <w:spacing w:line="276" w:lineRule="auto"/>
-        <w:rPr>
-          <w:rFonts w:ascii="Arvo" w:hAnsi="Arvo"/>
-          <w:b/>
-          <w:bCs/>
-          <w:sz w:val="20"/>
-          <w:szCs w:val="20"/>
-        </w:rPr>
-        <w:jc w:val="both"/>
-      </w:pPr>
-      <w:r>
-        <w:rPr>
-          <w:rFonts w:ascii="Arvo" w:hAnsi="Arvo"/>
-          <w:b/>
-          <w:bCs/>
-          <w:u w:val="single"/>
-          <w:sz w:val="20"/>
-          <w:szCs w:val="20"/>
-        </w:rPr>
-        <w:t xml:space="preserve">Honorários Propostos para os Escopos Contenciosos</w:t>
-      </w:r>
-    </w:p>
-    <w:p>
-      <w:pPr>
-        <w:spacing w:line="276" w:lineRule="auto"/>
-        <w:rPr>
-          <w:rFonts w:ascii="Arvo" w:hAnsi="Arvo"/>
-          <w:sz w:val="20"/>
-          <w:szCs w:val="20"/>
-        </w:rPr>
-      </w:pPr>
-    </w:p>
-    <w:p>
-      <w:pPr>
-        <w:spacing w:line="276" w:lineRule="auto"/>
-        <w:rPr>
-          <w:rFonts w:ascii="Arvo" w:hAnsi="Arvo"/>
-          <w:sz w:val="2"/>
-          <w:szCs w:val="2"/>
-        </w:rPr>
-      </w:pPr>
-      <w:r>
-        <w:rPr>
-          <w:rFonts w:ascii="Arvo" w:hAnsi="Arvo"/>
-          <w:sz w:val="2"/>
-          <w:szCs w:val="2"/>
-        </w:rPr>
-        <w:t>{%p for hon in contenciosa.itens %}</w:t>
-      </w:r>
-    </w:p>
-    <w:p>
-      <w:pPr>
-        <w:spacing w:line="276" w:lineRule="auto"/>
-        <w:rPr>
-          <w:rFonts w:ascii="Arvo" w:hAnsi="Arvo"/>
-          <w:sz w:val="2"/>
-          <w:szCs w:val="2"/>
-        </w:rPr>
-      </w:pPr>
-      <w:r>
-        <w:rPr>
-          <w:rFonts w:ascii="Arvo" w:hAnsi="Arvo"/>
-          <w:sz w:val="2"/>
-          <w:szCs w:val="2"/>
-        </w:rPr>
-        <w:t>{{p hon.subdoc}}</w:t>
-      </w:r>
-    </w:p>
-    <w:p>
-      <w:pPr>
-        <w:spacing w:line="276" w:lineRule="auto"/>
-        <w:rPr>
-          <w:rFonts w:ascii="Arvo" w:hAnsi="Arvo"/>
-          <w:sz w:val="2"/>
-          <w:szCs w:val="2"/>
-        </w:rPr>
-      </w:pPr>
-      <w:r>
-        <w:rPr>
-          <w:rFonts w:ascii="Arvo" w:hAnsi="Arvo"/>
-          <w:sz w:val="2"/>
-          <w:szCs w:val="2"/>
-        </w:rPr>
-        <w:t>{%p endfor %}</w:t>
-      </w:r>
-    </w:p>
-    <w:p>
-      <w:pPr>
-        <w:spacing w:line="276" w:lineRule="auto"/>
-        <w:rPr>
-          <w:rFonts w:ascii="Arvo" w:hAnsi="Arvo"/>
-          <w:sz w:val="2"/>
-          <w:szCs w:val="2"/>
-        </w:rPr>
-      </w:pPr>
-      <w:r>
-        <w:rPr>
-          <w:rFonts w:ascii="Arvo" w:hAnsi="Arvo"/>
-          <w:sz w:val="2"/>
-          <w:szCs w:val="2"/>
-        </w:rPr>
-        <w:t>{%p endif %}</w:t>
-      </w:r>
-    </w:p>
-    <w:p>
-      <w:pPr>
         <w:keepNext/>
         <w:snapToGrid w:val="0"/>
         <w:spacing w:line="276" w:lineRule="auto"/>
@@ -6617,6 +6470,7 @@
           <w:sz w:val="20"/>
           <w:szCs w:val="20"/>
         </w:rPr>
+        <w:lastRenderedPageBreak/>
         <w:t>{{disposicoes.descricao}}</w:t>
       </w:r>
     </w:p>
@@ -6969,7 +6823,6 @@
           <w:sz w:val="20"/>
           <w:szCs w:val="20"/>
         </w:rPr>
-        <w:lastRenderedPageBreak/>
         <w:t>OBJETO</w:t>
       </w:r>
     </w:p>
@@ -7473,6 +7326,7 @@
           <w:sz w:val="20"/>
           <w:szCs w:val="20"/>
         </w:rPr>
+        <w:lastRenderedPageBreak/>
         <w:t xml:space="preserve">O inadimplemento de qualquer obrigação pecuniária prevista </w:t>
       </w:r>
       <w:r>
@@ -7703,7 +7557,6 @@
           <w:sz w:val="20"/>
           <w:szCs w:val="20"/>
         </w:rPr>
-        <w:lastRenderedPageBreak/>
         <w:t>Caso aplicável a esta Proposta, os honorários de sucumbência arbitrados em favor da parte patrocinada, nos termos do artigo 85 do Código de Processo Civil e do artigo 22 da Lei n. 8.906/1994, pertencem com exclusividade ao Contratado.</w:t>
       </w:r>
     </w:p>
@@ -8183,6 +8036,7 @@
           <w:sz w:val="20"/>
           <w:szCs w:val="20"/>
         </w:rPr>
+        <w:lastRenderedPageBreak/>
         <w:t>OBRIGAÇÕES DO CONTRATADO</w:t>
       </w:r>
     </w:p>
@@ -8847,16 +8701,7 @@
           <w:sz w:val="20"/>
           <w:szCs w:val="20"/>
         </w:rPr>
-        <w:t xml:space="preserve">, sem prejuízo das sanções legais cabíveis e do ressarcimento integral dos prejuízos experimentados pela Parte inocente, obrigando-se cada Parte a notificar a outra imediatamente, por escrito, ao </w:t>
-      </w:r>
-      <w:r>
-        <w:rPr>
-          <w:rFonts w:ascii="Arvo" w:hAnsi="Arvo"/>
-          <w:sz w:val="20"/>
-          <w:szCs w:val="20"/>
-        </w:rPr>
-        <w:lastRenderedPageBreak/>
-        <w:t>tomar conhecimento de qualquer indício de descumprimento, cooperando de boa-fé para a sua apuração.</w:t>
+        <w:t>, sem prejuízo das sanções legais cabíveis e do ressarcimento integral dos prejuízos experimentados pela Parte inocente, obrigando-se cada Parte a notificar a outra imediatamente, por escrito, ao tomar conhecimento de qualquer indício de descumprimento, cooperando de boa-fé para a sua apuração.</w:t>
       </w:r>
     </w:p>
     <w:p>
@@ -9112,6 +8957,7 @@
           <w:sz w:val="20"/>
           <w:szCs w:val="20"/>
         </w:rPr>
+        <w:lastRenderedPageBreak/>
         <w:t>PROTEÇÃO DE DADOS PESSOAIS</w:t>
       </w:r>
     </w:p>
@@ -9149,29 +8995,15 @@
           <w:sz w:val="20"/>
           <w:szCs w:val="20"/>
         </w:rPr>
-        <w:t>No tratamento de dados pessoais realizado em razão dest</w:t>
-      </w:r>
-      <w:r>
-        <w:rPr>
-          <w:rFonts w:ascii="Arvo" w:hAnsi="Arvo"/>
-          <w:sz w:val="20"/>
-          <w:szCs w:val="20"/>
-        </w:rPr>
-        <w:t>a Proposta</w:t>
-      </w:r>
-      <w:r>
-        <w:rPr>
-          <w:rFonts w:ascii="Arvo" w:hAnsi="Arvo"/>
-          <w:sz w:val="20"/>
-          <w:szCs w:val="20"/>
-        </w:rPr>
-        <w:t>, as Partes observarão a Lei n. 13.709/2018 (LGPD) e as normas editadas pela Autoridade Nacional de Proteção de Dados (ANPD), atuando cada qual, conforme o caso, na qualidade de controladora ou operadora, nos termos do artigo 5º da LGPD.</w:t>
+        <w:t>No tratamento de dados pessoais realizado em razão desta Proposta, as Partes observarão a Lei n. 13.709/2018 (LGPD) e as normas editadas pela Autoridade Nacional de Proteção de Dados (ANPD), atuando cada qual, conforme o caso, na qualidade de controladora ou operadora, nos termos do artigo 5º da LGPD. O tratamento de dados pessoais limitar-se-á às finalidades necessárias ou decorrentes do cumprimento das obrigações contratuais, observados os princípios da LGPD.</w:t>
       </w:r>
     </w:p>
     <w:p>
       <w:pPr>
         <w:pStyle w:val="PargrafodaLista"/>
         <w:spacing w:line="276" w:lineRule="auto"/>
+        <w:ind w:left="709" w:hanging="709"/>
+        <w:jc w:val="both"/>
         <w:rPr>
           <w:rFonts w:ascii="Arvo" w:hAnsi="Arvo"/>
           <w:sz w:val="20"/>
@@ -9202,61 +9034,7 @@
           <w:sz w:val="20"/>
           <w:szCs w:val="20"/>
         </w:rPr>
-        <w:t>O tratamento de dados pessoais limitar-se-á às finalidades necessárias ao cumprimento das obrigações contratuais, tendo por base legal, conforme o caso, a execução de contrato, o cumprimento de obrigação legal ou regulatória, o exercício regular de direitos em processos judiciais, administrativos ou arbitrais, ou os interesses legítimos das Partes, observados os princípios da LGPD.</w:t>
-      </w:r>
-    </w:p>
-    <w:p>
-      <w:pPr>
-        <w:pStyle w:val="PargrafodaLista"/>
-        <w:spacing w:line="276" w:lineRule="auto"/>
-        <w:rPr>
-          <w:rFonts w:ascii="Arvo" w:hAnsi="Arvo"/>
-          <w:sz w:val="20"/>
-          <w:szCs w:val="20"/>
-        </w:rPr>
-      </w:pPr>
-    </w:p>
-    <w:p>
-      <w:pPr>
-        <w:pStyle w:val="PargrafodaLista"/>
-        <w:numPr>
-          <w:ilvl w:val="1"/>
-          <w:numId w:val="2"/>
-        </w:numPr>
-        <w:snapToGrid w:val="0"/>
-        <w:spacing w:line="276" w:lineRule="auto"/>
-        <w:ind w:left="709" w:hanging="709"/>
-        <w:jc w:val="both"/>
-        <w:rPr>
-          <w:rFonts w:ascii="Arvo" w:hAnsi="Arvo"/>
-          <w:sz w:val="20"/>
-          <w:szCs w:val="20"/>
-        </w:rPr>
-      </w:pPr>
-      <w:r>
-        <w:rPr>
-          <w:rFonts w:ascii="Arvo" w:hAnsi="Arvo"/>
-          <w:sz w:val="20"/>
-          <w:szCs w:val="20"/>
-        </w:rPr>
-        <w:lastRenderedPageBreak/>
-        <w:t xml:space="preserve">As Partes comprometem-se a adotar medidas técnicas e administrativas adequadas para proteger os dados pessoais tratados contra acessos não autorizados e situações ilícitas, a não </w:t>
-      </w:r>
-      <w:r>
-        <w:rPr>
-          <w:rFonts w:ascii="Arvo" w:hAnsi="Arvo"/>
-          <w:sz w:val="20"/>
-          <w:szCs w:val="20"/>
-        </w:rPr>
-        <w:t>os compartilhar</w:t>
-      </w:r>
-      <w:r>
-        <w:rPr>
-          <w:rFonts w:ascii="Arvo" w:hAnsi="Arvo"/>
-          <w:sz w:val="20"/>
-          <w:szCs w:val="20"/>
-        </w:rPr>
-        <w:t xml:space="preserve"> fora das hipóteses legais ou contratuais, a submeter eventuais suboperadores a obrigações equivalentes e a notificar a outra Parte, em até 24 (vinte e quatro) horas da ciência, de qualquer incidente de segurança envolvendo dados pessoais desta contratação.</w:t>
+        <w:t>A Contratada possui uma Política de Privacidade que estabelece as regras e práticas de tratamento pela Contratada dos dados pessoais dos seus clientes, incluindo dos respectivos representantes legais, diretores e funcionários, podendo o Contratante solicitar à Contratada uma cópia da versão atualizada desse documento. As Partes comprometem-se a adotar medidas técnicas e administrativas adequadas para proteger os dados pessoais tratados contra acessos não autorizados e situações ilícitas, e a não os compartilhar fora das hipóteses legais ou contratuais.</w:t>
       </w:r>
     </w:p>
     <w:p>
@@ -9544,7 +9322,16 @@
           <w:sz w:val="20"/>
           <w:szCs w:val="20"/>
         </w:rPr>
-        <w:t xml:space="preserve">, sem aviso prévio e sem penalidade, nas seguintes hipóteses: (i) inadimplemento de obrigação contratual relevante pela outra Parte, não sanado no prazo de 15 (quinze) dias contados da notificação; (ii) impossibilidade superveniente e objetivamente verificável de cumprimento das obrigações assumidas; (iii) conflito de interesses que, à luz das normas da advocacia, impeça a continuidade da representação; e (iv) </w:t>
+        <w:t xml:space="preserve">, sem aviso prévio e sem penalidade, nas seguintes hipóteses: (i) inadimplemento de obrigação contratual relevante pela outra Parte, não sanado no prazo de 15 (quinze) dias contados da notificação; (ii) impossibilidade superveniente e objetivamente verificável de cumprimento das obrigações assumidas; (iii) conflito de interesses que, à luz das normas da advocacia, impeça </w:t>
+      </w:r>
+      <w:r>
+        <w:rPr>
+          <w:rFonts w:ascii="Arvo" w:hAnsi="Arvo"/>
+          <w:sz w:val="20"/>
+          <w:szCs w:val="20"/>
+        </w:rPr>
+        <w:lastRenderedPageBreak/>
+        <w:t xml:space="preserve">a continuidade da representação; e (iv) </w:t>
       </w:r>
       <w:r>
         <w:rPr>
@@ -9728,7 +9515,6 @@
           <w:sz w:val="20"/>
           <w:szCs w:val="20"/>
         </w:rPr>
-        <w:lastRenderedPageBreak/>
         <w:t>A presente Proposta</w:t>
       </w:r>
       <w:r>
@@ -10069,6 +9855,7 @@
           <w:sz w:val="20"/>
           <w:szCs w:val="20"/>
         </w:rPr>
+        <w:lastRenderedPageBreak/>
         <w:t>.</w:t>
       </w:r>
     </w:p>
@@ -10389,7 +10176,6 @@
           <w:sz w:val="20"/>
           <w:szCs w:val="20"/>
         </w:rPr>
-        <w:lastRenderedPageBreak/>
         <w:t>(preencher e assinar caso firmado com assinaturas físicas ou por meio de certificado digital)</w:t>
       </w:r>
     </w:p>
@@ -12073,6 +11859,26 @@
 </file>
 
 <file path=customXml/item1.xml><?xml version="1.0" encoding="utf-8"?>
+<?mso-contentType ?>
+<FormTemplates xmlns="http://schemas.microsoft.com/sharepoint/v3/contenttype/forms">
+  <Display>DocumentLibraryForm</Display>
+  <Edit>DocumentLibraryForm</Edit>
+  <New>DocumentLibraryForm</New>
+</FormTemplates>
+</file>
+
+<file path=customXml/item2.xml><?xml version="1.0" encoding="utf-8"?>
+<p:properties xmlns:p="http://schemas.microsoft.com/office/2006/metadata/properties" xmlns:xsi="http://www.w3.org/2001/XMLSchema-instance" xmlns:pc="http://schemas.microsoft.com/office/infopath/2007/PartnerControls">
+  <documentManagement>
+    <lcf76f155ced4ddcb4097134ff3c332f xmlns="e5b1cd33-4eca-41a4-b7d8-fdf3e6200119">
+      <Terms xmlns="http://schemas.microsoft.com/office/infopath/2007/PartnerControls"/>
+    </lcf76f155ced4ddcb4097134ff3c332f>
+    <TaxCatchAll xmlns="c710a95f-4097-48d0-b72e-528dcf24b561" xsi:nil="true"/>
+  </documentManagement>
+</p:properties>
+</file>
+
+<file path=customXml/item3.xml><?xml version="1.0" encoding="utf-8"?>
 <ct:contentTypeSchema xmlns:ct="http://schemas.microsoft.com/office/2006/metadata/contentType" xmlns:ma="http://schemas.microsoft.com/office/2006/metadata/properties/metaAttributes" ct:_="" ma:_="" ma:contentTypeName="Documento" ma:contentTypeID="0x010100C538FE3DE9F5C249B208F757A39C9CF1" ma:contentTypeVersion="13" ma:contentTypeDescription="Crie um novo documento." ma:contentTypeScope="" ma:versionID="f58841031a2b8acc55807e179e1eb129">
   <xsd:schema xmlns:xsd="http://www.w3.org/2001/XMLSchema" xmlns:xs="http://www.w3.org/2001/XMLSchema" xmlns:p="http://schemas.microsoft.com/office/2006/metadata/properties" xmlns:ns2="e5b1cd33-4eca-41a4-b7d8-fdf3e6200119" xmlns:ns3="c710a95f-4097-48d0-b72e-528dcf24b561" targetNamespace="http://schemas.microsoft.com/office/2006/metadata/properties" ma:root="true" ma:fieldsID="eabb80da9e4a7645788b9624de58e5c8" ns2:_="" ns3:_="">
     <xsd:import namespace="e5b1cd33-4eca-41a4-b7d8-fdf3e6200119"/>
@@ -12279,27 +12085,26 @@
 </ct:contentTypeSchema>
 </file>
 
-<file path=customXml/item2.xml><?xml version="1.0" encoding="utf-8"?>
-<p:properties xmlns:p="http://schemas.microsoft.com/office/2006/metadata/properties" xmlns:xsi="http://www.w3.org/2001/XMLSchema-instance" xmlns:pc="http://schemas.microsoft.com/office/infopath/2007/PartnerControls">
-  <documentManagement>
-    <lcf76f155ced4ddcb4097134ff3c332f xmlns="e5b1cd33-4eca-41a4-b7d8-fdf3e6200119">
-      <Terms xmlns="http://schemas.microsoft.com/office/infopath/2007/PartnerControls"/>
-    </lcf76f155ced4ddcb4097134ff3c332f>
-    <TaxCatchAll xmlns="c710a95f-4097-48d0-b72e-528dcf24b561" xsi:nil="true"/>
-  </documentManagement>
-</p:properties>
+<file path=customXml/itemProps1.xml><?xml version="1.0" encoding="utf-8"?>
+<ds:datastoreItem xmlns:ds="http://schemas.openxmlformats.org/officeDocument/2006/customXml" ds:itemID="{A5ED3DFB-4F39-4BF8-995C-27FE2C86527B}">
+  <ds:schemaRefs>
+    <ds:schemaRef ds:uri="http://schemas.microsoft.com/sharepoint/v3/contenttype/forms"/>
+  </ds:schemaRefs>
+</ds:datastoreItem>
 </file>
 
-<file path=customXml/item3.xml><?xml version="1.0" encoding="utf-8"?>
-<?mso-contentType ?>
-<FormTemplates xmlns="http://schemas.microsoft.com/sharepoint/v3/contenttype/forms">
-  <Display>DocumentLibraryForm</Display>
-  <Edit>DocumentLibraryForm</Edit>
-  <New>DocumentLibraryForm</New>
-</FormTemplates>
+<file path=customXml/itemProps2.xml><?xml version="1.0" encoding="utf-8"?>
+<ds:datastoreItem xmlns:ds="http://schemas.openxmlformats.org/officeDocument/2006/customXml" ds:itemID="{CB7613A1-A0CB-4E22-AF85-27793339D14D}">
+  <ds:schemaRefs>
+    <ds:schemaRef ds:uri="http://schemas.microsoft.com/office/2006/metadata/properties"/>
+    <ds:schemaRef ds:uri="http://schemas.microsoft.com/office/infopath/2007/PartnerControls"/>
+    <ds:schemaRef ds:uri="e5b1cd33-4eca-41a4-b7d8-fdf3e6200119"/>
+    <ds:schemaRef ds:uri="c710a95f-4097-48d0-b72e-528dcf24b561"/>
+  </ds:schemaRefs>
+</ds:datastoreItem>
 </file>
 
-<file path=customXml/itemProps1.xml><?xml version="1.0" encoding="utf-8"?>
+<file path=customXml/itemProps3.xml><?xml version="1.0" encoding="utf-8"?>
 <ds:datastoreItem xmlns:ds="http://schemas.openxmlformats.org/officeDocument/2006/customXml" ds:itemID="{527C8FAF-F895-460C-92FD-63B7C6027339}">
   <ds:schemaRefs>
     <ds:schemaRef ds:uri="http://schemas.microsoft.com/office/2006/metadata/contentType"/>
@@ -12316,23 +12121,4 @@
     <ds:schemaRef ds:uri="http://schemas.microsoft.com/internal/obd"/>
   </ds:schemaRefs>
 </ds:datastoreItem>
-</file>
-
-<file path=customXml/itemProps2.xml><?xml version="1.0" encoding="utf-8"?>
-<ds:datastoreItem xmlns:ds="http://schemas.openxmlformats.org/officeDocument/2006/customXml" ds:itemID="{CB7613A1-A0CB-4E22-AF85-27793339D14D}">
-  <ds:schemaRefs>
-    <ds:schemaRef ds:uri="http://schemas.microsoft.com/office/2006/metadata/properties"/>
-    <ds:schemaRef ds:uri="http://schemas.microsoft.com/office/infopath/2007/PartnerControls"/>
-    <ds:schemaRef ds:uri="e5b1cd33-4eca-41a4-b7d8-fdf3e6200119"/>
-    <ds:schemaRef ds:uri="c710a95f-4097-48d0-b72e-528dcf24b561"/>
-  </ds:schemaRefs>
-</ds:datastoreItem>
-</file>
-
-<file path=customXml/itemProps3.xml><?xml version="1.0" encoding="utf-8"?>
-<ds:datastoreItem xmlns:ds="http://schemas.openxmlformats.org/officeDocument/2006/customXml" ds:itemID="{A5ED3DFB-4F39-4BF8-995C-27FE2C86527B}">
-  <ds:schemaRefs>
-    <ds:schemaRef ds:uri="http://schemas.microsoft.com/sharepoint/v3/contenttype/forms"/>
-  </ds:schemaRefs>
-</ds:datastoreItem>
 </file>
</xml_diff>

<commit_message>
feat(template): data no cabeçalho da proposta (via markers)
Markers atualizado pelo dono do projeto: adiciona linha de data alinhada
à direita no topo do documento, antes do título, com campo Word
TIME \@ "d 'de' MMMM 'de' yyyy" (atualiza para a data de abertura/impressão).

Fluxo de markers (PMRA_Template_Markers.docx -> build_from_markers.py ->
PMRA_Template_Jinja.docx). Verificações:
- 118 markers / 118 tags Jinja idênticos ao template anterior (round-trip lossless)
- markers committed = upload do usuário (byte-idêntico)
- sem markers residuais, paraIds únicos (406), abre no python-docx
- pytest (66) e smoke_test (3 cenários) verdes
- data renderiza no topo, à direita, antes do título

Bump APP_VERSION 2.0.38 -> 2.0.39 (PATCH).
</commit_message>
<xml_diff>
--- a/resources/templates/PMRA_Template_Jinja.docx
+++ b/resources/templates/PMRA_Template_Jinja.docx
@@ -6,14 +6,68 @@
       <w:pPr>
         <w:snapToGrid w:val="0"/>
         <w:spacing w:line="276" w:lineRule="auto"/>
+        <w:jc w:val="right"/>
+        <w:rPr>
+          <w:rFonts w:ascii="Arvo" w:hAnsi="Arvo"/>
+          <w:sz w:val="20"/>
+          <w:szCs w:val="20"/>
+        </w:rPr>
+      </w:pPr>
+      <w:r>
+        <w:rPr>
+          <w:rFonts w:ascii="Arvo" w:hAnsi="Arvo"/>
+          <w:sz w:val="20"/>
+          <w:szCs w:val="20"/>
+        </w:rPr>
+        <w:fldChar w:fldCharType="begin"/>
+      </w:r>
+      <w:r>
+        <w:rPr>
+          <w:rFonts w:ascii="Arvo" w:hAnsi="Arvo"/>
+          <w:sz w:val="20"/>
+          <w:szCs w:val="20"/>
+        </w:rPr>
+        <w:instrText xml:space="preserve"> TIME \@ "d 'de' MMMM 'de' yyyy" </w:instrText>
+      </w:r>
+      <w:r>
+        <w:rPr>
+          <w:rFonts w:ascii="Arvo" w:hAnsi="Arvo"/>
+          <w:sz w:val="20"/>
+          <w:szCs w:val="20"/>
+        </w:rPr>
+        <w:fldChar w:fldCharType="separate"/>
+      </w:r>
+      <w:r>
+        <w:rPr>
+          <w:rFonts w:ascii="Arvo" w:hAnsi="Arvo"/>
+          <w:noProof/>
+          <w:sz w:val="20"/>
+          <w:szCs w:val="20"/>
+        </w:rPr>
+        <w:t>2 de junho de 2026</w:t>
+      </w:r>
+      <w:r>
+        <w:rPr>
+          <w:rFonts w:ascii="Arvo" w:hAnsi="Arvo"/>
+          <w:sz w:val="20"/>
+          <w:szCs w:val="20"/>
+        </w:rPr>
+        <w:fldChar w:fldCharType="end"/>
+      </w:r>
+      <w:r>
+        <w:rPr>
+          <w:rFonts w:ascii="Arvo" w:hAnsi="Arvo"/>
+          <w:sz w:val="20"/>
+          <w:szCs w:val="20"/>
+        </w:rPr>
+        <w:t>.</w:t>
+      </w:r>
+    </w:p>
+    <w:p>
+      <w:pPr>
+        <w:snapToGrid w:val="0"/>
+        <w:spacing w:line="276" w:lineRule="auto"/>
         <w:jc w:val="center"/>
-        <w:rPr>
-          <w:rFonts w:ascii="Arvo" w:hAnsi="Arvo"/>
-          <w:sz w:val="20"/>
-          <w:szCs w:val="20"/>
-        </w:rPr>
-      </w:pPr>
-      <w:r>
         <w:rPr>
           <w:rFonts w:ascii="Arvo" w:hAnsi="Arvo"/>
           <w:b/>
@@ -21,8 +75,19 @@
           <w:sz w:val="20"/>
           <w:szCs w:val="20"/>
         </w:rPr>
-        <w:t xml:space="preserve">Proposta </w:t>
-      </w:r>
+      </w:pPr>
+    </w:p>
+    <w:p>
+      <w:pPr>
+        <w:snapToGrid w:val="0"/>
+        <w:spacing w:line="276" w:lineRule="auto"/>
+        <w:jc w:val="center"/>
+        <w:rPr>
+          <w:rFonts w:ascii="Arvo" w:hAnsi="Arvo"/>
+          <w:sz w:val="20"/>
+          <w:szCs w:val="20"/>
+        </w:rPr>
+      </w:pPr>
       <w:r>
         <w:rPr>
           <w:rFonts w:ascii="Arvo" w:hAnsi="Arvo"/>
@@ -31,7 +96,7 @@
           <w:sz w:val="20"/>
           <w:szCs w:val="20"/>
         </w:rPr>
-        <w:t>para</w:t>
+        <w:t xml:space="preserve">Proposta </w:t>
       </w:r>
       <w:r>
         <w:rPr>
@@ -41,7 +106,7 @@
           <w:sz w:val="20"/>
           <w:szCs w:val="20"/>
         </w:rPr>
-        <w:t xml:space="preserve"> Prestação </w:t>
+        <w:t>para</w:t>
       </w:r>
       <w:r>
         <w:rPr>
@@ -51,7 +116,7 @@
           <w:sz w:val="20"/>
           <w:szCs w:val="20"/>
         </w:rPr>
-        <w:t>d</w:t>
+        <w:t xml:space="preserve"> Prestação </w:t>
       </w:r>
       <w:r>
         <w:rPr>
@@ -61,7 +126,7 @@
           <w:sz w:val="20"/>
           <w:szCs w:val="20"/>
         </w:rPr>
-        <w:t xml:space="preserve">e Serviços </w:t>
+        <w:t>d</w:t>
       </w:r>
       <w:r>
         <w:rPr>
@@ -71,6 +136,16 @@
           <w:sz w:val="20"/>
           <w:szCs w:val="20"/>
         </w:rPr>
+        <w:t xml:space="preserve">e Serviços </w:t>
+      </w:r>
+      <w:r>
+        <w:rPr>
+          <w:rFonts w:ascii="Arvo" w:hAnsi="Arvo"/>
+          <w:b/>
+          <w:bCs/>
+          <w:sz w:val="20"/>
+          <w:szCs w:val="20"/>
+        </w:rPr>
         <w:t>Advocatícios</w:t>
       </w:r>
     </w:p>
@@ -78,6 +153,7 @@
       <w:pPr>
         <w:snapToGrid w:val="0"/>
         <w:spacing w:line="276" w:lineRule="auto"/>
+        <w:jc w:val="right"/>
         <w:rPr>
           <w:rFonts w:ascii="Arvo" w:hAnsi="Arvo"/>
           <w:sz w:val="20"/>
@@ -2396,6 +2472,7 @@
                 <w:sz w:val="20"/>
                 <w:szCs w:val="20"/>
               </w:rPr>
+              <w:lastRenderedPageBreak/>
               <w:t>{%tr if consultiva.show_valor_projeto_cap %}</w:t>
             </w:r>
           </w:p>
@@ -2465,7 +2542,6 @@
                 <w:sz w:val="20"/>
                 <w:szCs w:val="20"/>
               </w:rPr>
-              <w:lastRenderedPageBreak/>
               <w:t>Cap de Horas</w:t>
             </w:r>
           </w:p>
@@ -9831,6 +9907,18 @@
         </w:rPr>
         <w:t>dispensando expressamente a colheita de assinaturas de testemunhas, na forma do artigo 34 da Lei n. 14.620/2023.</w:t>
       </w:r>
+    </w:p>
+    <w:p>
+      <w:pPr>
+        <w:pStyle w:val="PargrafodaLista"/>
+        <w:spacing w:line="276" w:lineRule="auto"/>
+        <w:jc w:val="both"/>
+        <w:rPr>
+          <w:rFonts w:ascii="Arvo" w:hAnsi="Arvo"/>
+          <w:sz w:val="20"/>
+          <w:szCs w:val="20"/>
+        </w:rPr>
+      </w:pPr>
     </w:p>
     <w:p>
       <w:pPr>
@@ -11859,15 +11947,6 @@
 </file>
 
 <file path=customXml/item1.xml><?xml version="1.0" encoding="utf-8"?>
-<?mso-contentType ?>
-<FormTemplates xmlns="http://schemas.microsoft.com/sharepoint/v3/contenttype/forms">
-  <Display>DocumentLibraryForm</Display>
-  <Edit>DocumentLibraryForm</Edit>
-  <New>DocumentLibraryForm</New>
-</FormTemplates>
-</file>
-
-<file path=customXml/item2.xml><?xml version="1.0" encoding="utf-8"?>
 <p:properties xmlns:p="http://schemas.microsoft.com/office/2006/metadata/properties" xmlns:xsi="http://www.w3.org/2001/XMLSchema-instance" xmlns:pc="http://schemas.microsoft.com/office/infopath/2007/PartnerControls">
   <documentManagement>
     <lcf76f155ced4ddcb4097134ff3c332f xmlns="e5b1cd33-4eca-41a4-b7d8-fdf3e6200119">
@@ -11878,7 +11957,7 @@
 </p:properties>
 </file>
 
-<file path=customXml/item3.xml><?xml version="1.0" encoding="utf-8"?>
+<file path=customXml/item2.xml><?xml version="1.0" encoding="utf-8"?>
 <ct:contentTypeSchema xmlns:ct="http://schemas.microsoft.com/office/2006/metadata/contentType" xmlns:ma="http://schemas.microsoft.com/office/2006/metadata/properties/metaAttributes" ct:_="" ma:_="" ma:contentTypeName="Documento" ma:contentTypeID="0x010100C538FE3DE9F5C249B208F757A39C9CF1" ma:contentTypeVersion="13" ma:contentTypeDescription="Crie um novo documento." ma:contentTypeScope="" ma:versionID="f58841031a2b8acc55807e179e1eb129">
   <xsd:schema xmlns:xsd="http://www.w3.org/2001/XMLSchema" xmlns:xs="http://www.w3.org/2001/XMLSchema" xmlns:p="http://schemas.microsoft.com/office/2006/metadata/properties" xmlns:ns2="e5b1cd33-4eca-41a4-b7d8-fdf3e6200119" xmlns:ns3="c710a95f-4097-48d0-b72e-528dcf24b561" targetNamespace="http://schemas.microsoft.com/office/2006/metadata/properties" ma:root="true" ma:fieldsID="eabb80da9e4a7645788b9624de58e5c8" ns2:_="" ns3:_="">
     <xsd:import namespace="e5b1cd33-4eca-41a4-b7d8-fdf3e6200119"/>
@@ -12085,15 +12164,16 @@
 </ct:contentTypeSchema>
 </file>
 
-<file path=customXml/itemProps1.xml><?xml version="1.0" encoding="utf-8"?>
-<ds:datastoreItem xmlns:ds="http://schemas.openxmlformats.org/officeDocument/2006/customXml" ds:itemID="{A5ED3DFB-4F39-4BF8-995C-27FE2C86527B}">
-  <ds:schemaRefs>
-    <ds:schemaRef ds:uri="http://schemas.microsoft.com/sharepoint/v3/contenttype/forms"/>
-  </ds:schemaRefs>
-</ds:datastoreItem>
+<file path=customXml/item3.xml><?xml version="1.0" encoding="utf-8"?>
+<?mso-contentType ?>
+<FormTemplates xmlns="http://schemas.microsoft.com/sharepoint/v3/contenttype/forms">
+  <Display>DocumentLibraryForm</Display>
+  <Edit>DocumentLibraryForm</Edit>
+  <New>DocumentLibraryForm</New>
+</FormTemplates>
 </file>
 
-<file path=customXml/itemProps2.xml><?xml version="1.0" encoding="utf-8"?>
+<file path=customXml/itemProps1.xml><?xml version="1.0" encoding="utf-8"?>
 <ds:datastoreItem xmlns:ds="http://schemas.openxmlformats.org/officeDocument/2006/customXml" ds:itemID="{CB7613A1-A0CB-4E22-AF85-27793339D14D}">
   <ds:schemaRefs>
     <ds:schemaRef ds:uri="http://schemas.microsoft.com/office/2006/metadata/properties"/>
@@ -12104,7 +12184,7 @@
 </ds:datastoreItem>
 </file>
 
-<file path=customXml/itemProps3.xml><?xml version="1.0" encoding="utf-8"?>
+<file path=customXml/itemProps2.xml><?xml version="1.0" encoding="utf-8"?>
 <ds:datastoreItem xmlns:ds="http://schemas.openxmlformats.org/officeDocument/2006/customXml" ds:itemID="{527C8FAF-F895-460C-92FD-63B7C6027339}">
   <ds:schemaRefs>
     <ds:schemaRef ds:uri="http://schemas.microsoft.com/office/2006/metadata/contentType"/>
@@ -12121,4 +12201,12 @@
     <ds:schemaRef ds:uri="http://schemas.microsoft.com/internal/obd"/>
   </ds:schemaRefs>
 </ds:datastoreItem>
+</file>
+
+<file path=customXml/itemProps3.xml><?xml version="1.0" encoding="utf-8"?>
+<ds:datastoreItem xmlns:ds="http://schemas.openxmlformats.org/officeDocument/2006/customXml" ds:itemID="{A5ED3DFB-4F39-4BF8-995C-27FE2C86527B}">
+  <ds:schemaRefs>
+    <ds:schemaRef ds:uri="http://schemas.microsoft.com/sharepoint/v3/contenttype/forms"/>
+  </ds:schemaRefs>
+</ds:datastoreItem>
 </file>
</xml_diff>

<commit_message>
feat(template): data no cabeçalho + cláusula de revisão tributária ampliada (via markers) (#44)
Atualização do template via fluxo de markers: data auto-atualizável no cabeçalho da proposta e cláusula de revisão tributária ampliada (reforma tributária — EC 132/2023, LC 214/2025, IBS/CBS). Conjunto de 118 tags Jinja inalterado (round-trip lossless). pytest 66/66 e smoke 3/3 verdes. APP_VERSION 2.0.38 -> 2.0.40.
</commit_message>
<xml_diff>
--- a/resources/templates/PMRA_Template_Jinja.docx
+++ b/resources/templates/PMRA_Template_Jinja.docx
@@ -6,14 +6,68 @@
       <w:pPr>
         <w:snapToGrid w:val="0"/>
         <w:spacing w:line="276" w:lineRule="auto"/>
+        <w:jc w:val="right"/>
+        <w:rPr>
+          <w:rFonts w:ascii="Arvo" w:hAnsi="Arvo"/>
+          <w:sz w:val="20"/>
+          <w:szCs w:val="20"/>
+        </w:rPr>
+      </w:pPr>
+      <w:r>
+        <w:rPr>
+          <w:rFonts w:ascii="Arvo" w:hAnsi="Arvo"/>
+          <w:sz w:val="20"/>
+          <w:szCs w:val="20"/>
+        </w:rPr>
+        <w:fldChar w:fldCharType="begin"/>
+      </w:r>
+      <w:r>
+        <w:rPr>
+          <w:rFonts w:ascii="Arvo" w:hAnsi="Arvo"/>
+          <w:sz w:val="20"/>
+          <w:szCs w:val="20"/>
+        </w:rPr>
+        <w:instrText xml:space="preserve"> TIME \@ "d 'de' MMMM 'de' yyyy" </w:instrText>
+      </w:r>
+      <w:r>
+        <w:rPr>
+          <w:rFonts w:ascii="Arvo" w:hAnsi="Arvo"/>
+          <w:sz w:val="20"/>
+          <w:szCs w:val="20"/>
+        </w:rPr>
+        <w:fldChar w:fldCharType="separate"/>
+      </w:r>
+      <w:r>
+        <w:rPr>
+          <w:rFonts w:ascii="Arvo" w:hAnsi="Arvo"/>
+          <w:noProof/>
+          <w:sz w:val="20"/>
+          <w:szCs w:val="20"/>
+        </w:rPr>
+        <w:t>2 de junho de 2026</w:t>
+      </w:r>
+      <w:r>
+        <w:rPr>
+          <w:rFonts w:ascii="Arvo" w:hAnsi="Arvo"/>
+          <w:sz w:val="20"/>
+          <w:szCs w:val="20"/>
+        </w:rPr>
+        <w:fldChar w:fldCharType="end"/>
+      </w:r>
+      <w:r>
+        <w:rPr>
+          <w:rFonts w:ascii="Arvo" w:hAnsi="Arvo"/>
+          <w:sz w:val="20"/>
+          <w:szCs w:val="20"/>
+        </w:rPr>
+        <w:t>.</w:t>
+      </w:r>
+    </w:p>
+    <w:p>
+      <w:pPr>
+        <w:snapToGrid w:val="0"/>
+        <w:spacing w:line="276" w:lineRule="auto"/>
         <w:jc w:val="center"/>
-        <w:rPr>
-          <w:rFonts w:ascii="Arvo" w:hAnsi="Arvo"/>
-          <w:sz w:val="20"/>
-          <w:szCs w:val="20"/>
-        </w:rPr>
-      </w:pPr>
-      <w:r>
         <w:rPr>
           <w:rFonts w:ascii="Arvo" w:hAnsi="Arvo"/>
           <w:b/>
@@ -21,8 +75,19 @@
           <w:sz w:val="20"/>
           <w:szCs w:val="20"/>
         </w:rPr>
-        <w:t xml:space="preserve">Proposta </w:t>
-      </w:r>
+      </w:pPr>
+    </w:p>
+    <w:p>
+      <w:pPr>
+        <w:snapToGrid w:val="0"/>
+        <w:spacing w:line="276" w:lineRule="auto"/>
+        <w:jc w:val="center"/>
+        <w:rPr>
+          <w:rFonts w:ascii="Arvo" w:hAnsi="Arvo"/>
+          <w:sz w:val="20"/>
+          <w:szCs w:val="20"/>
+        </w:rPr>
+      </w:pPr>
       <w:r>
         <w:rPr>
           <w:rFonts w:ascii="Arvo" w:hAnsi="Arvo"/>
@@ -31,7 +96,7 @@
           <w:sz w:val="20"/>
           <w:szCs w:val="20"/>
         </w:rPr>
-        <w:t>para</w:t>
+        <w:t xml:space="preserve">Proposta </w:t>
       </w:r>
       <w:r>
         <w:rPr>
@@ -41,7 +106,7 @@
           <w:sz w:val="20"/>
           <w:szCs w:val="20"/>
         </w:rPr>
-        <w:t xml:space="preserve"> Prestação </w:t>
+        <w:t>para</w:t>
       </w:r>
       <w:r>
         <w:rPr>
@@ -51,7 +116,7 @@
           <w:sz w:val="20"/>
           <w:szCs w:val="20"/>
         </w:rPr>
-        <w:t>d</w:t>
+        <w:t xml:space="preserve"> Prestação </w:t>
       </w:r>
       <w:r>
         <w:rPr>
@@ -61,7 +126,7 @@
           <w:sz w:val="20"/>
           <w:szCs w:val="20"/>
         </w:rPr>
-        <w:t xml:space="preserve">e Serviços </w:t>
+        <w:t>d</w:t>
       </w:r>
       <w:r>
         <w:rPr>
@@ -71,6 +136,16 @@
           <w:sz w:val="20"/>
           <w:szCs w:val="20"/>
         </w:rPr>
+        <w:t xml:space="preserve">e Serviços </w:t>
+      </w:r>
+      <w:r>
+        <w:rPr>
+          <w:rFonts w:ascii="Arvo" w:hAnsi="Arvo"/>
+          <w:b/>
+          <w:bCs/>
+          <w:sz w:val="20"/>
+          <w:szCs w:val="20"/>
+        </w:rPr>
         <w:t>Advocatícios</w:t>
       </w:r>
     </w:p>
@@ -78,6 +153,7 @@
       <w:pPr>
         <w:snapToGrid w:val="0"/>
         <w:spacing w:line="276" w:lineRule="auto"/>
+        <w:jc w:val="right"/>
         <w:rPr>
           <w:rFonts w:ascii="Arvo" w:hAnsi="Arvo"/>
           <w:sz w:val="20"/>
@@ -2396,6 +2472,7 @@
                 <w:sz w:val="20"/>
                 <w:szCs w:val="20"/>
               </w:rPr>
+              <w:lastRenderedPageBreak/>
               <w:t>{%tr if consultiva.show_valor_projeto_cap %}</w:t>
             </w:r>
           </w:p>
@@ -2465,7 +2542,6 @@
                 <w:sz w:val="20"/>
                 <w:szCs w:val="20"/>
               </w:rPr>
-              <w:lastRenderedPageBreak/>
               <w:t>Cap de Horas</w:t>
             </w:r>
           </w:p>
@@ -7487,8 +7563,6 @@
     <w:p>
       <w:pPr>
         <w:pStyle w:val="PargrafodaLista"/>
-        <w:snapToGrid w:val="0"/>
-        <w:spacing w:line="276" w:lineRule="auto"/>
         <w:rPr>
           <w:rFonts w:ascii="Arvo" w:hAnsi="Arvo"/>
           <w:sz w:val="20"/>
@@ -7519,7 +7593,7 @@
           <w:sz w:val="20"/>
           <w:szCs w:val="20"/>
         </w:rPr>
-        <w:t>Na hipótese de instituição, extinção, majoração, redução ou alteração de tributos ou contribuições fiscais e parafiscais, bem como de suas bases de cálculo, alíquotas ou critérios de apuração, que comprovadamente venha a impactar os valores contratados, as Partes promoverão, de boa-fé, a revisão proporcional dos preços, para mais ou para menos, a fim de restabelecer o equilíbrio econômico-financeiro originalmente pactuado, compensando-se as diferenças na primeira oportunidade.</w:t>
+        <w:t>Caso aplicável a esta Proposta, os honorários de sucumbência arbitrados em favor da parte patrocinada, nos termos do artigo 85 do Código de Processo Civil e do artigo 22 da Lei n. 8.906/1994, pertencem com exclusividade ao Contratado.</w:t>
       </w:r>
     </w:p>
     <w:p>
@@ -7557,14 +7631,120 @@
           <w:sz w:val="20"/>
           <w:szCs w:val="20"/>
         </w:rPr>
-        <w:t>Caso aplicável a esta Proposta, os honorários de sucumbência arbitrados em favor da parte patrocinada, nos termos do artigo 85 do Código de Processo Civil e do artigo 22 da Lei n. 8.906/1994, pertencem com exclusividade ao Contratado.</w:t>
-      </w:r>
-    </w:p>
-    <w:p>
-      <w:pPr>
-        <w:snapToGrid w:val="0"/>
-        <w:spacing w:line="276" w:lineRule="auto"/>
+        <w:t>Na hipótese de criação, extinção ou modificação de tributos e contribuições fiscais e parafiscais, de alteração de alíquotas ou dos critérios legais de apuração da base de cálculo, bem como de instituição, ampliação ou supressão de incentivos fiscais de qualquer natureza, incluídas as isenções, reduções ou majorações incidentes sobre tributos federais, estaduais e municipais, as Partes promoverão a revisão dos preços contratados, para mais ou para menos, conforme o caso.</w:t>
+      </w:r>
+    </w:p>
+    <w:p>
+      <w:pPr>
+        <w:pStyle w:val="PargrafodaLista"/>
+        <w:rPr>
+          <w:rFonts w:ascii="Arvo" w:hAnsi="Arvo"/>
+          <w:sz w:val="20"/>
+          <w:szCs w:val="20"/>
+        </w:rPr>
+      </w:pPr>
+    </w:p>
+    <w:p>
+      <w:pPr>
+        <w:pStyle w:val="PargrafodaLista"/>
+        <w:numPr>
+          <w:ilvl w:val="1"/>
+          <w:numId w:val="2"/>
+        </w:numPr>
+        <w:snapToGrid w:val="0"/>
+        <w:spacing w:line="276" w:lineRule="auto"/>
+        <w:ind w:hanging="720"/>
         <w:jc w:val="both"/>
+        <w:rPr>
+          <w:rFonts w:ascii="Arvo" w:hAnsi="Arvo"/>
+          <w:sz w:val="20"/>
+          <w:szCs w:val="20"/>
+        </w:rPr>
+      </w:pPr>
+      <w:r>
+        <w:rPr>
+          <w:rFonts w:ascii="Arvo" w:hAnsi="Arvo"/>
+          <w:sz w:val="20"/>
+          <w:szCs w:val="20"/>
+        </w:rPr>
+        <w:t>Estão compreendidas nessa cláusula as alterações decorrentes da reforma tributária instituída pela Emenda Constitucional nº 132/2023 e pela Lei Complementar nº 214/2025, notadamente aquelas relativas ao Imposto sobre Bens e Serviços</w:t>
+      </w:r>
+      <w:r>
+        <w:rPr>
+          <w:rFonts w:ascii="Arvo" w:hAnsi="Arvo"/>
+          <w:sz w:val="20"/>
+          <w:szCs w:val="20"/>
+        </w:rPr>
+        <w:t xml:space="preserve"> (IBS)</w:t>
+      </w:r>
+      <w:r>
+        <w:rPr>
+          <w:rFonts w:ascii="Arvo" w:hAnsi="Arvo"/>
+          <w:sz w:val="20"/>
+          <w:szCs w:val="20"/>
+        </w:rPr>
+        <w:t xml:space="preserve"> e à Contribuição sobre Bens e Serviços</w:t>
+      </w:r>
+      <w:r>
+        <w:rPr>
+          <w:rFonts w:ascii="Arvo" w:hAnsi="Arvo"/>
+          <w:sz w:val="20"/>
+          <w:szCs w:val="20"/>
+        </w:rPr>
+        <w:t xml:space="preserve"> (CBS)</w:t>
+      </w:r>
+      <w:r>
+        <w:rPr>
+          <w:rFonts w:ascii="Arvo" w:hAnsi="Arvo"/>
+          <w:sz w:val="20"/>
+          <w:szCs w:val="20"/>
+        </w:rPr>
+        <w:t>, bem como as modificações que se sucedam ao longo do período de transição previsto para a substituição progressiva dos tributos atualmente vigentes.</w:t>
+      </w:r>
+    </w:p>
+    <w:p>
+      <w:pPr>
+        <w:snapToGrid w:val="0"/>
+        <w:spacing w:line="276" w:lineRule="auto"/>
+        <w:jc w:val="both"/>
+        <w:rPr>
+          <w:rFonts w:ascii="Arvo" w:hAnsi="Arvo"/>
+          <w:sz w:val="20"/>
+          <w:szCs w:val="20"/>
+        </w:rPr>
+      </w:pPr>
+    </w:p>
+    <w:p>
+      <w:pPr>
+        <w:pStyle w:val="PargrafodaLista"/>
+        <w:numPr>
+          <w:ilvl w:val="1"/>
+          <w:numId w:val="2"/>
+        </w:numPr>
+        <w:snapToGrid w:val="0"/>
+        <w:spacing w:line="276" w:lineRule="auto"/>
+        <w:ind w:hanging="720"/>
+        <w:jc w:val="both"/>
+        <w:rPr>
+          <w:rFonts w:ascii="Arvo" w:hAnsi="Arvo"/>
+          <w:sz w:val="20"/>
+          <w:szCs w:val="20"/>
+        </w:rPr>
+      </w:pPr>
+      <w:r>
+        <w:rPr>
+          <w:rFonts w:ascii="Arvo" w:hAnsi="Arvo"/>
+          <w:sz w:val="20"/>
+          <w:szCs w:val="20"/>
+        </w:rPr>
+        <w:t>A revisão de preços, em qualquer caso, pressupõe a comprovação de que as alterações tributárias referidas majoraram ou reduziram, efetivamente, os ônus suportados por qualquer das Partes.</w:t>
+      </w:r>
+    </w:p>
+    <w:p>
+      <w:pPr>
+        <w:pStyle w:val="PargrafodaLista"/>
+        <w:snapToGrid w:val="0"/>
+        <w:spacing w:line="276" w:lineRule="auto"/>
         <w:rPr>
           <w:rFonts w:ascii="Arvo" w:hAnsi="Arvo"/>
           <w:sz w:val="20"/>
@@ -7904,7 +8084,16 @@
           <w:sz w:val="20"/>
           <w:szCs w:val="20"/>
         </w:rPr>
-        <w:t>as Partes, sendo facultado a qualquer delas promover o seu encerramento mediante notificação por escrito à outra Parte, com antecedência mínima de 60 (sessenta) dias</w:t>
+        <w:t xml:space="preserve">as Partes, sendo facultado a qualquer delas promover o seu encerramento mediante notificação por escrito à outra Parte, com </w:t>
+      </w:r>
+      <w:r>
+        <w:rPr>
+          <w:rFonts w:ascii="Arvo" w:hAnsi="Arvo"/>
+          <w:sz w:val="20"/>
+          <w:szCs w:val="20"/>
+        </w:rPr>
+        <w:lastRenderedPageBreak/>
+        <w:t>antecedência mínima de 60 (sessenta) dias</w:t>
       </w:r>
       <w:r>
         <w:rPr>
@@ -8036,7 +8225,6 @@
           <w:sz w:val="20"/>
           <w:szCs w:val="20"/>
         </w:rPr>
-        <w:lastRenderedPageBreak/>
         <w:t>OBRIGAÇÕES DO CONTRATADO</w:t>
       </w:r>
     </w:p>
@@ -8451,6 +8639,7 @@
           <w:sz w:val="20"/>
           <w:szCs w:val="20"/>
         </w:rPr>
+        <w:lastRenderedPageBreak/>
         <w:t xml:space="preserve">Comunicar imediatamente ao Contratado qualquer fato superveniente que possa impactar os serviços prestados, notadamente alterações societárias, notificações, intimações, decisões e prazos recebidos </w:t>
       </w:r>
       <w:r>
@@ -8850,6 +9039,7 @@
           <w:sz w:val="20"/>
           <w:szCs w:val="20"/>
         </w:rPr>
+        <w:lastRenderedPageBreak/>
         <w:t>As Partes obrigam-se a manter sob absoluto sigilo as Informações Confidenciais, utilizá-las exclusivamente para as finalidades desta contratação, restringir o acesso a colaboradores que delas necessitem e que estejam sujeitos a obrigações equivalentes de confidencialidade, e adotar medidas adequadas para impedir acesso, uso ou divulgação não autorizados, respondendo cada Parte pelos atos de terceiros a ela vinculados.</w:t>
       </w:r>
     </w:p>
@@ -8957,7 +9147,6 @@
           <w:sz w:val="20"/>
           <w:szCs w:val="20"/>
         </w:rPr>
-        <w:lastRenderedPageBreak/>
         <w:t>PROTEÇÃO DE DADOS PESSOAIS</w:t>
       </w:r>
     </w:p>
@@ -9215,7 +9404,16 @@
           <w:sz w:val="20"/>
           <w:szCs w:val="20"/>
         </w:rPr>
-        <w:t xml:space="preserve">Os pareceres, opiniões legais, minutas e estratégias elaborados pelo Contratado constituem obrigação de meio, não importando garantia de resultado ou de êxito, ressalvadas as obrigações em que, por sua natureza ou por expressa </w:t>
+        <w:t xml:space="preserve">Os pareceres, opiniões legais, minutas e estratégias elaborados pelo Contratado constituem obrigação de meio, não importando garantia de resultado ou de êxito, ressalvadas as </w:t>
+      </w:r>
+      <w:r>
+        <w:rPr>
+          <w:rFonts w:ascii="Arvo" w:hAnsi="Arvo"/>
+          <w:sz w:val="20"/>
+          <w:szCs w:val="20"/>
+        </w:rPr>
+        <w:lastRenderedPageBreak/>
+        <w:t xml:space="preserve">obrigações em que, por sua natureza ou por expressa </w:t>
       </w:r>
       <w:r>
         <w:rPr>
@@ -9322,16 +9520,7 @@
           <w:sz w:val="20"/>
           <w:szCs w:val="20"/>
         </w:rPr>
-        <w:t xml:space="preserve">, sem aviso prévio e sem penalidade, nas seguintes hipóteses: (i) inadimplemento de obrigação contratual relevante pela outra Parte, não sanado no prazo de 15 (quinze) dias contados da notificação; (ii) impossibilidade superveniente e objetivamente verificável de cumprimento das obrigações assumidas; (iii) conflito de interesses que, à luz das normas da advocacia, impeça </w:t>
-      </w:r>
-      <w:r>
-        <w:rPr>
-          <w:rFonts w:ascii="Arvo" w:hAnsi="Arvo"/>
-          <w:sz w:val="20"/>
-          <w:szCs w:val="20"/>
-        </w:rPr>
-        <w:lastRenderedPageBreak/>
-        <w:t xml:space="preserve">a continuidade da representação; e (iv) </w:t>
+        <w:t xml:space="preserve">, sem aviso prévio e sem penalidade, nas seguintes hipóteses: (i) inadimplemento de obrigação contratual relevante pela outra Parte, não sanado no prazo de 15 (quinze) dias contados da notificação; (ii) impossibilidade superveniente e objetivamente verificável de cumprimento das obrigações assumidas; (iii) conflito de interesses que, à luz das normas da advocacia, impeça a continuidade da representação; e (iv) </w:t>
       </w:r>
       <w:r>
         <w:rPr>
@@ -9766,6 +9955,7 @@
           <w:sz w:val="20"/>
           <w:szCs w:val="20"/>
         </w:rPr>
+        <w:lastRenderedPageBreak/>
         <w:t>As Leis da República Federativa do Brasil são aplicáveis a esta Proposta. Fica eleito o foro da Comarca de Belo Horizonte, Estado de Minas Gerais, com renúncia expressa a qualquer outro, por mais privilegiado que seja, para dirimir quaisquer dúvidas ou controvérsias oriundas desta Proposta que não possam ser solucionadas pela via amigável.</w:t>
       </w:r>
     </w:p>
@@ -9831,6 +10021,18 @@
         </w:rPr>
         <w:t>dispensando expressamente a colheita de assinaturas de testemunhas, na forma do artigo 34 da Lei n. 14.620/2023.</w:t>
       </w:r>
+    </w:p>
+    <w:p>
+      <w:pPr>
+        <w:pStyle w:val="PargrafodaLista"/>
+        <w:spacing w:line="276" w:lineRule="auto"/>
+        <w:jc w:val="both"/>
+        <w:rPr>
+          <w:rFonts w:ascii="Arvo" w:hAnsi="Arvo"/>
+          <w:sz w:val="20"/>
+          <w:szCs w:val="20"/>
+        </w:rPr>
+      </w:pPr>
     </w:p>
     <w:p>
       <w:pPr>
@@ -9846,44 +10048,6 @@
           <w:szCs w:val="20"/>
         </w:rPr>
       </w:pPr>
-      <w:r>
-        <w:rPr>
-          <w:rFonts w:ascii="Arvo" w:hAnsi="Arvo"/>
-          <w:b/>
-          <w:bCs/>
-          <w:color w:val="FFFFFF" w:themeColor="background1"/>
-          <w:sz w:val="20"/>
-          <w:szCs w:val="20"/>
-        </w:rPr>
-        <w:lastRenderedPageBreak/>
-        <w:t>.</w:t>
-      </w:r>
-    </w:p>
-    <w:p>
-      <w:pPr>
-        <w:keepNext/>
-        <w:snapToGrid w:val="0"/>
-        <w:spacing w:line="276" w:lineRule="auto"/>
-        <w:rPr>
-          <w:rFonts w:ascii="Arvo" w:hAnsi="Arvo"/>
-          <w:b/>
-          <w:bCs/>
-          <w:color w:val="FFFFFF" w:themeColor="background1"/>
-          <w:sz w:val="20"/>
-          <w:szCs w:val="20"/>
-        </w:rPr>
-      </w:pPr>
-      <w:r>
-        <w:rPr>
-          <w:rFonts w:ascii="Arvo" w:hAnsi="Arvo"/>
-          <w:b/>
-          <w:bCs/>
-          <w:color w:val="FFFFFF" w:themeColor="background1"/>
-          <w:sz w:val="20"/>
-          <w:szCs w:val="20"/>
-        </w:rPr>
-        <w:t>.</w:t>
-      </w:r>
     </w:p>
     <w:p>
       <w:pPr>
@@ -11859,15 +12023,6 @@
 </file>
 
 <file path=customXml/item1.xml><?xml version="1.0" encoding="utf-8"?>
-<?mso-contentType ?>
-<FormTemplates xmlns="http://schemas.microsoft.com/sharepoint/v3/contenttype/forms">
-  <Display>DocumentLibraryForm</Display>
-  <Edit>DocumentLibraryForm</Edit>
-  <New>DocumentLibraryForm</New>
-</FormTemplates>
-</file>
-
-<file path=customXml/item2.xml><?xml version="1.0" encoding="utf-8"?>
 <p:properties xmlns:p="http://schemas.microsoft.com/office/2006/metadata/properties" xmlns:xsi="http://www.w3.org/2001/XMLSchema-instance" xmlns:pc="http://schemas.microsoft.com/office/infopath/2007/PartnerControls">
   <documentManagement>
     <lcf76f155ced4ddcb4097134ff3c332f xmlns="e5b1cd33-4eca-41a4-b7d8-fdf3e6200119">
@@ -11878,7 +12033,7 @@
 </p:properties>
 </file>
 
-<file path=customXml/item3.xml><?xml version="1.0" encoding="utf-8"?>
+<file path=customXml/item2.xml><?xml version="1.0" encoding="utf-8"?>
 <ct:contentTypeSchema xmlns:ct="http://schemas.microsoft.com/office/2006/metadata/contentType" xmlns:ma="http://schemas.microsoft.com/office/2006/metadata/properties/metaAttributes" ct:_="" ma:_="" ma:contentTypeName="Documento" ma:contentTypeID="0x010100C538FE3DE9F5C249B208F757A39C9CF1" ma:contentTypeVersion="13" ma:contentTypeDescription="Crie um novo documento." ma:contentTypeScope="" ma:versionID="f58841031a2b8acc55807e179e1eb129">
   <xsd:schema xmlns:xsd="http://www.w3.org/2001/XMLSchema" xmlns:xs="http://www.w3.org/2001/XMLSchema" xmlns:p="http://schemas.microsoft.com/office/2006/metadata/properties" xmlns:ns2="e5b1cd33-4eca-41a4-b7d8-fdf3e6200119" xmlns:ns3="c710a95f-4097-48d0-b72e-528dcf24b561" targetNamespace="http://schemas.microsoft.com/office/2006/metadata/properties" ma:root="true" ma:fieldsID="eabb80da9e4a7645788b9624de58e5c8" ns2:_="" ns3:_="">
     <xsd:import namespace="e5b1cd33-4eca-41a4-b7d8-fdf3e6200119"/>
@@ -12085,15 +12240,16 @@
 </ct:contentTypeSchema>
 </file>
 
-<file path=customXml/itemProps1.xml><?xml version="1.0" encoding="utf-8"?>
-<ds:datastoreItem xmlns:ds="http://schemas.openxmlformats.org/officeDocument/2006/customXml" ds:itemID="{A5ED3DFB-4F39-4BF8-995C-27FE2C86527B}">
-  <ds:schemaRefs>
-    <ds:schemaRef ds:uri="http://schemas.microsoft.com/sharepoint/v3/contenttype/forms"/>
-  </ds:schemaRefs>
-</ds:datastoreItem>
+<file path=customXml/item3.xml><?xml version="1.0" encoding="utf-8"?>
+<?mso-contentType ?>
+<FormTemplates xmlns="http://schemas.microsoft.com/sharepoint/v3/contenttype/forms">
+  <Display>DocumentLibraryForm</Display>
+  <Edit>DocumentLibraryForm</Edit>
+  <New>DocumentLibraryForm</New>
+</FormTemplates>
 </file>
 
-<file path=customXml/itemProps2.xml><?xml version="1.0" encoding="utf-8"?>
+<file path=customXml/itemProps1.xml><?xml version="1.0" encoding="utf-8"?>
 <ds:datastoreItem xmlns:ds="http://schemas.openxmlformats.org/officeDocument/2006/customXml" ds:itemID="{CB7613A1-A0CB-4E22-AF85-27793339D14D}">
   <ds:schemaRefs>
     <ds:schemaRef ds:uri="http://schemas.microsoft.com/office/2006/metadata/properties"/>
@@ -12104,7 +12260,7 @@
 </ds:datastoreItem>
 </file>
 
-<file path=customXml/itemProps3.xml><?xml version="1.0" encoding="utf-8"?>
+<file path=customXml/itemProps2.xml><?xml version="1.0" encoding="utf-8"?>
 <ds:datastoreItem xmlns:ds="http://schemas.openxmlformats.org/officeDocument/2006/customXml" ds:itemID="{527C8FAF-F895-460C-92FD-63B7C6027339}">
   <ds:schemaRefs>
     <ds:schemaRef ds:uri="http://schemas.microsoft.com/office/2006/metadata/contentType"/>
@@ -12121,4 +12277,12 @@
     <ds:schemaRef ds:uri="http://schemas.microsoft.com/internal/obd"/>
   </ds:schemaRefs>
 </ds:datastoreItem>
+</file>
+
+<file path=customXml/itemProps3.xml><?xml version="1.0" encoding="utf-8"?>
+<ds:datastoreItem xmlns:ds="http://schemas.openxmlformats.org/officeDocument/2006/customXml" ds:itemID="{A5ED3DFB-4F39-4BF8-995C-27FE2C86527B}">
+  <ds:schemaRefs>
+    <ds:schemaRef ds:uri="http://schemas.microsoft.com/sharepoint/v3/contenttype/forms"/>
+  </ds:schemaRefs>
+</ds:datastoreItem>
 </file>
</xml_diff>

<commit_message>
feat: correções do feedback de emissão — títulos, justificação, Valor por Ato e hora extra opcional (#45)
Cinco correções do feedback de emissão: espaçamento do título (1 linha), subtítulo de escopo escondido em modalidade única, texto multilinha justificado (doNotExpandShiftReturn), "Valor por Ato" e hora extra-escopo opcional (modo nenhuma + nota da Diretoria). pytest 75/75, smoke 3/3, round-trip markers lossless. APP_VERSION 2.0.40 -> 2.0.41.
</commit_message>
<xml_diff>
--- a/resources/templates/PMRA_Template_Jinja.docx
+++ b/resources/templates/PMRA_Template_Jinja.docx
@@ -484,6 +484,52 @@
         </w:rPr>
         <w:t>{{escopo.titulo_secao}}</w:t>
       </w:r>
+    </w:p>
+    <w:p>
+      <w:pPr>
+        <w:spacing w:line="276" w:lineRule="auto"/>
+        <w:rPr>
+          <w:rFonts w:ascii="Arvo" w:hAnsi="Arvo"/>
+          <w:sz w:val="2"/>
+          <w:szCs w:val="2"/>
+        </w:rPr>
+      </w:pPr>
+      <w:r>
+        <w:rPr>
+          <w:rFonts w:ascii="Arvo" w:hAnsi="Arvo"/>
+          <w:sz w:val="2"/>
+          <w:szCs w:val="2"/>
+        </w:rPr>
+        <w:t>{%p if escopo.show_consultiva and not escopo.multi_consultiva %}</w:t>
+      </w:r>
+    </w:p>
+    <w:p>
+      <w:pPr>
+        <w:spacing w:line="276" w:lineRule="auto"/>
+        <w:rPr>
+          <w:rFonts w:ascii="Arvo" w:hAnsi="Arvo"/>
+          <w:sz w:val="2"/>
+          <w:szCs w:val="2"/>
+        </w:rPr>
+      </w:pPr>
+      <w:r>
+        <w:rPr>
+          <w:rFonts w:ascii="Arvo" w:hAnsi="Arvo"/>
+          <w:sz w:val="2"/>
+          <w:szCs w:val="2"/>
+        </w:rPr>
+        <w:t>{%p if escopo.show_subtitulo_consultivo %}</w:t>
+      </w:r>
+    </w:p>
+    <w:p>
+      <w:pPr>
+        <w:spacing w:line="276" w:lineRule="auto"/>
+        <w:rPr>
+          <w:rFonts w:ascii="Arvo" w:hAnsi="Arvo"/>
+          <w:sz w:val="20"/>
+          <w:szCs w:val="20"/>
+        </w:rPr>
+      </w:pPr>
       <w:r>
         <w:rPr>
           <w:rFonts w:ascii="Arvo" w:hAnsi="Arvo"/>
@@ -491,9 +537,46 @@
           <w:bCs/>
           <w:sz w:val="20"/>
           <w:szCs w:val="20"/>
-          <w:u w:val="single"/>
-        </w:rPr>
-        <w:br/>
+        </w:rPr>
+        <w:t>Escopo</w:t>
+      </w:r>
+      <w:r>
+        <w:rPr>
+          <w:rFonts w:ascii="Arvo" w:hAnsi="Arvo"/>
+          <w:b/>
+          <w:bCs/>
+          <w:sz w:val="20"/>
+          <w:szCs w:val="20"/>
+        </w:rPr>
+        <w:t xml:space="preserve"> Consultiv</w:t>
+      </w:r>
+      <w:r>
+        <w:rPr>
+          <w:rFonts w:ascii="Arvo" w:hAnsi="Arvo"/>
+          <w:b/>
+          <w:bCs/>
+          <w:sz w:val="20"/>
+          <w:szCs w:val="20"/>
+        </w:rPr>
+        <w:t>o</w:t>
+      </w:r>
+      <w:r>
+        <w:rPr>
+          <w:rFonts w:ascii="Arvo" w:hAnsi="Arvo"/>
+          <w:b/>
+          <w:bCs/>
+          <w:sz w:val="20"/>
+          <w:szCs w:val="20"/>
+        </w:rPr>
+        <w:t>:</w:t>
+      </w:r>
+      <w:r>
+        <w:rPr>
+          <w:rFonts w:ascii="Arvo" w:hAnsi="Arvo"/>
+          <w:sz w:val="20"/>
+          <w:szCs w:val="20"/>
+        </w:rPr>
+        <w:t xml:space="preserve"> </w:t>
       </w:r>
     </w:p>
     <w:p>
@@ -511,12 +594,85 @@
           <w:sz w:val="2"/>
           <w:szCs w:val="2"/>
         </w:rPr>
-        <w:t>{%p if escopo.show_consultiva and not escopo.multi_consultiva %}</w:t>
-      </w:r>
-    </w:p>
-    <w:p>
-      <w:pPr>
-        <w:spacing w:line="276" w:lineRule="auto"/>
+        <w:t>{%p endif %}</w:t>
+      </w:r>
+    </w:p>
+    <w:p>
+      <w:pPr>
+        <w:spacing w:line="276" w:lineRule="auto"/>
+        <w:rPr>
+          <w:rFonts w:ascii="Arvo" w:hAnsi="Arvo"/>
+          <w:sz w:val="20"/>
+          <w:szCs w:val="20"/>
+        </w:rPr>
+      </w:pPr>
+      <w:r>
+        <w:rPr>
+          <w:rFonts w:ascii="Arvo" w:hAnsi="Arvo"/>
+          <w:sz w:val="20"/>
+          <w:szCs w:val="20"/>
+        </w:rPr>
+        <w:t>{{escopo.atuacao_consultiva}}</w:t>
+      </w:r>
+    </w:p>
+    <w:p>
+      <w:pPr>
+        <w:spacing w:line="276" w:lineRule="auto"/>
+        <w:rPr>
+          <w:rFonts w:ascii="Arvo" w:hAnsi="Arvo"/>
+          <w:sz w:val="2"/>
+          <w:szCs w:val="2"/>
+        </w:rPr>
+      </w:pPr>
+      <w:r>
+        <w:rPr>
+          <w:rFonts w:ascii="Arvo" w:hAnsi="Arvo"/>
+          <w:sz w:val="2"/>
+          <w:szCs w:val="2"/>
+        </w:rPr>
+        <w:t>{%p endif %}</w:t>
+      </w:r>
+    </w:p>
+    <w:p>
+      <w:pPr>
+        <w:spacing w:line="276" w:lineRule="auto"/>
+        <w:rPr>
+          <w:rFonts w:ascii="Arvo" w:hAnsi="Arvo"/>
+          <w:sz w:val="2"/>
+          <w:szCs w:val="2"/>
+        </w:rPr>
+      </w:pPr>
+      <w:r>
+        <w:rPr>
+          <w:rFonts w:ascii="Arvo" w:hAnsi="Arvo"/>
+          <w:sz w:val="2"/>
+          <w:szCs w:val="2"/>
+        </w:rPr>
+        <w:t>{%p if escopo.show_consultiva and escopo.multi_consultiva %}</w:t>
+      </w:r>
+    </w:p>
+    <w:p>
+      <w:pPr>
+        <w:spacing w:line="276" w:lineRule="auto"/>
+        <w:rPr>
+          <w:rFonts w:ascii="Arvo" w:hAnsi="Arvo"/>
+          <w:sz w:val="2"/>
+          <w:szCs w:val="2"/>
+        </w:rPr>
+      </w:pPr>
+      <w:r>
+        <w:rPr>
+          <w:rFonts w:ascii="Arvo" w:hAnsi="Arvo"/>
+          <w:sz w:val="2"/>
+          <w:szCs w:val="2"/>
+        </w:rPr>
+        <w:t>{%p for item in escopo.itens_consultivos %}</w:t>
+      </w:r>
+    </w:p>
+    <w:p>
+      <w:pPr>
+        <w:spacing w:line="276" w:lineRule="auto"/>
+        <w:jc w:val="both"/>
         <w:rPr>
           <w:rFonts w:ascii="Arvo" w:hAnsi="Arvo"/>
           <w:sz w:val="20"/>
@@ -531,9 +687,173 @@
           <w:sz w:val="20"/>
           <w:szCs w:val="20"/>
         </w:rPr>
-        <w:t>Escopo</w:t>
-      </w:r>
-      <w:r>
+        <w:t>Escopo Consultivo {{item.letra}}:</w:t>
+      </w:r>
+    </w:p>
+    <w:p>
+      <w:pPr>
+        <w:spacing w:line="276" w:lineRule="auto"/>
+        <w:rPr>
+          <w:rFonts w:ascii="Arvo" w:hAnsi="Arvo"/>
+          <w:sz w:val="20"/>
+          <w:szCs w:val="20"/>
+        </w:rPr>
+      </w:pPr>
+    </w:p>
+    <w:p>
+      <w:pPr>
+        <w:spacing w:line="276" w:lineRule="auto"/>
+        <w:jc w:val="both"/>
+        <w:rPr>
+          <w:rFonts w:ascii="Arvo" w:hAnsi="Arvo"/>
+          <w:sz w:val="20"/>
+          <w:szCs w:val="20"/>
+        </w:rPr>
+      </w:pPr>
+      <w:r>
+        <w:rPr>
+          <w:rFonts w:ascii="Arvo" w:hAnsi="Arvo"/>
+          <w:sz w:val="20"/>
+          <w:szCs w:val="20"/>
+        </w:rPr>
+        <w:t>{{item.descricao}}</w:t>
+      </w:r>
+    </w:p>
+    <w:p>
+      <w:pPr>
+        <w:spacing w:line="276" w:lineRule="auto"/>
+        <w:rPr>
+          <w:rFonts w:ascii="Arvo" w:hAnsi="Arvo"/>
+          <w:sz w:val="20"/>
+          <w:szCs w:val="20"/>
+        </w:rPr>
+      </w:pPr>
+    </w:p>
+    <w:p>
+      <w:pPr>
+        <w:spacing w:line="276" w:lineRule="auto"/>
+        <w:rPr>
+          <w:rFonts w:ascii="Arvo" w:hAnsi="Arvo"/>
+          <w:sz w:val="2"/>
+          <w:szCs w:val="2"/>
+        </w:rPr>
+      </w:pPr>
+      <w:r>
+        <w:rPr>
+          <w:rFonts w:ascii="Arvo" w:hAnsi="Arvo"/>
+          <w:sz w:val="2"/>
+          <w:szCs w:val="2"/>
+        </w:rPr>
+        <w:t>{%p if consultiva.forma_por_escopo %}</w:t>
+      </w:r>
+    </w:p>
+    <w:p>
+      <w:pPr>
+        <w:spacing w:line="276" w:lineRule="auto"/>
+        <w:rPr>
+          <w:rFonts w:ascii="Arvo" w:hAnsi="Arvo"/>
+          <w:sz w:val="2"/>
+          <w:szCs w:val="2"/>
+        </w:rPr>
+      </w:pPr>
+      <w:r>
+        <w:rPr>
+          <w:rFonts w:ascii="Arvo" w:hAnsi="Arvo"/>
+          <w:sz w:val="2"/>
+          <w:szCs w:val="2"/>
+        </w:rPr>
+        <w:t>{{p item.subdoc}}</w:t>
+      </w:r>
+    </w:p>
+    <w:p>
+      <w:pPr>
+        <w:spacing w:line="276" w:lineRule="auto"/>
+        <w:rPr>
+          <w:rFonts w:ascii="Arvo" w:hAnsi="Arvo"/>
+          <w:sz w:val="2"/>
+          <w:szCs w:val="2"/>
+        </w:rPr>
+      </w:pPr>
+      <w:r>
+        <w:rPr>
+          <w:rFonts w:ascii="Arvo" w:hAnsi="Arvo"/>
+          <w:sz w:val="2"/>
+          <w:szCs w:val="2"/>
+        </w:rPr>
+        <w:t>{%p endif %}</w:t>
+      </w:r>
+    </w:p>
+    <w:p>
+      <w:pPr>
+        <w:spacing w:line="276" w:lineRule="auto"/>
+        <w:rPr>
+          <w:rFonts w:ascii="Arvo" w:hAnsi="Arvo"/>
+          <w:sz w:val="2"/>
+          <w:szCs w:val="2"/>
+        </w:rPr>
+      </w:pPr>
+      <w:r>
+        <w:rPr>
+          <w:rFonts w:ascii="Arvo" w:hAnsi="Arvo"/>
+          <w:sz w:val="2"/>
+          <w:szCs w:val="2"/>
+        </w:rPr>
+        <w:t>{%p endfor %}</w:t>
+      </w:r>
+    </w:p>
+    <w:p>
+      <w:pPr>
+        <w:spacing w:line="276" w:lineRule="auto"/>
+        <w:rPr>
+          <w:rFonts w:ascii="Arvo" w:hAnsi="Arvo"/>
+          <w:sz w:val="2"/>
+          <w:szCs w:val="2"/>
+        </w:rPr>
+      </w:pPr>
+      <w:r>
+        <w:rPr>
+          <w:rFonts w:ascii="Arvo" w:hAnsi="Arvo"/>
+          <w:sz w:val="2"/>
+          <w:szCs w:val="2"/>
+        </w:rPr>
+        <w:t>{%p endif %}</w:t>
+      </w:r>
+    </w:p>
+    <w:p>
+      <w:pPr>
+        <w:snapToGrid w:val="0"/>
+        <w:spacing w:line="276" w:lineRule="auto"/>
+        <w:rPr>
+          <w:rFonts w:ascii="Arvo" w:hAnsi="Arvo"/>
+          <w:sz w:val="20"/>
+          <w:szCs w:val="20"/>
+        </w:rPr>
+      </w:pPr>
+    </w:p>
+    <w:p>
+      <w:pPr>
+        <w:spacing w:line="276" w:lineRule="auto"/>
+        <w:rPr>
+          <w:rFonts w:ascii="Arvo" w:hAnsi="Arvo"/>
+          <w:sz w:val="2"/>
+          <w:szCs w:val="2"/>
+        </w:rPr>
+      </w:pPr>
+      <w:r>
+        <w:rPr>
+          <w:rFonts w:ascii="Arvo" w:hAnsi="Arvo"/>
+          <w:sz w:val="2"/>
+          <w:szCs w:val="2"/>
+        </w:rPr>
+        <w:t>{%p if escopo.show_sla %}</w:t>
+      </w:r>
+    </w:p>
+    <w:p>
+      <w:pPr>
+        <w:keepNext/>
+        <w:snapToGrid w:val="0"/>
+        <w:spacing w:line="276" w:lineRule="auto"/>
+        <w:jc w:val="both"/>
         <w:rPr>
           <w:rFonts w:ascii="Arvo" w:hAnsi="Arvo"/>
           <w:b/>
@@ -541,8 +861,7 @@
           <w:sz w:val="20"/>
           <w:szCs w:val="20"/>
         </w:rPr>
-        <w:t xml:space="preserve"> Consultiv</w:t>
-      </w:r>
+      </w:pPr>
       <w:r>
         <w:rPr>
           <w:rFonts w:ascii="Arvo" w:hAnsi="Arvo"/>
@@ -550,10 +869,109 @@
           <w:bCs/>
           <w:sz w:val="20"/>
           <w:szCs w:val="20"/>
-        </w:rPr>
-        <w:t>o</w:t>
-      </w:r>
-      <w:r>
+          <w:u w:val="single"/>
+        </w:rPr>
+        <w:t>{{escopo.sla_titulo}}</w:t>
+      </w:r>
+    </w:p>
+    <w:p>
+      <w:pPr>
+        <w:spacing w:line="276" w:lineRule="auto"/>
+        <w:rPr>
+          <w:rFonts w:ascii="Arvo" w:hAnsi="Arvo"/>
+          <w:sz w:val="20"/>
+          <w:szCs w:val="20"/>
+        </w:rPr>
+      </w:pPr>
+    </w:p>
+    <w:p>
+      <w:pPr>
+        <w:keepNext/>
+        <w:snapToGrid w:val="0"/>
+        <w:spacing w:line="276" w:lineRule="auto"/>
+        <w:rPr>
+          <w:rFonts w:ascii="Arvo" w:hAnsi="Arvo"/>
+          <w:sz w:val="20"/>
+          <w:szCs w:val="20"/>
+        </w:rPr>
+      </w:pPr>
+      <w:r>
+        <w:rPr>
+          <w:rFonts w:ascii="Arvo" w:hAnsi="Arvo"/>
+          <w:sz w:val="20"/>
+          <w:szCs w:val="20"/>
+        </w:rPr>
+        <w:t>{{escopo.sla_descricao}}</w:t>
+      </w:r>
+    </w:p>
+    <w:p>
+      <w:pPr>
+        <w:spacing w:line="276" w:lineRule="auto"/>
+        <w:rPr>
+          <w:rFonts w:ascii="Arvo" w:hAnsi="Arvo"/>
+          <w:sz w:val="2"/>
+          <w:szCs w:val="2"/>
+        </w:rPr>
+      </w:pPr>
+      <w:r>
+        <w:rPr>
+          <w:rFonts w:ascii="Arvo" w:hAnsi="Arvo"/>
+          <w:sz w:val="2"/>
+          <w:szCs w:val="2"/>
+        </w:rPr>
+        <w:t>{%p endif %}</w:t>
+      </w:r>
+    </w:p>
+    <w:p>
+      <w:pPr>
+        <w:snapToGrid w:val="0"/>
+        <w:spacing w:line="276" w:lineRule="auto"/>
+        <w:rPr>
+          <w:rFonts w:ascii="Arvo" w:hAnsi="Arvo"/>
+          <w:sz w:val="20"/>
+          <w:szCs w:val="20"/>
+        </w:rPr>
+      </w:pPr>
+    </w:p>
+    <w:p>
+      <w:pPr>
+        <w:spacing w:line="276" w:lineRule="auto"/>
+        <w:rPr>
+          <w:rFonts w:ascii="Arvo" w:hAnsi="Arvo"/>
+          <w:sz w:val="2"/>
+          <w:szCs w:val="2"/>
+        </w:rPr>
+      </w:pPr>
+      <w:r>
+        <w:rPr>
+          <w:rFonts w:ascii="Arvo" w:hAnsi="Arvo"/>
+          <w:sz w:val="2"/>
+          <w:szCs w:val="2"/>
+        </w:rPr>
+        <w:t>{%p if escopo.show_contenciosa and not escopo.multi_contenciosa %}</w:t>
+      </w:r>
+    </w:p>
+    <w:p>
+      <w:pPr>
+        <w:spacing w:line="276" w:lineRule="auto"/>
+        <w:rPr>
+          <w:rFonts w:ascii="Arvo" w:hAnsi="Arvo"/>
+          <w:sz w:val="2"/>
+          <w:szCs w:val="2"/>
+        </w:rPr>
+      </w:pPr>
+      <w:r>
+        <w:rPr>
+          <w:rFonts w:ascii="Arvo" w:hAnsi="Arvo"/>
+          <w:sz w:val="2"/>
+          <w:szCs w:val="2"/>
+        </w:rPr>
+        <w:t>{%p if escopo.show_subtitulo_contencioso %}</w:t>
+      </w:r>
+    </w:p>
+    <w:p>
+      <w:pPr>
+        <w:spacing w:line="276" w:lineRule="auto"/>
         <w:rPr>
           <w:rFonts w:ascii="Arvo" w:hAnsi="Arvo"/>
           <w:b/>
@@ -561,33 +979,46 @@
           <w:sz w:val="20"/>
           <w:szCs w:val="20"/>
         </w:rPr>
+      </w:pPr>
+      <w:r>
+        <w:rPr>
+          <w:rFonts w:ascii="Arvo" w:hAnsi="Arvo"/>
+          <w:b/>
+          <w:bCs/>
+          <w:sz w:val="20"/>
+          <w:szCs w:val="20"/>
+        </w:rPr>
+        <w:t>Escopo</w:t>
+      </w:r>
+      <w:r>
+        <w:rPr>
+          <w:rFonts w:ascii="Arvo" w:hAnsi="Arvo"/>
+          <w:b/>
+          <w:bCs/>
+          <w:sz w:val="20"/>
+          <w:szCs w:val="20"/>
+        </w:rPr>
+        <w:t xml:space="preserve"> </w:t>
+      </w:r>
+      <w:r>
+        <w:rPr>
+          <w:rFonts w:ascii="Arvo" w:hAnsi="Arvo"/>
+          <w:b/>
+          <w:bCs/>
+          <w:sz w:val="20"/>
+          <w:szCs w:val="20"/>
+        </w:rPr>
+        <w:t>Contencioso</w:t>
+      </w:r>
+      <w:r>
+        <w:rPr>
+          <w:rFonts w:ascii="Arvo" w:hAnsi="Arvo"/>
+          <w:b/>
+          <w:bCs/>
+          <w:sz w:val="20"/>
+          <w:szCs w:val="20"/>
+        </w:rPr>
         <w:t>:</w:t>
-      </w:r>
-      <w:r>
-        <w:rPr>
-          <w:rFonts w:ascii="Arvo" w:hAnsi="Arvo"/>
-          <w:sz w:val="20"/>
-          <w:szCs w:val="20"/>
-        </w:rPr>
-        <w:t xml:space="preserve"> </w:t>
-      </w:r>
-    </w:p>
-    <w:p>
-      <w:pPr>
-        <w:spacing w:line="276" w:lineRule="auto"/>
-        <w:rPr>
-          <w:rFonts w:ascii="Arvo" w:hAnsi="Arvo"/>
-          <w:sz w:val="20"/>
-          <w:szCs w:val="20"/>
-        </w:rPr>
-      </w:pPr>
-      <w:r>
-        <w:rPr>
-          <w:rFonts w:ascii="Arvo" w:hAnsi="Arvo"/>
-          <w:sz w:val="20"/>
-          <w:szCs w:val="20"/>
-        </w:rPr>
-        <w:t>{{escopo.atuacao_consultiva}}</w:t>
       </w:r>
     </w:p>
     <w:p>
@@ -606,376 +1037,6 @@
           <w:szCs w:val="2"/>
         </w:rPr>
         <w:t>{%p endif %}</w:t>
-      </w:r>
-    </w:p>
-    <w:p>
-      <w:pPr>
-        <w:spacing w:line="276" w:lineRule="auto"/>
-        <w:rPr>
-          <w:rFonts w:ascii="Arvo" w:hAnsi="Arvo"/>
-          <w:sz w:val="2"/>
-          <w:szCs w:val="2"/>
-        </w:rPr>
-      </w:pPr>
-      <w:r>
-        <w:rPr>
-          <w:rFonts w:ascii="Arvo" w:hAnsi="Arvo"/>
-          <w:sz w:val="2"/>
-          <w:szCs w:val="2"/>
-        </w:rPr>
-        <w:t>{%p if escopo.show_consultiva and escopo.multi_consultiva %}</w:t>
-      </w:r>
-    </w:p>
-    <w:p>
-      <w:pPr>
-        <w:spacing w:line="276" w:lineRule="auto"/>
-        <w:rPr>
-          <w:rFonts w:ascii="Arvo" w:hAnsi="Arvo"/>
-          <w:sz w:val="2"/>
-          <w:szCs w:val="2"/>
-        </w:rPr>
-      </w:pPr>
-      <w:r>
-        <w:rPr>
-          <w:rFonts w:ascii="Arvo" w:hAnsi="Arvo"/>
-          <w:sz w:val="2"/>
-          <w:szCs w:val="2"/>
-        </w:rPr>
-        <w:t>{%p for item in escopo.itens_consultivos %}</w:t>
-      </w:r>
-    </w:p>
-    <w:p>
-      <w:pPr>
-        <w:spacing w:line="276" w:lineRule="auto"/>
-        <w:jc w:val="both"/>
-        <w:rPr>
-          <w:rFonts w:ascii="Arvo" w:hAnsi="Arvo"/>
-          <w:sz w:val="20"/>
-          <w:szCs w:val="20"/>
-        </w:rPr>
-      </w:pPr>
-      <w:r>
-        <w:rPr>
-          <w:rFonts w:ascii="Arvo" w:hAnsi="Arvo"/>
-          <w:b/>
-          <w:bCs/>
-          <w:sz w:val="20"/>
-          <w:szCs w:val="20"/>
-        </w:rPr>
-        <w:t>Escopo Consultivo {{item.letra}}:</w:t>
-      </w:r>
-    </w:p>
-    <w:p>
-      <w:pPr>
-        <w:spacing w:line="276" w:lineRule="auto"/>
-        <w:rPr>
-          <w:rFonts w:ascii="Arvo" w:hAnsi="Arvo"/>
-          <w:sz w:val="20"/>
-          <w:szCs w:val="20"/>
-        </w:rPr>
-      </w:pPr>
-    </w:p>
-    <w:p>
-      <w:pPr>
-        <w:spacing w:line="276" w:lineRule="auto"/>
-        <w:jc w:val="both"/>
-        <w:rPr>
-          <w:rFonts w:ascii="Arvo" w:hAnsi="Arvo"/>
-          <w:sz w:val="20"/>
-          <w:szCs w:val="20"/>
-        </w:rPr>
-      </w:pPr>
-      <w:r>
-        <w:rPr>
-          <w:rFonts w:ascii="Arvo" w:hAnsi="Arvo"/>
-          <w:sz w:val="20"/>
-          <w:szCs w:val="20"/>
-        </w:rPr>
-        <w:t>{{item.descricao}}</w:t>
-      </w:r>
-    </w:p>
-    <w:p>
-      <w:pPr>
-        <w:spacing w:line="276" w:lineRule="auto"/>
-        <w:rPr>
-          <w:rFonts w:ascii="Arvo" w:hAnsi="Arvo"/>
-          <w:sz w:val="20"/>
-          <w:szCs w:val="20"/>
-        </w:rPr>
-      </w:pPr>
-    </w:p>
-    <w:p>
-      <w:pPr>
-        <w:spacing w:line="276" w:lineRule="auto"/>
-        <w:rPr>
-          <w:rFonts w:ascii="Arvo" w:hAnsi="Arvo"/>
-          <w:sz w:val="2"/>
-          <w:szCs w:val="2"/>
-        </w:rPr>
-      </w:pPr>
-      <w:r>
-        <w:rPr>
-          <w:rFonts w:ascii="Arvo" w:hAnsi="Arvo"/>
-          <w:sz w:val="2"/>
-          <w:szCs w:val="2"/>
-        </w:rPr>
-        <w:t>{%p if consultiva.forma_por_escopo %}</w:t>
-      </w:r>
-    </w:p>
-    <w:p>
-      <w:pPr>
-        <w:spacing w:line="276" w:lineRule="auto"/>
-        <w:rPr>
-          <w:rFonts w:ascii="Arvo" w:hAnsi="Arvo"/>
-          <w:sz w:val="2"/>
-          <w:szCs w:val="2"/>
-        </w:rPr>
-      </w:pPr>
-      <w:r>
-        <w:rPr>
-          <w:rFonts w:ascii="Arvo" w:hAnsi="Arvo"/>
-          <w:sz w:val="2"/>
-          <w:szCs w:val="2"/>
-        </w:rPr>
-        <w:t>{{p item.subdoc}}</w:t>
-      </w:r>
-    </w:p>
-    <w:p>
-      <w:pPr>
-        <w:spacing w:line="276" w:lineRule="auto"/>
-        <w:rPr>
-          <w:rFonts w:ascii="Arvo" w:hAnsi="Arvo"/>
-          <w:sz w:val="2"/>
-          <w:szCs w:val="2"/>
-        </w:rPr>
-      </w:pPr>
-      <w:r>
-        <w:rPr>
-          <w:rFonts w:ascii="Arvo" w:hAnsi="Arvo"/>
-          <w:sz w:val="2"/>
-          <w:szCs w:val="2"/>
-        </w:rPr>
-        <w:t>{%p endif %}</w:t>
-      </w:r>
-    </w:p>
-    <w:p>
-      <w:pPr>
-        <w:spacing w:line="276" w:lineRule="auto"/>
-        <w:rPr>
-          <w:rFonts w:ascii="Arvo" w:hAnsi="Arvo"/>
-          <w:sz w:val="2"/>
-          <w:szCs w:val="2"/>
-        </w:rPr>
-      </w:pPr>
-      <w:r>
-        <w:rPr>
-          <w:rFonts w:ascii="Arvo" w:hAnsi="Arvo"/>
-          <w:sz w:val="2"/>
-          <w:szCs w:val="2"/>
-        </w:rPr>
-        <w:t>{%p endfor %}</w:t>
-      </w:r>
-    </w:p>
-    <w:p>
-      <w:pPr>
-        <w:spacing w:line="276" w:lineRule="auto"/>
-        <w:rPr>
-          <w:rFonts w:ascii="Arvo" w:hAnsi="Arvo"/>
-          <w:sz w:val="2"/>
-          <w:szCs w:val="2"/>
-        </w:rPr>
-      </w:pPr>
-      <w:r>
-        <w:rPr>
-          <w:rFonts w:ascii="Arvo" w:hAnsi="Arvo"/>
-          <w:sz w:val="2"/>
-          <w:szCs w:val="2"/>
-        </w:rPr>
-        <w:t>{%p endif %}</w:t>
-      </w:r>
-    </w:p>
-    <w:p>
-      <w:pPr>
-        <w:snapToGrid w:val="0"/>
-        <w:spacing w:line="276" w:lineRule="auto"/>
-        <w:rPr>
-          <w:rFonts w:ascii="Arvo" w:hAnsi="Arvo"/>
-          <w:sz w:val="20"/>
-          <w:szCs w:val="20"/>
-        </w:rPr>
-      </w:pPr>
-    </w:p>
-    <w:p>
-      <w:pPr>
-        <w:spacing w:line="276" w:lineRule="auto"/>
-        <w:rPr>
-          <w:rFonts w:ascii="Arvo" w:hAnsi="Arvo"/>
-          <w:sz w:val="2"/>
-          <w:szCs w:val="2"/>
-        </w:rPr>
-      </w:pPr>
-      <w:r>
-        <w:rPr>
-          <w:rFonts w:ascii="Arvo" w:hAnsi="Arvo"/>
-          <w:sz w:val="2"/>
-          <w:szCs w:val="2"/>
-        </w:rPr>
-        <w:t>{%p if escopo.show_sla %}</w:t>
-      </w:r>
-    </w:p>
-    <w:p>
-      <w:pPr>
-        <w:keepNext/>
-        <w:snapToGrid w:val="0"/>
-        <w:spacing w:line="276" w:lineRule="auto"/>
-        <w:jc w:val="both"/>
-        <w:rPr>
-          <w:rFonts w:ascii="Arvo" w:hAnsi="Arvo"/>
-          <w:b/>
-          <w:bCs/>
-          <w:sz w:val="20"/>
-          <w:szCs w:val="20"/>
-        </w:rPr>
-      </w:pPr>
-      <w:r>
-        <w:rPr>
-          <w:rFonts w:ascii="Arvo" w:hAnsi="Arvo"/>
-          <w:b/>
-          <w:bCs/>
-          <w:sz w:val="20"/>
-          <w:szCs w:val="20"/>
-          <w:u w:val="single"/>
-        </w:rPr>
-        <w:t>{{escopo.sla_titulo}}</w:t>
-      </w:r>
-    </w:p>
-    <w:p>
-      <w:pPr>
-        <w:spacing w:line="276" w:lineRule="auto"/>
-        <w:rPr>
-          <w:rFonts w:ascii="Arvo" w:hAnsi="Arvo"/>
-          <w:sz w:val="20"/>
-          <w:szCs w:val="20"/>
-        </w:rPr>
-      </w:pPr>
-    </w:p>
-    <w:p>
-      <w:pPr>
-        <w:keepNext/>
-        <w:snapToGrid w:val="0"/>
-        <w:spacing w:line="276" w:lineRule="auto"/>
-        <w:rPr>
-          <w:rFonts w:ascii="Arvo" w:hAnsi="Arvo"/>
-          <w:sz w:val="20"/>
-          <w:szCs w:val="20"/>
-        </w:rPr>
-      </w:pPr>
-      <w:r>
-        <w:rPr>
-          <w:rFonts w:ascii="Arvo" w:hAnsi="Arvo"/>
-          <w:sz w:val="20"/>
-          <w:szCs w:val="20"/>
-        </w:rPr>
-        <w:t>{{escopo.sla_descricao}}</w:t>
-      </w:r>
-    </w:p>
-    <w:p>
-      <w:pPr>
-        <w:spacing w:line="276" w:lineRule="auto"/>
-        <w:rPr>
-          <w:rFonts w:ascii="Arvo" w:hAnsi="Arvo"/>
-          <w:sz w:val="2"/>
-          <w:szCs w:val="2"/>
-        </w:rPr>
-      </w:pPr>
-      <w:r>
-        <w:rPr>
-          <w:rFonts w:ascii="Arvo" w:hAnsi="Arvo"/>
-          <w:sz w:val="2"/>
-          <w:szCs w:val="2"/>
-        </w:rPr>
-        <w:t>{%p endif %}</w:t>
-      </w:r>
-    </w:p>
-    <w:p>
-      <w:pPr>
-        <w:snapToGrid w:val="0"/>
-        <w:spacing w:line="276" w:lineRule="auto"/>
-        <w:rPr>
-          <w:rFonts w:ascii="Arvo" w:hAnsi="Arvo"/>
-          <w:sz w:val="20"/>
-          <w:szCs w:val="20"/>
-        </w:rPr>
-      </w:pPr>
-    </w:p>
-    <w:p>
-      <w:pPr>
-        <w:spacing w:line="276" w:lineRule="auto"/>
-        <w:rPr>
-          <w:rFonts w:ascii="Arvo" w:hAnsi="Arvo"/>
-          <w:sz w:val="2"/>
-          <w:szCs w:val="2"/>
-        </w:rPr>
-      </w:pPr>
-      <w:r>
-        <w:rPr>
-          <w:rFonts w:ascii="Arvo" w:hAnsi="Arvo"/>
-          <w:sz w:val="2"/>
-          <w:szCs w:val="2"/>
-        </w:rPr>
-        <w:t>{%p if escopo.show_contenciosa and not escopo.multi_contenciosa %}</w:t>
-      </w:r>
-    </w:p>
-    <w:p>
-      <w:pPr>
-        <w:spacing w:line="276" w:lineRule="auto"/>
-        <w:rPr>
-          <w:rFonts w:ascii="Arvo" w:hAnsi="Arvo"/>
-          <w:b/>
-          <w:bCs/>
-          <w:sz w:val="20"/>
-          <w:szCs w:val="20"/>
-        </w:rPr>
-      </w:pPr>
-      <w:r>
-        <w:rPr>
-          <w:rFonts w:ascii="Arvo" w:hAnsi="Arvo"/>
-          <w:b/>
-          <w:bCs/>
-          <w:sz w:val="20"/>
-          <w:szCs w:val="20"/>
-        </w:rPr>
-        <w:t>Escopo</w:t>
-      </w:r>
-      <w:r>
-        <w:rPr>
-          <w:rFonts w:ascii="Arvo" w:hAnsi="Arvo"/>
-          <w:b/>
-          <w:bCs/>
-          <w:sz w:val="20"/>
-          <w:szCs w:val="20"/>
-        </w:rPr>
-        <w:t xml:space="preserve"> </w:t>
-      </w:r>
-      <w:r>
-        <w:rPr>
-          <w:rFonts w:ascii="Arvo" w:hAnsi="Arvo"/>
-          <w:b/>
-          <w:bCs/>
-          <w:sz w:val="20"/>
-          <w:szCs w:val="20"/>
-        </w:rPr>
-        <w:t>Contencioso</w:t>
-      </w:r>
-      <w:r>
-        <w:rPr>
-          <w:rFonts w:ascii="Arvo" w:hAnsi="Arvo"/>
-          <w:b/>
-          <w:bCs/>
-          <w:sz w:val="20"/>
-          <w:szCs w:val="20"/>
-        </w:rPr>
-        <w:t>:</w:t>
       </w:r>
     </w:p>
     <w:p>
@@ -3560,7 +3621,7 @@
           <w:sz w:val="20"/>
           <w:szCs w:val="20"/>
         </w:rPr>
-        <w:t>Valor por Ato Processual</w:t>
+        <w:t>Valor por Ato</w:t>
       </w:r>
     </w:p>
     <w:p>
@@ -3580,7 +3641,7 @@
           <w:sz w:val="20"/>
           <w:szCs w:val="20"/>
         </w:rPr>
-        <w:t>Os honorários serão apurados por ato processual efetivamente praticado pelo Contratado, conforme os valores abaixo.</w:t>
+        <w:t>Os honorários serão apurados por ato efetivamente praticado pelo Contratado, conforme os valores abaixo.</w:t>
       </w:r>
     </w:p>
     <w:p>
@@ -3654,7 +3715,7 @@
                 <w:sz w:val="20"/>
                 <w:szCs w:val="20"/>
               </w:rPr>
-              <w:t>Ato Processual</w:t>
+              <w:t>Ato</w:t>
             </w:r>
           </w:p>
         </w:tc>
@@ -5171,6 +5232,24 @@
     </w:p>
     <w:p>
       <w:pPr>
+        <w:spacing w:line="276" w:lineRule="auto"/>
+        <w:rPr>
+          <w:rFonts w:ascii="Arvo" w:hAnsi="Arvo"/>
+          <w:sz w:val="2"/>
+          <w:szCs w:val="2"/>
+        </w:rPr>
+      </w:pPr>
+      <w:r>
+        <w:rPr>
+          <w:rFonts w:ascii="Arvo" w:hAnsi="Arvo"/>
+          <w:sz w:val="2"/>
+          <w:szCs w:val="2"/>
+        </w:rPr>
+        <w:t>{%p if contenciosa.show_horas_extra %}</w:t>
+      </w:r>
+    </w:p>
+    <w:p>
+      <w:pPr>
         <w:keepNext/>
         <w:snapToGrid w:val="0"/>
         <w:spacing w:line="276" w:lineRule="auto"/>
@@ -5225,6 +5304,24 @@
           <w:szCs w:val="20"/>
         </w:rPr>
       </w:pPr>
+    </w:p>
+    <w:p>
+      <w:pPr>
+        <w:spacing w:line="276" w:lineRule="auto"/>
+        <w:rPr>
+          <w:rFonts w:ascii="Arvo" w:hAnsi="Arvo"/>
+          <w:sz w:val="2"/>
+          <w:szCs w:val="2"/>
+        </w:rPr>
+      </w:pPr>
+      <w:r>
+        <w:rPr>
+          <w:rFonts w:ascii="Arvo" w:hAnsi="Arvo"/>
+          <w:sz w:val="2"/>
+          <w:szCs w:val="2"/>
+        </w:rPr>
+        <w:t>{%p endif %}</w:t>
+      </w:r>
     </w:p>
     <w:p>
       <w:pPr>

</xml_diff>